<commit_message>
docs(sprint 2): actualizacion de review y retrospective
</commit_message>
<xml_diff>
--- a/docs/events/review-retrospective-kaizen.docx
+++ b/docs/events/review-retrospective-kaizen.docx
@@ -182,7 +182,7 @@
           <w:r>
             <w:fldChar w:fldCharType="separate"/>
           </w:r>
-          <w:hyperlink w:anchor="_Toc224132363" w:history="1">
+          <w:hyperlink w:anchor="_Toc225170486" w:history="1">
             <w:r>
               <w:rPr>
                 <w:rStyle w:val="Hipervnculo"/>
@@ -209,7 +209,7 @@
                 <w:noProof/>
                 <w:webHidden/>
               </w:rPr>
-              <w:instrText xml:space="preserve"> PAGEREF _Toc224132363 \h </w:instrText>
+              <w:instrText xml:space="preserve"> PAGEREF _Toc225170486 \h </w:instrText>
             </w:r>
             <w:r>
               <w:rPr>
@@ -255,7 +255,7 @@
               <w14:ligatures w14:val="standardContextual"/>
             </w:rPr>
           </w:pPr>
-          <w:hyperlink w:anchor="_Toc224132364" w:history="1">
+          <w:hyperlink w:anchor="_Toc225170487" w:history="1">
             <w:r>
               <w:rPr>
                 <w:rStyle w:val="Hipervnculo"/>
@@ -282,7 +282,7 @@
                 <w:noProof/>
                 <w:webHidden/>
               </w:rPr>
-              <w:instrText xml:space="preserve"> PAGEREF _Toc224132364 \h </w:instrText>
+              <w:instrText xml:space="preserve"> PAGEREF _Toc225170487 \h </w:instrText>
             </w:r>
             <w:r>
               <w:rPr>
@@ -328,7 +328,7 @@
               <w14:ligatures w14:val="standardContextual"/>
             </w:rPr>
           </w:pPr>
-          <w:hyperlink w:anchor="_Toc224132365" w:history="1">
+          <w:hyperlink w:anchor="_Toc225170488" w:history="1">
             <w:r>
               <w:rPr>
                 <w:rStyle w:val="Hipervnculo"/>
@@ -355,7 +355,7 @@
                 <w:noProof/>
                 <w:webHidden/>
               </w:rPr>
-              <w:instrText xml:space="preserve"> PAGEREF _Toc224132365 \h </w:instrText>
+              <w:instrText xml:space="preserve"> PAGEREF _Toc225170488 \h </w:instrText>
             </w:r>
             <w:r>
               <w:rPr>
@@ -401,7 +401,7 @@
               <w14:ligatures w14:val="standardContextual"/>
             </w:rPr>
           </w:pPr>
-          <w:hyperlink w:anchor="_Toc224132366" w:history="1">
+          <w:hyperlink w:anchor="_Toc225170489" w:history="1">
             <w:r>
               <w:rPr>
                 <w:rStyle w:val="Hipervnculo"/>
@@ -428,7 +428,7 @@
                 <w:noProof/>
                 <w:webHidden/>
               </w:rPr>
-              <w:instrText xml:space="preserve"> PAGEREF _Toc224132366 \h </w:instrText>
+              <w:instrText xml:space="preserve"> PAGEREF _Toc225170489 \h </w:instrText>
             </w:r>
             <w:r>
               <w:rPr>
@@ -474,7 +474,7 @@
               <w14:ligatures w14:val="standardContextual"/>
             </w:rPr>
           </w:pPr>
-          <w:hyperlink w:anchor="_Toc224132367" w:history="1">
+          <w:hyperlink w:anchor="_Toc225170490" w:history="1">
             <w:r>
               <w:rPr>
                 <w:rStyle w:val="Hipervnculo"/>
@@ -501,7 +501,7 @@
                 <w:noProof/>
                 <w:webHidden/>
               </w:rPr>
-              <w:instrText xml:space="preserve"> PAGEREF _Toc224132367 \h </w:instrText>
+              <w:instrText xml:space="preserve"> PAGEREF _Toc225170490 \h </w:instrText>
             </w:r>
             <w:r>
               <w:rPr>
@@ -547,7 +547,7 @@
               <w14:ligatures w14:val="standardContextual"/>
             </w:rPr>
           </w:pPr>
-          <w:hyperlink w:anchor="_Toc224132368" w:history="1">
+          <w:hyperlink w:anchor="_Toc225170491" w:history="1">
             <w:r>
               <w:rPr>
                 <w:rStyle w:val="Hipervnculo"/>
@@ -574,7 +574,7 @@
                 <w:noProof/>
                 <w:webHidden/>
               </w:rPr>
-              <w:instrText xml:space="preserve"> PAGEREF _Toc224132368 \h </w:instrText>
+              <w:instrText xml:space="preserve"> PAGEREF _Toc225170491 \h </w:instrText>
             </w:r>
             <w:r>
               <w:rPr>
@@ -620,7 +620,7 @@
               <w14:ligatures w14:val="standardContextual"/>
             </w:rPr>
           </w:pPr>
-          <w:hyperlink w:anchor="_Toc224132369" w:history="1">
+          <w:hyperlink w:anchor="_Toc225170492" w:history="1">
             <w:r>
               <w:rPr>
                 <w:rStyle w:val="Hipervnculo"/>
@@ -647,7 +647,7 @@
                 <w:noProof/>
                 <w:webHidden/>
               </w:rPr>
-              <w:instrText xml:space="preserve"> PAGEREF _Toc224132369 \h </w:instrText>
+              <w:instrText xml:space="preserve"> PAGEREF _Toc225170492 \h </w:instrText>
             </w:r>
             <w:r>
               <w:rPr>
@@ -693,7 +693,7 @@
               <w14:ligatures w14:val="standardContextual"/>
             </w:rPr>
           </w:pPr>
-          <w:hyperlink w:anchor="_Toc224132370" w:history="1">
+          <w:hyperlink w:anchor="_Toc225170493" w:history="1">
             <w:r>
               <w:rPr>
                 <w:rStyle w:val="Hipervnculo"/>
@@ -720,7 +720,7 @@
                 <w:noProof/>
                 <w:webHidden/>
               </w:rPr>
-              <w:instrText xml:space="preserve"> PAGEREF _Toc224132370 \h </w:instrText>
+              <w:instrText xml:space="preserve"> PAGEREF _Toc225170493 \h </w:instrText>
             </w:r>
             <w:r>
               <w:rPr>
@@ -766,7 +766,7 @@
               <w14:ligatures w14:val="standardContextual"/>
             </w:rPr>
           </w:pPr>
-          <w:hyperlink w:anchor="_Toc224132371" w:history="1">
+          <w:hyperlink w:anchor="_Toc225170494" w:history="1">
             <w:r>
               <w:rPr>
                 <w:rStyle w:val="Hipervnculo"/>
@@ -793,7 +793,7 @@
                 <w:noProof/>
                 <w:webHidden/>
               </w:rPr>
-              <w:instrText xml:space="preserve"> PAGEREF _Toc224132371 \h </w:instrText>
+              <w:instrText xml:space="preserve"> PAGEREF _Toc225170494 \h </w:instrText>
             </w:r>
             <w:r>
               <w:rPr>
@@ -839,7 +839,7 @@
               <w14:ligatures w14:val="standardContextual"/>
             </w:rPr>
           </w:pPr>
-          <w:hyperlink w:anchor="_Toc224132372" w:history="1">
+          <w:hyperlink w:anchor="_Toc225170495" w:history="1">
             <w:r>
               <w:rPr>
                 <w:rStyle w:val="Hipervnculo"/>
@@ -866,7 +866,7 @@
                 <w:noProof/>
                 <w:webHidden/>
               </w:rPr>
-              <w:instrText xml:space="preserve"> PAGEREF _Toc224132372 \h </w:instrText>
+              <w:instrText xml:space="preserve"> PAGEREF _Toc225170495 \h </w:instrText>
             </w:r>
             <w:r>
               <w:rPr>
@@ -886,7 +886,678 @@
                 <w:noProof/>
                 <w:webHidden/>
               </w:rPr>
-              <w:t>4</w:t>
+              <w:t>5</w:t>
+            </w:r>
+            <w:r>
+              <w:rPr>
+                <w:noProof/>
+                <w:webHidden/>
+              </w:rPr>
+              <w:fldChar w:fldCharType="end"/>
+            </w:r>
+          </w:hyperlink>
+        </w:p>
+        <w:p>
+          <w:pPr>
+            <w:pStyle w:val="TDC1"/>
+            <w:tabs>
+              <w:tab w:val="right" w:leader="dot" w:pos="9350"/>
+            </w:tabs>
+            <w:rPr>
+              <w:rFonts w:asciiTheme="minorHAnsi" w:eastAsiaTheme="minorEastAsia" w:hAnsiTheme="minorHAnsi" w:cstheme="minorBidi"/>
+              <w:noProof/>
+              <w:kern w:val="2"/>
+              <w:szCs w:val="24"/>
+              <w:lang w:val="es-HN"/>
+              <w14:ligatures w14:val="standardContextual"/>
+            </w:rPr>
+          </w:pPr>
+          <w:hyperlink w:anchor="_Toc225170496" w:history="1">
+            <w:r>
+              <w:rPr>
+                <w:rStyle w:val="Hipervnculo"/>
+                <w:noProof/>
+              </w:rPr>
+              <w:t>Sprint 2</w:t>
+            </w:r>
+            <w:r>
+              <w:rPr>
+                <w:noProof/>
+                <w:webHidden/>
+              </w:rPr>
+              <w:tab/>
+            </w:r>
+            <w:r>
+              <w:rPr>
+                <w:noProof/>
+                <w:webHidden/>
+              </w:rPr>
+              <w:fldChar w:fldCharType="begin"/>
+            </w:r>
+            <w:r>
+              <w:rPr>
+                <w:noProof/>
+                <w:webHidden/>
+              </w:rPr>
+              <w:instrText xml:space="preserve"> PAGEREF _Toc225170496 \h </w:instrText>
+            </w:r>
+            <w:r>
+              <w:rPr>
+                <w:noProof/>
+                <w:webHidden/>
+              </w:rPr>
+            </w:r>
+            <w:r>
+              <w:rPr>
+                <w:noProof/>
+                <w:webHidden/>
+              </w:rPr>
+              <w:fldChar w:fldCharType="separate"/>
+            </w:r>
+            <w:r>
+              <w:rPr>
+                <w:noProof/>
+                <w:webHidden/>
+              </w:rPr>
+              <w:t>5</w:t>
+            </w:r>
+            <w:r>
+              <w:rPr>
+                <w:noProof/>
+                <w:webHidden/>
+              </w:rPr>
+              <w:fldChar w:fldCharType="end"/>
+            </w:r>
+          </w:hyperlink>
+        </w:p>
+        <w:p>
+          <w:pPr>
+            <w:pStyle w:val="TDC2"/>
+            <w:tabs>
+              <w:tab w:val="right" w:leader="dot" w:pos="9350"/>
+            </w:tabs>
+            <w:rPr>
+              <w:rFonts w:asciiTheme="minorHAnsi" w:eastAsiaTheme="minorEastAsia" w:hAnsiTheme="minorHAnsi" w:cstheme="minorBidi"/>
+              <w:noProof/>
+              <w:kern w:val="2"/>
+              <w:szCs w:val="24"/>
+              <w:lang w:val="es-HN"/>
+              <w14:ligatures w14:val="standardContextual"/>
+            </w:rPr>
+          </w:pPr>
+          <w:hyperlink w:anchor="_Toc225170497" w:history="1">
+            <w:r>
+              <w:rPr>
+                <w:rStyle w:val="Hipervnculo"/>
+                <w:noProof/>
+              </w:rPr>
+              <w:t>Sprint Review</w:t>
+            </w:r>
+            <w:r>
+              <w:rPr>
+                <w:noProof/>
+                <w:webHidden/>
+              </w:rPr>
+              <w:tab/>
+            </w:r>
+            <w:r>
+              <w:rPr>
+                <w:noProof/>
+                <w:webHidden/>
+              </w:rPr>
+              <w:fldChar w:fldCharType="begin"/>
+            </w:r>
+            <w:r>
+              <w:rPr>
+                <w:noProof/>
+                <w:webHidden/>
+              </w:rPr>
+              <w:instrText xml:space="preserve"> PAGEREF _Toc225170497 \h </w:instrText>
+            </w:r>
+            <w:r>
+              <w:rPr>
+                <w:noProof/>
+                <w:webHidden/>
+              </w:rPr>
+            </w:r>
+            <w:r>
+              <w:rPr>
+                <w:noProof/>
+                <w:webHidden/>
+              </w:rPr>
+              <w:fldChar w:fldCharType="separate"/>
+            </w:r>
+            <w:r>
+              <w:rPr>
+                <w:noProof/>
+                <w:webHidden/>
+              </w:rPr>
+              <w:t>5</w:t>
+            </w:r>
+            <w:r>
+              <w:rPr>
+                <w:noProof/>
+                <w:webHidden/>
+              </w:rPr>
+              <w:fldChar w:fldCharType="end"/>
+            </w:r>
+          </w:hyperlink>
+        </w:p>
+        <w:p>
+          <w:pPr>
+            <w:pStyle w:val="TDC3"/>
+            <w:tabs>
+              <w:tab w:val="right" w:leader="dot" w:pos="9350"/>
+            </w:tabs>
+            <w:rPr>
+              <w:rFonts w:asciiTheme="minorHAnsi" w:eastAsiaTheme="minorEastAsia" w:hAnsiTheme="minorHAnsi" w:cstheme="minorBidi"/>
+              <w:noProof/>
+              <w:kern w:val="2"/>
+              <w:szCs w:val="24"/>
+              <w:lang w:val="es-HN"/>
+              <w14:ligatures w14:val="standardContextual"/>
+            </w:rPr>
+          </w:pPr>
+          <w:hyperlink w:anchor="_Toc225170498" w:history="1">
+            <w:r>
+              <w:rPr>
+                <w:rStyle w:val="Hipervnculo"/>
+                <w:noProof/>
+              </w:rPr>
+              <w:t>Historias de usuario planificadas</w:t>
+            </w:r>
+            <w:r>
+              <w:rPr>
+                <w:noProof/>
+                <w:webHidden/>
+              </w:rPr>
+              <w:tab/>
+            </w:r>
+            <w:r>
+              <w:rPr>
+                <w:noProof/>
+                <w:webHidden/>
+              </w:rPr>
+              <w:fldChar w:fldCharType="begin"/>
+            </w:r>
+            <w:r>
+              <w:rPr>
+                <w:noProof/>
+                <w:webHidden/>
+              </w:rPr>
+              <w:instrText xml:space="preserve"> PAGEREF _Toc225170498 \h </w:instrText>
+            </w:r>
+            <w:r>
+              <w:rPr>
+                <w:noProof/>
+                <w:webHidden/>
+              </w:rPr>
+            </w:r>
+            <w:r>
+              <w:rPr>
+                <w:noProof/>
+                <w:webHidden/>
+              </w:rPr>
+              <w:fldChar w:fldCharType="separate"/>
+            </w:r>
+            <w:r>
+              <w:rPr>
+                <w:noProof/>
+                <w:webHidden/>
+              </w:rPr>
+              <w:t>5</w:t>
+            </w:r>
+            <w:r>
+              <w:rPr>
+                <w:noProof/>
+                <w:webHidden/>
+              </w:rPr>
+              <w:fldChar w:fldCharType="end"/>
+            </w:r>
+          </w:hyperlink>
+        </w:p>
+        <w:p>
+          <w:pPr>
+            <w:pStyle w:val="TDC3"/>
+            <w:tabs>
+              <w:tab w:val="right" w:leader="dot" w:pos="9350"/>
+            </w:tabs>
+            <w:rPr>
+              <w:rFonts w:asciiTheme="minorHAnsi" w:eastAsiaTheme="minorEastAsia" w:hAnsiTheme="minorHAnsi" w:cstheme="minorBidi"/>
+              <w:noProof/>
+              <w:kern w:val="2"/>
+              <w:szCs w:val="24"/>
+              <w:lang w:val="es-HN"/>
+              <w14:ligatures w14:val="standardContextual"/>
+            </w:rPr>
+          </w:pPr>
+          <w:hyperlink w:anchor="_Toc225170499" w:history="1">
+            <w:r>
+              <w:rPr>
+                <w:rStyle w:val="Hipervnculo"/>
+                <w:noProof/>
+              </w:rPr>
+              <w:t>Incremento del producto</w:t>
+            </w:r>
+            <w:r>
+              <w:rPr>
+                <w:noProof/>
+                <w:webHidden/>
+              </w:rPr>
+              <w:tab/>
+            </w:r>
+            <w:r>
+              <w:rPr>
+                <w:noProof/>
+                <w:webHidden/>
+              </w:rPr>
+              <w:fldChar w:fldCharType="begin"/>
+            </w:r>
+            <w:r>
+              <w:rPr>
+                <w:noProof/>
+                <w:webHidden/>
+              </w:rPr>
+              <w:instrText xml:space="preserve"> PAGEREF _Toc225170499 \h </w:instrText>
+            </w:r>
+            <w:r>
+              <w:rPr>
+                <w:noProof/>
+                <w:webHidden/>
+              </w:rPr>
+            </w:r>
+            <w:r>
+              <w:rPr>
+                <w:noProof/>
+                <w:webHidden/>
+              </w:rPr>
+              <w:fldChar w:fldCharType="separate"/>
+            </w:r>
+            <w:r>
+              <w:rPr>
+                <w:noProof/>
+                <w:webHidden/>
+              </w:rPr>
+              <w:t>5</w:t>
+            </w:r>
+            <w:r>
+              <w:rPr>
+                <w:noProof/>
+                <w:webHidden/>
+              </w:rPr>
+              <w:fldChar w:fldCharType="end"/>
+            </w:r>
+          </w:hyperlink>
+        </w:p>
+        <w:p>
+          <w:pPr>
+            <w:pStyle w:val="TDC2"/>
+            <w:tabs>
+              <w:tab w:val="right" w:leader="dot" w:pos="9350"/>
+            </w:tabs>
+            <w:rPr>
+              <w:rFonts w:asciiTheme="minorHAnsi" w:eastAsiaTheme="minorEastAsia" w:hAnsiTheme="minorHAnsi" w:cstheme="minorBidi"/>
+              <w:noProof/>
+              <w:kern w:val="2"/>
+              <w:szCs w:val="24"/>
+              <w:lang w:val="es-HN"/>
+              <w14:ligatures w14:val="standardContextual"/>
+            </w:rPr>
+          </w:pPr>
+          <w:hyperlink w:anchor="_Toc225170500" w:history="1">
+            <w:r>
+              <w:rPr>
+                <w:rStyle w:val="Hipervnculo"/>
+                <w:noProof/>
+              </w:rPr>
+              <w:t>Sprint Retrospective</w:t>
+            </w:r>
+            <w:r>
+              <w:rPr>
+                <w:noProof/>
+                <w:webHidden/>
+              </w:rPr>
+              <w:tab/>
+            </w:r>
+            <w:r>
+              <w:rPr>
+                <w:noProof/>
+                <w:webHidden/>
+              </w:rPr>
+              <w:fldChar w:fldCharType="begin"/>
+            </w:r>
+            <w:r>
+              <w:rPr>
+                <w:noProof/>
+                <w:webHidden/>
+              </w:rPr>
+              <w:instrText xml:space="preserve"> PAGEREF _Toc225170500 \h </w:instrText>
+            </w:r>
+            <w:r>
+              <w:rPr>
+                <w:noProof/>
+                <w:webHidden/>
+              </w:rPr>
+            </w:r>
+            <w:r>
+              <w:rPr>
+                <w:noProof/>
+                <w:webHidden/>
+              </w:rPr>
+              <w:fldChar w:fldCharType="separate"/>
+            </w:r>
+            <w:r>
+              <w:rPr>
+                <w:noProof/>
+                <w:webHidden/>
+              </w:rPr>
+              <w:t>6</w:t>
+            </w:r>
+            <w:r>
+              <w:rPr>
+                <w:noProof/>
+                <w:webHidden/>
+              </w:rPr>
+              <w:fldChar w:fldCharType="end"/>
+            </w:r>
+          </w:hyperlink>
+        </w:p>
+        <w:p>
+          <w:pPr>
+            <w:pStyle w:val="TDC3"/>
+            <w:tabs>
+              <w:tab w:val="right" w:leader="dot" w:pos="9350"/>
+            </w:tabs>
+            <w:rPr>
+              <w:rFonts w:asciiTheme="minorHAnsi" w:eastAsiaTheme="minorEastAsia" w:hAnsiTheme="minorHAnsi" w:cstheme="minorBidi"/>
+              <w:noProof/>
+              <w:kern w:val="2"/>
+              <w:szCs w:val="24"/>
+              <w:lang w:val="es-HN"/>
+              <w14:ligatures w14:val="standardContextual"/>
+            </w:rPr>
+          </w:pPr>
+          <w:hyperlink w:anchor="_Toc225170501" w:history="1">
+            <w:r>
+              <w:rPr>
+                <w:rStyle w:val="Hipervnculo"/>
+                <w:noProof/>
+              </w:rPr>
+              <w:t>Análisis de la velocidad del equipo</w:t>
+            </w:r>
+            <w:r>
+              <w:rPr>
+                <w:noProof/>
+                <w:webHidden/>
+              </w:rPr>
+              <w:tab/>
+            </w:r>
+            <w:r>
+              <w:rPr>
+                <w:noProof/>
+                <w:webHidden/>
+              </w:rPr>
+              <w:fldChar w:fldCharType="begin"/>
+            </w:r>
+            <w:r>
+              <w:rPr>
+                <w:noProof/>
+                <w:webHidden/>
+              </w:rPr>
+              <w:instrText xml:space="preserve"> PAGEREF _Toc225170501 \h </w:instrText>
+            </w:r>
+            <w:r>
+              <w:rPr>
+                <w:noProof/>
+                <w:webHidden/>
+              </w:rPr>
+            </w:r>
+            <w:r>
+              <w:rPr>
+                <w:noProof/>
+                <w:webHidden/>
+              </w:rPr>
+              <w:fldChar w:fldCharType="separate"/>
+            </w:r>
+            <w:r>
+              <w:rPr>
+                <w:noProof/>
+                <w:webHidden/>
+              </w:rPr>
+              <w:t>6</w:t>
+            </w:r>
+            <w:r>
+              <w:rPr>
+                <w:noProof/>
+                <w:webHidden/>
+              </w:rPr>
+              <w:fldChar w:fldCharType="end"/>
+            </w:r>
+          </w:hyperlink>
+        </w:p>
+        <w:p>
+          <w:pPr>
+            <w:pStyle w:val="TDC3"/>
+            <w:tabs>
+              <w:tab w:val="right" w:leader="dot" w:pos="9350"/>
+            </w:tabs>
+            <w:rPr>
+              <w:rFonts w:asciiTheme="minorHAnsi" w:eastAsiaTheme="minorEastAsia" w:hAnsiTheme="minorHAnsi" w:cstheme="minorBidi"/>
+              <w:noProof/>
+              <w:kern w:val="2"/>
+              <w:szCs w:val="24"/>
+              <w:lang w:val="es-HN"/>
+              <w14:ligatures w14:val="standardContextual"/>
+            </w:rPr>
+          </w:pPr>
+          <w:hyperlink w:anchor="_Toc225170502" w:history="1">
+            <w:r>
+              <w:rPr>
+                <w:rStyle w:val="Hipervnculo"/>
+                <w:noProof/>
+              </w:rPr>
+              <w:t>Cálculo de velocidad</w:t>
+            </w:r>
+            <w:r>
+              <w:rPr>
+                <w:noProof/>
+                <w:webHidden/>
+              </w:rPr>
+              <w:tab/>
+            </w:r>
+            <w:r>
+              <w:rPr>
+                <w:noProof/>
+                <w:webHidden/>
+              </w:rPr>
+              <w:fldChar w:fldCharType="begin"/>
+            </w:r>
+            <w:r>
+              <w:rPr>
+                <w:noProof/>
+                <w:webHidden/>
+              </w:rPr>
+              <w:instrText xml:space="preserve"> PAGEREF _Toc225170502 \h </w:instrText>
+            </w:r>
+            <w:r>
+              <w:rPr>
+                <w:noProof/>
+                <w:webHidden/>
+              </w:rPr>
+            </w:r>
+            <w:r>
+              <w:rPr>
+                <w:noProof/>
+                <w:webHidden/>
+              </w:rPr>
+              <w:fldChar w:fldCharType="separate"/>
+            </w:r>
+            <w:r>
+              <w:rPr>
+                <w:noProof/>
+                <w:webHidden/>
+              </w:rPr>
+              <w:t>7</w:t>
+            </w:r>
+            <w:r>
+              <w:rPr>
+                <w:noProof/>
+                <w:webHidden/>
+              </w:rPr>
+              <w:fldChar w:fldCharType="end"/>
+            </w:r>
+          </w:hyperlink>
+        </w:p>
+        <w:p>
+          <w:pPr>
+            <w:pStyle w:val="TDC3"/>
+            <w:tabs>
+              <w:tab w:val="right" w:leader="dot" w:pos="9350"/>
+            </w:tabs>
+            <w:rPr>
+              <w:rFonts w:asciiTheme="minorHAnsi" w:eastAsiaTheme="minorEastAsia" w:hAnsiTheme="minorHAnsi" w:cstheme="minorBidi"/>
+              <w:noProof/>
+              <w:kern w:val="2"/>
+              <w:szCs w:val="24"/>
+              <w:lang w:val="es-HN"/>
+              <w14:ligatures w14:val="standardContextual"/>
+            </w:rPr>
+          </w:pPr>
+          <w:hyperlink w:anchor="_Toc225170503" w:history="1">
+            <w:r>
+              <w:rPr>
+                <w:rStyle w:val="Hipervnculo"/>
+                <w:noProof/>
+              </w:rPr>
+              <w:t>Retrospectiva de la Dinámic</w:t>
+            </w:r>
+            <w:r>
+              <w:rPr>
+                <w:rStyle w:val="Hipervnculo"/>
+                <w:noProof/>
+              </w:rPr>
+              <w:t>a</w:t>
+            </w:r>
+            <w:r>
+              <w:rPr>
+                <w:rStyle w:val="Hipervnculo"/>
+                <w:noProof/>
+              </w:rPr>
+              <w:t xml:space="preserve"> del Equipo</w:t>
+            </w:r>
+            <w:r>
+              <w:rPr>
+                <w:noProof/>
+                <w:webHidden/>
+              </w:rPr>
+              <w:tab/>
+            </w:r>
+            <w:r>
+              <w:rPr>
+                <w:noProof/>
+                <w:webHidden/>
+              </w:rPr>
+              <w:fldChar w:fldCharType="begin"/>
+            </w:r>
+            <w:r>
+              <w:rPr>
+                <w:noProof/>
+                <w:webHidden/>
+              </w:rPr>
+              <w:instrText xml:space="preserve"> PAGEREF _Toc225170503 \h </w:instrText>
+            </w:r>
+            <w:r>
+              <w:rPr>
+                <w:noProof/>
+                <w:webHidden/>
+              </w:rPr>
+            </w:r>
+            <w:r>
+              <w:rPr>
+                <w:noProof/>
+                <w:webHidden/>
+              </w:rPr>
+              <w:fldChar w:fldCharType="separate"/>
+            </w:r>
+            <w:r>
+              <w:rPr>
+                <w:noProof/>
+                <w:webHidden/>
+              </w:rPr>
+              <w:t>8</w:t>
+            </w:r>
+            <w:r>
+              <w:rPr>
+                <w:noProof/>
+                <w:webHidden/>
+              </w:rPr>
+              <w:fldChar w:fldCharType="end"/>
+            </w:r>
+          </w:hyperlink>
+        </w:p>
+        <w:p>
+          <w:pPr>
+            <w:pStyle w:val="TDC3"/>
+            <w:tabs>
+              <w:tab w:val="right" w:leader="dot" w:pos="9350"/>
+            </w:tabs>
+            <w:rPr>
+              <w:rFonts w:asciiTheme="minorHAnsi" w:eastAsiaTheme="minorEastAsia" w:hAnsiTheme="minorHAnsi" w:cstheme="minorBidi"/>
+              <w:noProof/>
+              <w:kern w:val="2"/>
+              <w:szCs w:val="24"/>
+              <w:lang w:val="es-HN"/>
+              <w14:ligatures w14:val="standardContextual"/>
+            </w:rPr>
+          </w:pPr>
+          <w:hyperlink w:anchor="_Toc225170504" w:history="1">
+            <w:r>
+              <w:rPr>
+                <w:rStyle w:val="Hipervnculo"/>
+                <w:noProof/>
+              </w:rPr>
+              <w:t>Metas del próximo Sprint</w:t>
+            </w:r>
+            <w:r>
+              <w:rPr>
+                <w:noProof/>
+                <w:webHidden/>
+              </w:rPr>
+              <w:tab/>
+            </w:r>
+            <w:r>
+              <w:rPr>
+                <w:noProof/>
+                <w:webHidden/>
+              </w:rPr>
+              <w:fldChar w:fldCharType="begin"/>
+            </w:r>
+            <w:r>
+              <w:rPr>
+                <w:noProof/>
+                <w:webHidden/>
+              </w:rPr>
+              <w:instrText xml:space="preserve"> PAGEREF _Toc225170504 \h </w:instrText>
+            </w:r>
+            <w:r>
+              <w:rPr>
+                <w:noProof/>
+                <w:webHidden/>
+              </w:rPr>
+            </w:r>
+            <w:r>
+              <w:rPr>
+                <w:noProof/>
+                <w:webHidden/>
+              </w:rPr>
+              <w:fldChar w:fldCharType="separate"/>
+            </w:r>
+            <w:r>
+              <w:rPr>
+                <w:noProof/>
+                <w:webHidden/>
+              </w:rPr>
+              <w:t>8</w:t>
             </w:r>
             <w:r>
               <w:rPr>
@@ -989,138 +1660,85 @@
     </w:p>
     <w:p>
       <w:pPr>
+        <w:pStyle w:val="Ttulo1"/>
+      </w:pPr>
+      <w:bookmarkStart w:id="0" w:name="_Toc225170486"/>
+      <w:r>
+        <w:t>Sprint 1</w:t>
+      </w:r>
+      <w:bookmarkEnd w:id="0"/>
+    </w:p>
+    <w:p>
+      <w:pPr>
         <w:spacing w:line="480" w:lineRule="auto"/>
-        <w:jc w:val="center"/>
-        <w:rPr>
-          <w:rFonts w:eastAsia="Times New Roman" w:cs="Times New Roman"/>
-          <w:b/>
-          <w:bCs/>
-          <w:sz w:val="28"/>
-          <w:szCs w:val="28"/>
-        </w:rPr>
-      </w:pPr>
+        <w:rPr>
+          <w:rFonts w:eastAsia="Times New Roman" w:cs="Times New Roman"/>
+          <w:szCs w:val="24"/>
+        </w:rPr>
+      </w:pPr>
+      <w:r>
+        <w:rPr>
+          <w:rFonts w:eastAsia="Times New Roman" w:cs="Times New Roman"/>
+          <w:b/>
+          <w:bCs/>
+          <w:szCs w:val="24"/>
+        </w:rPr>
+        <w:t xml:space="preserve">Fecha de inicio: </w:t>
+      </w:r>
+      <w:r>
+        <w:rPr>
+          <w:rFonts w:eastAsia="Times New Roman" w:cs="Times New Roman"/>
+          <w:szCs w:val="24"/>
+        </w:rPr>
+        <w:t xml:space="preserve">18 de febrero de 2026 </w:t>
+      </w:r>
     </w:p>
     <w:p>
       <w:pPr>
         <w:spacing w:line="480" w:lineRule="auto"/>
-        <w:jc w:val="center"/>
-        <w:rPr>
-          <w:rFonts w:eastAsia="Times New Roman" w:cs="Times New Roman"/>
-          <w:b/>
-          <w:bCs/>
-          <w:sz w:val="28"/>
-          <w:szCs w:val="28"/>
-        </w:rPr>
-      </w:pPr>
+        <w:rPr>
+          <w:rFonts w:eastAsia="Times New Roman" w:cs="Times New Roman"/>
+          <w:szCs w:val="24"/>
+        </w:rPr>
+      </w:pPr>
+      <w:r>
+        <w:rPr>
+          <w:rFonts w:eastAsia="Times New Roman" w:cs="Times New Roman"/>
+          <w:b/>
+          <w:bCs/>
+          <w:szCs w:val="24"/>
+        </w:rPr>
+        <w:t>Fecha</w:t>
+      </w:r>
+      <w:r>
+        <w:rPr>
+          <w:rFonts w:eastAsia="Times New Roman" w:cs="Times New Roman"/>
+          <w:b/>
+          <w:bCs/>
+          <w:szCs w:val="24"/>
+        </w:rPr>
+        <w:t xml:space="preserve"> de finalización</w:t>
+      </w:r>
+      <w:r>
+        <w:rPr>
+          <w:rFonts w:eastAsia="Times New Roman" w:cs="Times New Roman"/>
+          <w:b/>
+          <w:bCs/>
+          <w:szCs w:val="24"/>
+        </w:rPr>
+        <w:t xml:space="preserve">: </w:t>
+      </w:r>
+      <w:r>
+        <w:rPr>
+          <w:rFonts w:eastAsia="Times New Roman" w:cs="Times New Roman"/>
+          <w:szCs w:val="24"/>
+        </w:rPr>
+        <w:t xml:space="preserve">27 de febrero de 2026 </w:t>
+      </w:r>
     </w:p>
     <w:p>
       <w:pPr>
         <w:spacing w:line="480" w:lineRule="auto"/>
-        <w:jc w:val="center"/>
-        <w:rPr>
-          <w:rFonts w:eastAsia="Times New Roman" w:cs="Times New Roman"/>
-          <w:b/>
-          <w:bCs/>
-          <w:sz w:val="28"/>
-          <w:szCs w:val="28"/>
-        </w:rPr>
-      </w:pPr>
-    </w:p>
-    <w:p>
-      <w:pPr>
-        <w:spacing w:line="480" w:lineRule="auto"/>
-        <w:jc w:val="center"/>
-        <w:rPr>
-          <w:rFonts w:eastAsia="Times New Roman" w:cs="Times New Roman"/>
-          <w:b/>
-          <w:bCs/>
-          <w:sz w:val="28"/>
-          <w:szCs w:val="28"/>
-        </w:rPr>
-      </w:pPr>
-    </w:p>
-    <w:p>
-      <w:pPr>
-        <w:pStyle w:val="Ttulo1"/>
-      </w:pPr>
-      <w:bookmarkStart w:id="0" w:name="_Toc224132363"/>
-      <w:r>
-        <w:lastRenderedPageBreak/>
-        <w:t>Sprint 1</w:t>
-      </w:r>
-      <w:bookmarkEnd w:id="0"/>
-    </w:p>
-    <w:p>
-      <w:pPr>
-        <w:spacing w:line="480" w:lineRule="auto"/>
-        <w:rPr>
-          <w:rFonts w:eastAsia="Times New Roman" w:cs="Times New Roman"/>
-          <w:szCs w:val="24"/>
-        </w:rPr>
-      </w:pPr>
-      <w:r>
-        <w:rPr>
-          <w:rFonts w:eastAsia="Times New Roman" w:cs="Times New Roman"/>
-          <w:b/>
-          <w:bCs/>
-          <w:szCs w:val="24"/>
-        </w:rPr>
-        <w:t xml:space="preserve">Fecha de inicio: </w:t>
-      </w:r>
-      <w:r>
-        <w:rPr>
-          <w:rFonts w:eastAsia="Times New Roman" w:cs="Times New Roman"/>
-          <w:szCs w:val="24"/>
-        </w:rPr>
-        <w:t xml:space="preserve">18 de febrero de 2026 </w:t>
-      </w:r>
-    </w:p>
-    <w:p>
-      <w:pPr>
-        <w:spacing w:line="480" w:lineRule="auto"/>
-        <w:rPr>
-          <w:rFonts w:eastAsia="Times New Roman" w:cs="Times New Roman"/>
-          <w:szCs w:val="24"/>
-        </w:rPr>
-      </w:pPr>
-      <w:r>
-        <w:rPr>
-          <w:rFonts w:eastAsia="Times New Roman" w:cs="Times New Roman"/>
-          <w:b/>
-          <w:bCs/>
-          <w:szCs w:val="24"/>
-        </w:rPr>
-        <w:t>Fecha</w:t>
-      </w:r>
-      <w:r>
-        <w:rPr>
-          <w:rFonts w:eastAsia="Times New Roman" w:cs="Times New Roman"/>
-          <w:b/>
-          <w:bCs/>
-          <w:szCs w:val="24"/>
-        </w:rPr>
-        <w:t xml:space="preserve"> de finalización</w:t>
-      </w:r>
-      <w:r>
-        <w:rPr>
-          <w:rFonts w:eastAsia="Times New Roman" w:cs="Times New Roman"/>
-          <w:b/>
-          <w:bCs/>
-          <w:szCs w:val="24"/>
-        </w:rPr>
-        <w:t xml:space="preserve">: </w:t>
-      </w:r>
-      <w:r>
-        <w:rPr>
-          <w:rFonts w:eastAsia="Times New Roman" w:cs="Times New Roman"/>
-          <w:szCs w:val="24"/>
-        </w:rPr>
-        <w:t xml:space="preserve">27 de febrero de 2026 </w:t>
-      </w:r>
-    </w:p>
-    <w:p>
-      <w:pPr>
-        <w:spacing w:line="480" w:lineRule="auto"/>
         <w:rPr>
           <w:rFonts w:eastAsia="Times New Roman" w:cs="Times New Roman"/>
           <w:szCs w:val="24"/>
@@ -1167,7 +1785,7 @@
       <w:pPr>
         <w:pStyle w:val="Ttulo2"/>
       </w:pPr>
-      <w:bookmarkStart w:id="1" w:name="_Toc224132364"/>
+      <w:bookmarkStart w:id="1" w:name="_Toc225170487"/>
       <w:r>
         <w:t xml:space="preserve">Sprint </w:t>
       </w:r>
@@ -1221,7 +1839,7 @@
           <w:sz w:val="24"/>
         </w:rPr>
       </w:pPr>
-      <w:bookmarkStart w:id="2" w:name="_Toc224132365"/>
+      <w:bookmarkStart w:id="2" w:name="_Toc225170488"/>
       <w:r>
         <w:t xml:space="preserve">Historias de </w:t>
       </w:r>
@@ -1368,7 +1986,7 @@
           <w:sz w:val="24"/>
         </w:rPr>
       </w:pPr>
-      <w:bookmarkStart w:id="3" w:name="_Toc224132366"/>
+      <w:bookmarkStart w:id="3" w:name="_Toc225170489"/>
       <w:r>
         <w:t>Incremento del producto</w:t>
       </w:r>
@@ -1498,7 +2116,7 @@
       <w:pPr>
         <w:pStyle w:val="Ttulo3"/>
       </w:pPr>
-      <w:bookmarkStart w:id="4" w:name="_Toc224132367"/>
+      <w:bookmarkStart w:id="4" w:name="_Toc225170490"/>
       <w:proofErr w:type="spellStart"/>
       <w:r>
         <w:t>Feedback</w:t>
@@ -1620,6 +2238,7 @@
           <w:rFonts w:eastAsia="Times New Roman" w:cs="Times New Roman"/>
           <w:szCs w:val="24"/>
         </w:rPr>
+        <w:lastRenderedPageBreak/>
         <w:t xml:space="preserve">Documentar </w:t>
       </w:r>
       <w:r>
@@ -1716,7 +2335,6 @@
         </w:rPr>
       </w:pPr>
       <w:r>
-        <w:lastRenderedPageBreak/>
         <w:t xml:space="preserve">Configurar </w:t>
       </w:r>
       <w:proofErr w:type="spellStart"/>
@@ -1740,7 +2358,7 @@
       <w:pPr>
         <w:pStyle w:val="Ttulo2"/>
       </w:pPr>
-      <w:bookmarkStart w:id="5" w:name="_Toc224132368"/>
+      <w:bookmarkStart w:id="5" w:name="_Toc225170491"/>
       <w:r>
         <w:t>Sprint Retrospective</w:t>
       </w:r>
@@ -1783,7 +2401,7 @@
       <w:pPr>
         <w:pStyle w:val="Ttulo3"/>
       </w:pPr>
-      <w:bookmarkStart w:id="6" w:name="_Toc224132369"/>
+      <w:bookmarkStart w:id="6" w:name="_Toc225170492"/>
       <w:r>
         <w:t xml:space="preserve">Análisis de </w:t>
       </w:r>
@@ -2342,6 +2960,7 @@
                 <w:color w:val="1F1F1F"/>
                 <w:szCs w:val="24"/>
               </w:rPr>
+              <w:lastRenderedPageBreak/>
               <w:t>HU-04:</w:t>
             </w:r>
             <w:r>
@@ -2639,7 +3258,7 @@
         <w:pStyle w:val="Ttulo3"/>
       </w:pPr>
       <w:bookmarkStart w:id="7" w:name="_lxded7iqfzj6" w:colFirst="0" w:colLast="0"/>
-      <w:bookmarkStart w:id="8" w:name="_Toc224132370"/>
+      <w:bookmarkStart w:id="8" w:name="_Toc225170493"/>
       <w:bookmarkEnd w:id="7"/>
       <w:r>
         <w:t xml:space="preserve">Cálculo de </w:t>
@@ -2786,7 +3405,7 @@
       <w:pPr>
         <w:pStyle w:val="Ttulo3"/>
       </w:pPr>
-      <w:bookmarkStart w:id="9" w:name="_Toc224132371"/>
+      <w:bookmarkStart w:id="9" w:name="_Toc225170494"/>
       <w:r>
         <w:t>Inspección del Proceso (Dinámica del Equipo)</w:t>
       </w:r>
@@ -2896,8 +3515,9 @@
       <w:pPr>
         <w:pStyle w:val="Ttulo3"/>
       </w:pPr>
-      <w:bookmarkStart w:id="10" w:name="_Toc224132372"/>
-      <w:r>
+      <w:bookmarkStart w:id="10" w:name="_Toc225170495"/>
+      <w:r>
+        <w:lastRenderedPageBreak/>
         <w:t>Metas del próximo Sprint</w:t>
       </w:r>
       <w:bookmarkEnd w:id="10"/>
@@ -2932,6 +3552,2655 @@
           <w:szCs w:val="24"/>
         </w:rPr>
         <w:t xml:space="preserve"> y la configuración de accesos por rol desde la base de datos.</w:t>
+      </w:r>
+    </w:p>
+    <w:p>
+      <w:pPr>
+        <w:spacing w:line="480" w:lineRule="auto"/>
+        <w:rPr>
+          <w:rFonts w:eastAsia="Times New Roman" w:cs="Times New Roman"/>
+          <w:szCs w:val="24"/>
+        </w:rPr>
+      </w:pPr>
+    </w:p>
+    <w:p>
+      <w:pPr>
+        <w:pStyle w:val="Ttulo1"/>
+      </w:pPr>
+      <w:bookmarkStart w:id="11" w:name="_Toc225170496"/>
+      <w:r>
+        <w:t>Sprint 2</w:t>
+      </w:r>
+      <w:bookmarkEnd w:id="11"/>
+      <w:r>
+        <w:t xml:space="preserve"> </w:t>
+      </w:r>
+    </w:p>
+    <w:p>
+      <w:pPr>
+        <w:spacing w:line="480" w:lineRule="auto"/>
+        <w:rPr>
+          <w:rFonts w:eastAsia="Times New Roman" w:cs="Times New Roman"/>
+          <w:szCs w:val="24"/>
+        </w:rPr>
+      </w:pPr>
+      <w:r>
+        <w:rPr>
+          <w:rFonts w:eastAsia="Times New Roman" w:cs="Times New Roman"/>
+          <w:b/>
+          <w:bCs/>
+          <w:szCs w:val="24"/>
+        </w:rPr>
+        <w:t xml:space="preserve">Fecha de inicio: </w:t>
+      </w:r>
+      <w:r>
+        <w:rPr>
+          <w:rFonts w:eastAsia="Times New Roman" w:cs="Times New Roman"/>
+          <w:szCs w:val="24"/>
+        </w:rPr>
+        <w:t xml:space="preserve">28 de febrero de 2026 </w:t>
+      </w:r>
+    </w:p>
+    <w:p>
+      <w:pPr>
+        <w:spacing w:line="480" w:lineRule="auto"/>
+        <w:rPr>
+          <w:rFonts w:eastAsia="Times New Roman" w:cs="Times New Roman"/>
+          <w:szCs w:val="24"/>
+        </w:rPr>
+      </w:pPr>
+      <w:r>
+        <w:rPr>
+          <w:rFonts w:eastAsia="Times New Roman" w:cs="Times New Roman"/>
+          <w:b/>
+          <w:bCs/>
+          <w:szCs w:val="24"/>
+        </w:rPr>
+        <w:t xml:space="preserve">Fecha de finalización: </w:t>
+      </w:r>
+      <w:r>
+        <w:rPr>
+          <w:rFonts w:eastAsia="Times New Roman" w:cs="Times New Roman"/>
+          <w:szCs w:val="24"/>
+        </w:rPr>
+        <w:t xml:space="preserve">13 de marzo de 2026 </w:t>
+      </w:r>
+    </w:p>
+    <w:p>
+      <w:pPr>
+        <w:pStyle w:val="Ttulo2"/>
+      </w:pPr>
+      <w:bookmarkStart w:id="12" w:name="_Toc225170497"/>
+      <w:r>
+        <w:t xml:space="preserve">Sprint </w:t>
+      </w:r>
+      <w:proofErr w:type="spellStart"/>
+      <w:r>
+        <w:t>Review</w:t>
+      </w:r>
+      <w:bookmarkEnd w:id="12"/>
+      <w:proofErr w:type="spellEnd"/>
+      <w:r>
+        <w:t xml:space="preserve"> </w:t>
+      </w:r>
+    </w:p>
+    <w:p>
+      <w:pPr>
+        <w:pStyle w:val="Ttulo3"/>
+        <w:rPr>
+          <w:sz w:val="24"/>
+        </w:rPr>
+      </w:pPr>
+      <w:bookmarkStart w:id="13" w:name="_Toc225170498"/>
+      <w:r>
+        <w:t xml:space="preserve">Historias de </w:t>
+      </w:r>
+      <w:r>
+        <w:t>u</w:t>
+      </w:r>
+      <w:r>
+        <w:t xml:space="preserve">suario </w:t>
+      </w:r>
+      <w:r>
+        <w:t>p</w:t>
+      </w:r>
+      <w:r>
+        <w:t>lanificadas</w:t>
+      </w:r>
+      <w:bookmarkEnd w:id="13"/>
+    </w:p>
+    <w:p>
+      <w:pPr>
+        <w:numPr>
+          <w:ilvl w:val="0"/>
+          <w:numId w:val="4"/>
+        </w:numPr>
+        <w:spacing w:line="480" w:lineRule="auto"/>
+        <w:jc w:val="both"/>
+        <w:rPr>
+          <w:rFonts w:eastAsia="Times New Roman" w:cs="Times New Roman"/>
+          <w:szCs w:val="24"/>
+        </w:rPr>
+      </w:pPr>
+      <w:r>
+        <w:rPr>
+          <w:rFonts w:eastAsia="Times New Roman" w:cs="Times New Roman"/>
+          <w:b/>
+          <w:bCs/>
+          <w:szCs w:val="24"/>
+        </w:rPr>
+        <w:t>Historias de Usuario (HU) comprometidas:</w:t>
+      </w:r>
+      <w:r>
+        <w:rPr>
+          <w:rFonts w:eastAsia="Times New Roman" w:cs="Times New Roman"/>
+          <w:szCs w:val="24"/>
+        </w:rPr>
+        <w:t xml:space="preserve"> </w:t>
+      </w:r>
+      <w:r>
+        <w:rPr>
+          <w:rFonts w:eastAsia="Times New Roman" w:cs="Times New Roman"/>
+          <w:szCs w:val="24"/>
+        </w:rPr>
+        <w:t>3</w:t>
+      </w:r>
+    </w:p>
+    <w:p>
+      <w:pPr>
+        <w:numPr>
+          <w:ilvl w:val="0"/>
+          <w:numId w:val="4"/>
+        </w:numPr>
+        <w:spacing w:line="480" w:lineRule="auto"/>
+        <w:jc w:val="both"/>
+        <w:rPr>
+          <w:rFonts w:eastAsia="Times New Roman" w:cs="Times New Roman"/>
+          <w:szCs w:val="24"/>
+        </w:rPr>
+      </w:pPr>
+      <w:r>
+        <w:rPr>
+          <w:rFonts w:eastAsia="Times New Roman" w:cs="Times New Roman"/>
+          <w:b/>
+          <w:bCs/>
+          <w:szCs w:val="24"/>
+        </w:rPr>
+        <w:t>Tareas Técnicas (TT) comprometidas:</w:t>
+      </w:r>
+      <w:r>
+        <w:rPr>
+          <w:rFonts w:eastAsia="Times New Roman" w:cs="Times New Roman"/>
+          <w:szCs w:val="24"/>
+        </w:rPr>
+        <w:t xml:space="preserve"> 2</w:t>
+      </w:r>
+    </w:p>
+    <w:p>
+      <w:pPr>
+        <w:numPr>
+          <w:ilvl w:val="0"/>
+          <w:numId w:val="4"/>
+        </w:numPr>
+        <w:spacing w:line="480" w:lineRule="auto"/>
+        <w:jc w:val="both"/>
+        <w:rPr>
+          <w:rFonts w:eastAsia="Times New Roman" w:cs="Times New Roman"/>
+          <w:szCs w:val="24"/>
+        </w:rPr>
+      </w:pPr>
+      <w:r>
+        <w:rPr>
+          <w:rFonts w:eastAsia="Times New Roman" w:cs="Times New Roman"/>
+          <w:b/>
+          <w:bCs/>
+          <w:szCs w:val="24"/>
+        </w:rPr>
+        <w:t>HU Completadas:</w:t>
+      </w:r>
+      <w:r>
+        <w:rPr>
+          <w:rFonts w:eastAsia="Times New Roman" w:cs="Times New Roman"/>
+          <w:szCs w:val="24"/>
+        </w:rPr>
+        <w:t xml:space="preserve"> </w:t>
+      </w:r>
+      <w:r>
+        <w:rPr>
+          <w:rFonts w:eastAsia="Times New Roman" w:cs="Times New Roman"/>
+          <w:szCs w:val="24"/>
+        </w:rPr>
+        <w:t>3</w:t>
+      </w:r>
+      <w:r>
+        <w:rPr>
+          <w:rFonts w:eastAsia="Times New Roman" w:cs="Times New Roman"/>
+          <w:szCs w:val="24"/>
+        </w:rPr>
+        <w:t xml:space="preserve"> + </w:t>
+      </w:r>
+      <w:r>
+        <w:rPr>
+          <w:rFonts w:eastAsia="Times New Roman" w:cs="Times New Roman"/>
+          <w:szCs w:val="24"/>
+        </w:rPr>
+        <w:t>2</w:t>
+      </w:r>
+      <w:r>
+        <w:rPr>
+          <w:rFonts w:eastAsia="Times New Roman" w:cs="Times New Roman"/>
+          <w:szCs w:val="24"/>
+        </w:rPr>
+        <w:t xml:space="preserve"> restante de pasar por QA del sprint pasado (Sprint 1). </w:t>
+      </w:r>
+    </w:p>
+    <w:p>
+      <w:pPr>
+        <w:numPr>
+          <w:ilvl w:val="0"/>
+          <w:numId w:val="4"/>
+        </w:numPr>
+        <w:spacing w:line="480" w:lineRule="auto"/>
+        <w:jc w:val="both"/>
+        <w:rPr>
+          <w:rFonts w:eastAsia="Times New Roman" w:cs="Times New Roman"/>
+          <w:szCs w:val="24"/>
+        </w:rPr>
+      </w:pPr>
+      <w:r>
+        <w:rPr>
+          <w:rFonts w:eastAsia="Times New Roman" w:cs="Times New Roman"/>
+          <w:b/>
+          <w:bCs/>
+          <w:szCs w:val="24"/>
+        </w:rPr>
+        <w:t>HU Pendientes:</w:t>
+      </w:r>
+      <w:r>
+        <w:rPr>
+          <w:rFonts w:eastAsia="Times New Roman" w:cs="Times New Roman"/>
+          <w:szCs w:val="24"/>
+        </w:rPr>
+        <w:t xml:space="preserve"> 0 </w:t>
+      </w:r>
+    </w:p>
+    <w:p>
+      <w:pPr>
+        <w:numPr>
+          <w:ilvl w:val="0"/>
+          <w:numId w:val="4"/>
+        </w:numPr>
+        <w:spacing w:line="480" w:lineRule="auto"/>
+        <w:jc w:val="both"/>
+        <w:rPr>
+          <w:rFonts w:eastAsia="Times New Roman" w:cs="Times New Roman"/>
+          <w:szCs w:val="24"/>
+        </w:rPr>
+      </w:pPr>
+      <w:r>
+        <w:rPr>
+          <w:rFonts w:eastAsia="Times New Roman" w:cs="Times New Roman"/>
+          <w:b/>
+          <w:bCs/>
+          <w:szCs w:val="24"/>
+        </w:rPr>
+        <w:t>TT Completadas:</w:t>
+      </w:r>
+      <w:r>
+        <w:rPr>
+          <w:rFonts w:eastAsia="Times New Roman" w:cs="Times New Roman"/>
+          <w:szCs w:val="24"/>
+        </w:rPr>
+        <w:t xml:space="preserve"> 2 + 1 restante de pasar por QA y + 1 de las correcciones que se realizaron en el pipeline para el </w:t>
+      </w:r>
+      <w:proofErr w:type="spellStart"/>
+      <w:r>
+        <w:rPr>
+          <w:rFonts w:eastAsia="Times New Roman" w:cs="Times New Roman"/>
+          <w:szCs w:val="24"/>
+        </w:rPr>
+        <w:t>frontend</w:t>
+      </w:r>
+      <w:proofErr w:type="spellEnd"/>
+      <w:r>
+        <w:rPr>
+          <w:rFonts w:eastAsia="Times New Roman" w:cs="Times New Roman"/>
+          <w:szCs w:val="24"/>
+        </w:rPr>
+        <w:t xml:space="preserve">. </w:t>
+      </w:r>
+    </w:p>
+    <w:p>
+      <w:pPr>
+        <w:numPr>
+          <w:ilvl w:val="0"/>
+          <w:numId w:val="4"/>
+        </w:numPr>
+        <w:spacing w:line="480" w:lineRule="auto"/>
+        <w:jc w:val="both"/>
+        <w:rPr>
+          <w:rFonts w:eastAsia="Times New Roman" w:cs="Times New Roman"/>
+          <w:szCs w:val="24"/>
+        </w:rPr>
+      </w:pPr>
+      <w:r>
+        <w:rPr>
+          <w:rFonts w:eastAsia="Times New Roman" w:cs="Times New Roman"/>
+          <w:b/>
+          <w:bCs/>
+          <w:szCs w:val="24"/>
+        </w:rPr>
+        <w:t>TT Pendientes:</w:t>
+      </w:r>
+      <w:r>
+        <w:rPr>
+          <w:rFonts w:eastAsia="Times New Roman" w:cs="Times New Roman"/>
+          <w:szCs w:val="24"/>
+        </w:rPr>
+        <w:t xml:space="preserve"> 0</w:t>
+      </w:r>
+    </w:p>
+    <w:p>
+      <w:pPr>
+        <w:pStyle w:val="Ttulo3"/>
+        <w:rPr>
+          <w:sz w:val="24"/>
+        </w:rPr>
+      </w:pPr>
+      <w:bookmarkStart w:id="14" w:name="_Toc225170499"/>
+      <w:r>
+        <w:t>Incremento del producto</w:t>
+      </w:r>
+      <w:bookmarkEnd w:id="14"/>
+    </w:p>
+    <w:p>
+      <w:pPr>
+        <w:numPr>
+          <w:ilvl w:val="0"/>
+          <w:numId w:val="5"/>
+        </w:numPr>
+        <w:spacing w:line="480" w:lineRule="auto"/>
+        <w:jc w:val="both"/>
+        <w:rPr>
+          <w:rFonts w:eastAsia="Times New Roman" w:cs="Times New Roman"/>
+          <w:b/>
+          <w:bCs/>
+          <w:szCs w:val="24"/>
+        </w:rPr>
+      </w:pPr>
+      <w:r>
+        <w:rPr>
+          <w:rFonts w:eastAsia="Times New Roman" w:cs="Times New Roman"/>
+          <w:b/>
+          <w:bCs/>
+          <w:szCs w:val="24"/>
+        </w:rPr>
+        <w:t>HU-04 – Crear expediente</w:t>
+      </w:r>
+      <w:r>
+        <w:rPr>
+          <w:rFonts w:eastAsia="Times New Roman" w:cs="Times New Roman"/>
+          <w:b/>
+          <w:bCs/>
+          <w:szCs w:val="24"/>
+        </w:rPr>
+        <w:t xml:space="preserve">: </w:t>
+      </w:r>
+      <w:r>
+        <w:rPr>
+          <w:rFonts w:eastAsia="Times New Roman" w:cs="Times New Roman"/>
+          <w:szCs w:val="24"/>
+        </w:rPr>
+        <w:t>El usuario con rol ‘RECEPCIONISTA’ puede crear un expediente con los datos del paciente.</w:t>
+      </w:r>
+      <w:r>
+        <w:rPr>
+          <w:rFonts w:eastAsia="Times New Roman" w:cs="Times New Roman"/>
+          <w:b/>
+          <w:bCs/>
+          <w:szCs w:val="24"/>
+        </w:rPr>
+        <w:t xml:space="preserve"> </w:t>
+      </w:r>
+      <w:r>
+        <w:rPr>
+          <w:rFonts w:eastAsia="Times New Roman" w:cs="Times New Roman"/>
+          <w:i/>
+          <w:iCs/>
+          <w:szCs w:val="24"/>
+        </w:rPr>
+        <w:t>(Sprint 1, pendiente de QA)</w:t>
+      </w:r>
+    </w:p>
+    <w:p>
+      <w:pPr>
+        <w:numPr>
+          <w:ilvl w:val="0"/>
+          <w:numId w:val="5"/>
+        </w:numPr>
+        <w:spacing w:line="480" w:lineRule="auto"/>
+        <w:jc w:val="both"/>
+        <w:rPr>
+          <w:rFonts w:eastAsia="Times New Roman" w:cs="Times New Roman"/>
+          <w:b/>
+          <w:bCs/>
+          <w:szCs w:val="24"/>
+        </w:rPr>
+      </w:pPr>
+      <w:r>
+        <w:rPr>
+          <w:rFonts w:eastAsia="Times New Roman" w:cs="Times New Roman"/>
+          <w:b/>
+          <w:bCs/>
+          <w:szCs w:val="24"/>
+        </w:rPr>
+        <w:t>HU-06 – Búsqueda de pacientes</w:t>
+      </w:r>
+      <w:r>
+        <w:rPr>
+          <w:rFonts w:eastAsia="Times New Roman" w:cs="Times New Roman"/>
+          <w:b/>
+          <w:bCs/>
+          <w:szCs w:val="24"/>
+        </w:rPr>
+        <w:t xml:space="preserve">: </w:t>
+      </w:r>
+      <w:r>
+        <w:rPr>
+          <w:rFonts w:eastAsia="Times New Roman" w:cs="Times New Roman"/>
+          <w:szCs w:val="24"/>
+        </w:rPr>
+        <w:t>búsqueda funcional de los pacientes desde los</w:t>
+      </w:r>
+      <w:r>
+        <w:rPr>
+          <w:rFonts w:eastAsia="Times New Roman" w:cs="Times New Roman"/>
+          <w:szCs w:val="24"/>
+        </w:rPr>
+        <w:t xml:space="preserve"> roles </w:t>
+      </w:r>
+      <w:r>
+        <w:rPr>
+          <w:rFonts w:eastAsia="Times New Roman" w:cs="Times New Roman"/>
+          <w:szCs w:val="24"/>
+        </w:rPr>
+        <w:t>que tienen permiso correspondiente.</w:t>
+      </w:r>
+      <w:r>
+        <w:rPr>
+          <w:rFonts w:eastAsia="Times New Roman" w:cs="Times New Roman"/>
+          <w:szCs w:val="24"/>
+        </w:rPr>
+        <w:t xml:space="preserve"> Se puede buscar al paciente por nombre completo, número de identidad y número de expediente. </w:t>
+      </w:r>
+    </w:p>
+    <w:p>
+      <w:pPr>
+        <w:numPr>
+          <w:ilvl w:val="0"/>
+          <w:numId w:val="5"/>
+        </w:numPr>
+        <w:spacing w:line="480" w:lineRule="auto"/>
+        <w:jc w:val="both"/>
+        <w:rPr>
+          <w:rFonts w:eastAsia="Times New Roman" w:cs="Times New Roman"/>
+          <w:b/>
+          <w:bCs/>
+          <w:szCs w:val="24"/>
+        </w:rPr>
+      </w:pPr>
+      <w:r>
+        <w:rPr>
+          <w:rFonts w:eastAsia="Times New Roman" w:cs="Times New Roman"/>
+          <w:b/>
+          <w:bCs/>
+          <w:szCs w:val="24"/>
+        </w:rPr>
+        <w:lastRenderedPageBreak/>
+        <w:t>HU-07 – Registro preclínico</w:t>
+      </w:r>
+      <w:r>
+        <w:rPr>
+          <w:rFonts w:eastAsia="Times New Roman" w:cs="Times New Roman"/>
+          <w:b/>
+          <w:bCs/>
+          <w:szCs w:val="24"/>
+        </w:rPr>
+        <w:t xml:space="preserve">: </w:t>
+      </w:r>
+      <w:r>
+        <w:rPr>
+          <w:rFonts w:eastAsia="Times New Roman" w:cs="Times New Roman"/>
+          <w:szCs w:val="24"/>
+        </w:rPr>
+        <w:t xml:space="preserve">El usuario con rol de </w:t>
+      </w:r>
+      <w:r>
+        <w:rPr>
+          <w:rFonts w:eastAsia="Times New Roman" w:cs="Times New Roman"/>
+          <w:szCs w:val="24"/>
+        </w:rPr>
+        <w:t xml:space="preserve">‘ENFERMERO’ </w:t>
+      </w:r>
+      <w:r>
+        <w:rPr>
+          <w:rFonts w:eastAsia="Times New Roman" w:cs="Times New Roman"/>
+          <w:szCs w:val="24"/>
+        </w:rPr>
+        <w:t xml:space="preserve">puede realizar el registro preclínico del paciente, registrando sus signos vitales. </w:t>
+      </w:r>
+    </w:p>
+    <w:p>
+      <w:pPr>
+        <w:numPr>
+          <w:ilvl w:val="0"/>
+          <w:numId w:val="5"/>
+        </w:numPr>
+        <w:spacing w:line="480" w:lineRule="auto"/>
+        <w:jc w:val="both"/>
+        <w:rPr>
+          <w:rFonts w:eastAsia="Times New Roman" w:cs="Times New Roman"/>
+          <w:b/>
+          <w:bCs/>
+          <w:szCs w:val="24"/>
+        </w:rPr>
+      </w:pPr>
+      <w:r>
+        <w:rPr>
+          <w:rFonts w:eastAsia="Times New Roman" w:cs="Times New Roman"/>
+          <w:b/>
+          <w:bCs/>
+          <w:szCs w:val="24"/>
+        </w:rPr>
+        <w:t>HU-08 – Registro de consulta médica</w:t>
+      </w:r>
+      <w:r>
+        <w:rPr>
+          <w:rFonts w:eastAsia="Times New Roman" w:cs="Times New Roman"/>
+          <w:b/>
+          <w:bCs/>
+          <w:szCs w:val="24"/>
+        </w:rPr>
+        <w:t xml:space="preserve">: </w:t>
+      </w:r>
+      <w:r>
+        <w:rPr>
+          <w:rFonts w:eastAsia="Times New Roman" w:cs="Times New Roman"/>
+          <w:szCs w:val="24"/>
+        </w:rPr>
+        <w:t xml:space="preserve">El usuario con rol de </w:t>
+      </w:r>
+      <w:r>
+        <w:rPr>
+          <w:rFonts w:eastAsia="Times New Roman" w:cs="Times New Roman"/>
+          <w:szCs w:val="24"/>
+        </w:rPr>
+        <w:t xml:space="preserve">‘MEDICO’ </w:t>
+      </w:r>
+      <w:r>
+        <w:rPr>
+          <w:rFonts w:eastAsia="Times New Roman" w:cs="Times New Roman"/>
+          <w:szCs w:val="24"/>
+        </w:rPr>
+        <w:t xml:space="preserve">puede registrar la consulta del paciente. </w:t>
+      </w:r>
+    </w:p>
+    <w:p>
+      <w:pPr>
+        <w:numPr>
+          <w:ilvl w:val="0"/>
+          <w:numId w:val="5"/>
+        </w:numPr>
+        <w:spacing w:line="480" w:lineRule="auto"/>
+        <w:jc w:val="both"/>
+        <w:rPr>
+          <w:rFonts w:eastAsia="Times New Roman" w:cs="Times New Roman"/>
+          <w:b/>
+          <w:bCs/>
+          <w:szCs w:val="24"/>
+        </w:rPr>
+      </w:pPr>
+      <w:r>
+        <w:rPr>
+          <w:rFonts w:eastAsia="Times New Roman" w:cs="Times New Roman"/>
+          <w:b/>
+          <w:bCs/>
+          <w:szCs w:val="24"/>
+        </w:rPr>
+        <w:t>HU-16 – Cambio de contraseña</w:t>
+      </w:r>
+      <w:r>
+        <w:rPr>
+          <w:rFonts w:eastAsia="Times New Roman" w:cs="Times New Roman"/>
+          <w:b/>
+          <w:bCs/>
+          <w:szCs w:val="24"/>
+        </w:rPr>
+        <w:t xml:space="preserve">: </w:t>
+      </w:r>
+      <w:r>
+        <w:rPr>
+          <w:rFonts w:eastAsia="Times New Roman" w:cs="Times New Roman"/>
+          <w:szCs w:val="24"/>
+        </w:rPr>
+        <w:t xml:space="preserve">Los usuarios pueden cambiar su contraseña, directamente con el formulario. </w:t>
+      </w:r>
+      <w:r>
+        <w:rPr>
+          <w:rFonts w:eastAsia="Times New Roman" w:cs="Times New Roman"/>
+          <w:i/>
+          <w:iCs/>
+          <w:szCs w:val="24"/>
+        </w:rPr>
+        <w:t>(Sprint 1, pendiente de QA)</w:t>
+      </w:r>
+    </w:p>
+    <w:p>
+      <w:pPr>
+        <w:numPr>
+          <w:ilvl w:val="0"/>
+          <w:numId w:val="5"/>
+        </w:numPr>
+        <w:spacing w:line="480" w:lineRule="auto"/>
+        <w:jc w:val="both"/>
+        <w:rPr>
+          <w:rFonts w:eastAsia="Times New Roman" w:cs="Times New Roman"/>
+          <w:b/>
+          <w:bCs/>
+          <w:szCs w:val="24"/>
+        </w:rPr>
+      </w:pPr>
+      <w:r>
+        <w:rPr>
+          <w:rFonts w:eastAsia="Times New Roman" w:cs="Times New Roman"/>
+          <w:b/>
+          <w:bCs/>
+          <w:szCs w:val="24"/>
+        </w:rPr>
+        <w:t>TT-06 Migrar manejo de roles y permisos a la base de datos</w:t>
+      </w:r>
+      <w:r>
+        <w:rPr>
+          <w:rFonts w:eastAsia="Times New Roman" w:cs="Times New Roman"/>
+          <w:b/>
+          <w:bCs/>
+          <w:szCs w:val="24"/>
+        </w:rPr>
+        <w:t xml:space="preserve">: </w:t>
+      </w:r>
+      <w:r>
+        <w:rPr>
+          <w:rFonts w:eastAsia="Times New Roman" w:cs="Times New Roman"/>
+          <w:szCs w:val="24"/>
+        </w:rPr>
+        <w:t>Esta tare</w:t>
+      </w:r>
+      <w:r>
+        <w:rPr>
+          <w:rFonts w:eastAsia="Times New Roman" w:cs="Times New Roman"/>
+          <w:szCs w:val="24"/>
+        </w:rPr>
+        <w:t>a</w:t>
+      </w:r>
+      <w:r>
+        <w:rPr>
+          <w:rFonts w:eastAsia="Times New Roman" w:cs="Times New Roman"/>
+          <w:szCs w:val="24"/>
+        </w:rPr>
+        <w:t xml:space="preserve"> también fue completada el sprint pasado, solo estaba pendiente de QA. </w:t>
+      </w:r>
+    </w:p>
+    <w:p>
+      <w:pPr>
+        <w:numPr>
+          <w:ilvl w:val="0"/>
+          <w:numId w:val="5"/>
+        </w:numPr>
+        <w:spacing w:line="480" w:lineRule="auto"/>
+        <w:jc w:val="both"/>
+        <w:rPr>
+          <w:rFonts w:eastAsia="Times New Roman" w:cs="Times New Roman"/>
+          <w:b/>
+          <w:bCs/>
+          <w:szCs w:val="24"/>
+        </w:rPr>
+      </w:pPr>
+      <w:r>
+        <w:rPr>
+          <w:rFonts w:eastAsia="Times New Roman" w:cs="Times New Roman"/>
+          <w:b/>
+          <w:bCs/>
+          <w:szCs w:val="24"/>
+        </w:rPr>
+        <w:t>TT-0</w:t>
+      </w:r>
+      <w:r>
+        <w:rPr>
+          <w:rFonts w:eastAsia="Times New Roman" w:cs="Times New Roman"/>
+          <w:b/>
+          <w:bCs/>
+          <w:szCs w:val="24"/>
+        </w:rPr>
+        <w:t>7</w:t>
+      </w:r>
+      <w:r>
+        <w:rPr>
+          <w:rFonts w:eastAsia="Times New Roman" w:cs="Times New Roman"/>
+          <w:b/>
+          <w:bCs/>
+          <w:szCs w:val="24"/>
+        </w:rPr>
+        <w:t xml:space="preserve"> Configuración de </w:t>
+      </w:r>
+      <w:proofErr w:type="spellStart"/>
+      <w:r>
+        <w:rPr>
+          <w:rFonts w:eastAsia="Times New Roman" w:cs="Times New Roman"/>
+          <w:b/>
+          <w:bCs/>
+          <w:szCs w:val="24"/>
+        </w:rPr>
+        <w:t>Pipline</w:t>
+      </w:r>
+      <w:proofErr w:type="spellEnd"/>
+      <w:r>
+        <w:rPr>
+          <w:rFonts w:eastAsia="Times New Roman" w:cs="Times New Roman"/>
+          <w:b/>
+          <w:bCs/>
+          <w:szCs w:val="24"/>
+        </w:rPr>
+        <w:t xml:space="preserve"> de CI con </w:t>
+      </w:r>
+      <w:proofErr w:type="spellStart"/>
+      <w:r>
+        <w:rPr>
+          <w:rFonts w:eastAsia="Times New Roman" w:cs="Times New Roman"/>
+          <w:b/>
+          <w:bCs/>
+          <w:szCs w:val="24"/>
+        </w:rPr>
+        <w:t>Github</w:t>
+      </w:r>
+      <w:proofErr w:type="spellEnd"/>
+      <w:r>
+        <w:rPr>
+          <w:rFonts w:eastAsia="Times New Roman" w:cs="Times New Roman"/>
+          <w:b/>
+          <w:bCs/>
+          <w:szCs w:val="24"/>
+        </w:rPr>
+        <w:t xml:space="preserve"> </w:t>
+      </w:r>
+      <w:proofErr w:type="spellStart"/>
+      <w:r>
+        <w:rPr>
+          <w:rFonts w:eastAsia="Times New Roman" w:cs="Times New Roman"/>
+          <w:b/>
+          <w:bCs/>
+          <w:szCs w:val="24"/>
+        </w:rPr>
+        <w:t>Actions</w:t>
+      </w:r>
+      <w:proofErr w:type="spellEnd"/>
+      <w:r>
+        <w:rPr>
+          <w:rFonts w:eastAsia="Times New Roman" w:cs="Times New Roman"/>
+          <w:b/>
+          <w:bCs/>
+          <w:szCs w:val="24"/>
+        </w:rPr>
+        <w:t xml:space="preserve">: </w:t>
+      </w:r>
+      <w:r>
+        <w:rPr>
+          <w:rFonts w:eastAsia="Times New Roman" w:cs="Times New Roman"/>
+          <w:szCs w:val="24"/>
+        </w:rPr>
+        <w:t xml:space="preserve">Se agregaron las pruebas con </w:t>
+      </w:r>
+      <w:proofErr w:type="spellStart"/>
+      <w:r>
+        <w:rPr>
+          <w:rFonts w:eastAsia="Times New Roman" w:cs="Times New Roman"/>
+          <w:szCs w:val="24"/>
+        </w:rPr>
+        <w:t>ESLint</w:t>
+      </w:r>
+      <w:proofErr w:type="spellEnd"/>
+      <w:r>
+        <w:rPr>
+          <w:rFonts w:eastAsia="Times New Roman" w:cs="Times New Roman"/>
+          <w:szCs w:val="24"/>
+        </w:rPr>
+        <w:t xml:space="preserve"> en el </w:t>
+      </w:r>
+      <w:proofErr w:type="spellStart"/>
+      <w:r>
+        <w:rPr>
+          <w:rFonts w:eastAsia="Times New Roman" w:cs="Times New Roman"/>
+          <w:szCs w:val="24"/>
+        </w:rPr>
+        <w:t>ci</w:t>
+      </w:r>
+      <w:proofErr w:type="spellEnd"/>
+      <w:r>
+        <w:rPr>
+          <w:rFonts w:eastAsia="Times New Roman" w:cs="Times New Roman"/>
+          <w:szCs w:val="24"/>
+        </w:rPr>
+        <w:t xml:space="preserve"> del </w:t>
+      </w:r>
+      <w:proofErr w:type="spellStart"/>
+      <w:r>
+        <w:rPr>
+          <w:rFonts w:eastAsia="Times New Roman" w:cs="Times New Roman"/>
+          <w:szCs w:val="24"/>
+        </w:rPr>
+        <w:t>frontend</w:t>
+      </w:r>
+      <w:proofErr w:type="spellEnd"/>
+      <w:r>
+        <w:rPr>
+          <w:rFonts w:eastAsia="Times New Roman" w:cs="Times New Roman"/>
+          <w:szCs w:val="24"/>
+        </w:rPr>
+        <w:t xml:space="preserve">. </w:t>
+      </w:r>
+    </w:p>
+    <w:p>
+      <w:pPr>
+        <w:numPr>
+          <w:ilvl w:val="0"/>
+          <w:numId w:val="5"/>
+        </w:numPr>
+        <w:spacing w:line="480" w:lineRule="auto"/>
+        <w:jc w:val="both"/>
+        <w:rPr>
+          <w:rFonts w:eastAsia="Times New Roman" w:cs="Times New Roman"/>
+          <w:b/>
+          <w:bCs/>
+          <w:szCs w:val="24"/>
+        </w:rPr>
+      </w:pPr>
+      <w:r>
+        <w:rPr>
+          <w:rFonts w:eastAsia="Times New Roman" w:cs="Times New Roman"/>
+          <w:b/>
+          <w:bCs/>
+          <w:szCs w:val="24"/>
+        </w:rPr>
+        <w:t>TT-0</w:t>
+      </w:r>
+      <w:r>
+        <w:rPr>
+          <w:rFonts w:eastAsia="Times New Roman" w:cs="Times New Roman"/>
+          <w:b/>
+          <w:bCs/>
+          <w:szCs w:val="24"/>
+        </w:rPr>
+        <w:t>8</w:t>
+      </w:r>
+      <w:r>
+        <w:rPr>
+          <w:rFonts w:eastAsia="Times New Roman" w:cs="Times New Roman"/>
+          <w:b/>
+          <w:bCs/>
+          <w:szCs w:val="24"/>
+        </w:rPr>
+        <w:t xml:space="preserve"> Implementar manejo de errores en los controladores</w:t>
+      </w:r>
+      <w:r>
+        <w:rPr>
+          <w:rFonts w:eastAsia="Times New Roman" w:cs="Times New Roman"/>
+          <w:b/>
+          <w:bCs/>
+          <w:szCs w:val="24"/>
+        </w:rPr>
+        <w:t xml:space="preserve">: </w:t>
+      </w:r>
+      <w:r>
+        <w:rPr>
+          <w:rFonts w:eastAsia="Times New Roman" w:cs="Times New Roman"/>
+          <w:szCs w:val="24"/>
+        </w:rPr>
+        <w:t xml:space="preserve">Se implementó un mejor manejo de errores desde los controladores, para mostrar mensajes más amigables al usuario en el </w:t>
+      </w:r>
+      <w:proofErr w:type="spellStart"/>
+      <w:r>
+        <w:rPr>
+          <w:rFonts w:eastAsia="Times New Roman" w:cs="Times New Roman"/>
+          <w:szCs w:val="24"/>
+        </w:rPr>
+        <w:t>frontend</w:t>
+      </w:r>
+      <w:proofErr w:type="spellEnd"/>
+      <w:r>
+        <w:rPr>
+          <w:rFonts w:eastAsia="Times New Roman" w:cs="Times New Roman"/>
+          <w:szCs w:val="24"/>
+        </w:rPr>
+        <w:t xml:space="preserve">. </w:t>
+      </w:r>
+    </w:p>
+    <w:p>
+      <w:pPr>
+        <w:numPr>
+          <w:ilvl w:val="0"/>
+          <w:numId w:val="5"/>
+        </w:numPr>
+        <w:spacing w:line="480" w:lineRule="auto"/>
+        <w:jc w:val="both"/>
+        <w:rPr>
+          <w:rFonts w:eastAsia="Times New Roman" w:cs="Times New Roman"/>
+          <w:b/>
+          <w:bCs/>
+          <w:szCs w:val="24"/>
+        </w:rPr>
+      </w:pPr>
+      <w:r>
+        <w:rPr>
+          <w:rFonts w:eastAsia="Times New Roman" w:cs="Times New Roman"/>
+          <w:b/>
+          <w:bCs/>
+          <w:szCs w:val="24"/>
+        </w:rPr>
+        <w:t>TT-</w:t>
+      </w:r>
+      <w:r>
+        <w:rPr>
+          <w:rFonts w:eastAsia="Times New Roman" w:cs="Times New Roman"/>
+          <w:b/>
+          <w:bCs/>
+          <w:szCs w:val="24"/>
+        </w:rPr>
+        <w:t>10</w:t>
+      </w:r>
+      <w:r>
+        <w:rPr>
+          <w:rFonts w:eastAsia="Times New Roman" w:cs="Times New Roman"/>
+          <w:b/>
+          <w:bCs/>
+          <w:szCs w:val="24"/>
+        </w:rPr>
+        <w:t xml:space="preserve"> </w:t>
+      </w:r>
+      <w:proofErr w:type="spellStart"/>
+      <w:r>
+        <w:rPr>
+          <w:rFonts w:eastAsia="Times New Roman" w:cs="Times New Roman"/>
+          <w:b/>
+          <w:bCs/>
+          <w:szCs w:val="24"/>
+        </w:rPr>
+        <w:t>Componentizar</w:t>
+      </w:r>
+      <w:proofErr w:type="spellEnd"/>
+      <w:r>
+        <w:rPr>
+          <w:rFonts w:eastAsia="Times New Roman" w:cs="Times New Roman"/>
+          <w:b/>
+          <w:bCs/>
+          <w:szCs w:val="24"/>
+        </w:rPr>
+        <w:t xml:space="preserve"> formularios del </w:t>
+      </w:r>
+      <w:proofErr w:type="spellStart"/>
+      <w:r>
+        <w:rPr>
+          <w:rFonts w:eastAsia="Times New Roman" w:cs="Times New Roman"/>
+          <w:b/>
+          <w:bCs/>
+          <w:szCs w:val="24"/>
+        </w:rPr>
+        <w:t>frontend</w:t>
+      </w:r>
+      <w:proofErr w:type="spellEnd"/>
+      <w:r>
+        <w:rPr>
+          <w:rFonts w:eastAsia="Times New Roman" w:cs="Times New Roman"/>
+          <w:b/>
+          <w:bCs/>
+          <w:szCs w:val="24"/>
+        </w:rPr>
+        <w:t xml:space="preserve"> y mostrar vistas según rol</w:t>
+      </w:r>
+      <w:r>
+        <w:rPr>
+          <w:rFonts w:eastAsia="Times New Roman" w:cs="Times New Roman"/>
+          <w:b/>
+          <w:bCs/>
+          <w:szCs w:val="24"/>
+        </w:rPr>
+        <w:t xml:space="preserve">: </w:t>
+      </w:r>
+      <w:r>
+        <w:rPr>
+          <w:rFonts w:eastAsia="Times New Roman" w:cs="Times New Roman"/>
+          <w:szCs w:val="24"/>
+        </w:rPr>
+        <w:t xml:space="preserve">Los formularios que estaban independientes, ahora están reutilizando los componentes. </w:t>
+      </w:r>
+    </w:p>
+    <w:p>
+      <w:pPr>
+        <w:pStyle w:val="Ttulo2"/>
+      </w:pPr>
+      <w:bookmarkStart w:id="15" w:name="_Toc225170500"/>
+      <w:r>
+        <w:t>Sprint Retrospective</w:t>
+      </w:r>
+      <w:bookmarkEnd w:id="15"/>
+    </w:p>
+    <w:p>
+      <w:pPr>
+        <w:pStyle w:val="Ttulo3"/>
+      </w:pPr>
+      <w:bookmarkStart w:id="16" w:name="_Toc225170501"/>
+      <w:r>
+        <w:t>Análisis de la velocidad del equipo</w:t>
+      </w:r>
+      <w:bookmarkEnd w:id="16"/>
+      <w:r>
+        <w:t xml:space="preserve"> </w:t>
+      </w:r>
+    </w:p>
+    <w:p>
+      <w:r>
+        <w:t>Los pesos de las Historias de Usuario fueron asignados de acuerdo a la complejidad de cada una, manteniendo el uso de las “tallas de camiseta”, en relación con el sprint anterior.</w:t>
+      </w:r>
+    </w:p>
+    <w:p>
+      <w:r>
+        <w:t>Para calcular la velocidad del equipo, las HU se estimaron de la siguiente manera:</w:t>
+      </w:r>
+    </w:p>
+    <w:p/>
+    <w:tbl>
+      <w:tblPr>
+        <w:tblW w:w="9226" w:type="dxa"/>
+        <w:tblBorders>
+          <w:top w:val="nil"/>
+          <w:left w:val="nil"/>
+          <w:bottom w:val="nil"/>
+          <w:right w:val="nil"/>
+          <w:insideH w:val="nil"/>
+          <w:insideV w:val="nil"/>
+        </w:tblBorders>
+        <w:tblLayout w:type="fixed"/>
+        <w:tblLook w:val="0600" w:firstRow="0" w:lastRow="0" w:firstColumn="0" w:lastColumn="0" w:noHBand="1" w:noVBand="1"/>
+      </w:tblPr>
+      <w:tblGrid>
+        <w:gridCol w:w="5187"/>
+        <w:gridCol w:w="2020"/>
+        <w:gridCol w:w="2019"/>
+      </w:tblGrid>
+      <w:tr>
+        <w:trPr>
+          <w:trHeight w:val="1021"/>
+        </w:trPr>
+        <w:tc>
+          <w:tcPr>
+            <w:tcW w:w="5187" w:type="dxa"/>
+            <w:tcBorders>
+              <w:top w:val="single" w:sz="5" w:space="0" w:color="1F1F1F"/>
+              <w:left w:val="single" w:sz="5" w:space="0" w:color="1F1F1F"/>
+              <w:bottom w:val="single" w:sz="5" w:space="0" w:color="1F1F1F"/>
+              <w:right w:val="single" w:sz="5" w:space="0" w:color="1F1F1F"/>
+            </w:tcBorders>
+            <w:shd w:val="clear" w:color="auto" w:fill="EFEFEF"/>
+            <w:tcMar>
+              <w:top w:w="113" w:type="dxa"/>
+              <w:left w:w="113" w:type="dxa"/>
+              <w:bottom w:w="113" w:type="dxa"/>
+              <w:right w:w="113" w:type="dxa"/>
+            </w:tcMar>
+          </w:tcPr>
+          <w:p>
+            <w:pPr>
+              <w:spacing w:after="480" w:line="240" w:lineRule="auto"/>
+              <w:jc w:val="center"/>
+              <w:rPr>
+                <w:color w:val="1F1F1F"/>
+                <w:szCs w:val="24"/>
+              </w:rPr>
+            </w:pPr>
+            <w:r>
+              <w:rPr>
+                <w:b/>
+                <w:bCs/>
+                <w:color w:val="1F1F1F"/>
+                <w:szCs w:val="24"/>
+              </w:rPr>
+              <w:t>Historia de Usuario (HU)</w:t>
+            </w:r>
+            <w:r>
+              <w:rPr>
+                <w:b/>
+                <w:bCs/>
+                <w:color w:val="1F1F1F"/>
+                <w:szCs w:val="24"/>
+              </w:rPr>
+              <w:t xml:space="preserve"> / Tarea Técnica (TT)</w:t>
+            </w:r>
+          </w:p>
+        </w:tc>
+        <w:tc>
+          <w:tcPr>
+            <w:tcW w:w="2020" w:type="dxa"/>
+            <w:tcBorders>
+              <w:top w:val="single" w:sz="5" w:space="0" w:color="1F1F1F"/>
+              <w:left w:val="single" w:sz="5" w:space="0" w:color="1F1F1F"/>
+              <w:bottom w:val="single" w:sz="5" w:space="0" w:color="1F1F1F"/>
+              <w:right w:val="single" w:sz="5" w:space="0" w:color="1F1F1F"/>
+            </w:tcBorders>
+            <w:shd w:val="clear" w:color="auto" w:fill="EFEFEF"/>
+            <w:tcMar>
+              <w:top w:w="113" w:type="dxa"/>
+              <w:left w:w="113" w:type="dxa"/>
+              <w:bottom w:w="113" w:type="dxa"/>
+              <w:right w:w="113" w:type="dxa"/>
+            </w:tcMar>
+          </w:tcPr>
+          <w:p>
+            <w:pPr>
+              <w:spacing w:after="480" w:line="240" w:lineRule="auto"/>
+              <w:jc w:val="center"/>
+              <w:rPr>
+                <w:color w:val="1F1F1F"/>
+                <w:szCs w:val="24"/>
+              </w:rPr>
+            </w:pPr>
+            <w:r>
+              <w:rPr>
+                <w:b/>
+                <w:bCs/>
+                <w:color w:val="1F1F1F"/>
+                <w:szCs w:val="24"/>
+              </w:rPr>
+              <w:t>Talla de Camiseta</w:t>
+            </w:r>
+          </w:p>
+        </w:tc>
+        <w:tc>
+          <w:tcPr>
+            <w:tcW w:w="2019" w:type="dxa"/>
+            <w:tcBorders>
+              <w:top w:val="single" w:sz="5" w:space="0" w:color="1F1F1F"/>
+              <w:left w:val="single" w:sz="5" w:space="0" w:color="1F1F1F"/>
+              <w:bottom w:val="single" w:sz="5" w:space="0" w:color="1F1F1F"/>
+              <w:right w:val="single" w:sz="5" w:space="0" w:color="1F1F1F"/>
+            </w:tcBorders>
+            <w:shd w:val="clear" w:color="auto" w:fill="EFEFEF"/>
+            <w:tcMar>
+              <w:top w:w="113" w:type="dxa"/>
+              <w:left w:w="113" w:type="dxa"/>
+              <w:bottom w:w="113" w:type="dxa"/>
+              <w:right w:w="113" w:type="dxa"/>
+            </w:tcMar>
+          </w:tcPr>
+          <w:p>
+            <w:pPr>
+              <w:spacing w:after="480" w:line="240" w:lineRule="auto"/>
+              <w:jc w:val="center"/>
+              <w:rPr>
+                <w:color w:val="1F1F1F"/>
+                <w:szCs w:val="24"/>
+              </w:rPr>
+            </w:pPr>
+            <w:r>
+              <w:rPr>
+                <w:b/>
+                <w:bCs/>
+                <w:color w:val="1F1F1F"/>
+                <w:szCs w:val="24"/>
+              </w:rPr>
+              <w:t>Estado</w:t>
+            </w:r>
+          </w:p>
+        </w:tc>
+      </w:tr>
+      <w:tr>
+        <w:trPr>
+          <w:trHeight w:val="703"/>
+        </w:trPr>
+        <w:tc>
+          <w:tcPr>
+            <w:tcW w:w="5187" w:type="dxa"/>
+            <w:tcBorders>
+              <w:top w:val="single" w:sz="5" w:space="0" w:color="1F1F1F"/>
+              <w:left w:val="single" w:sz="5" w:space="0" w:color="1F1F1F"/>
+              <w:bottom w:val="single" w:sz="5" w:space="0" w:color="1F1F1F"/>
+              <w:right w:val="single" w:sz="5" w:space="0" w:color="1F1F1F"/>
+            </w:tcBorders>
+            <w:tcMar>
+              <w:top w:w="113" w:type="dxa"/>
+              <w:left w:w="113" w:type="dxa"/>
+              <w:bottom w:w="113" w:type="dxa"/>
+              <w:right w:w="113" w:type="dxa"/>
+            </w:tcMar>
+          </w:tcPr>
+          <w:p>
+            <w:pPr>
+              <w:spacing w:after="480" w:line="240" w:lineRule="auto"/>
+              <w:rPr>
+                <w:color w:val="1F1F1F"/>
+                <w:szCs w:val="24"/>
+              </w:rPr>
+            </w:pPr>
+            <w:r>
+              <w:rPr>
+                <w:b/>
+                <w:bCs/>
+                <w:color w:val="1F1F1F"/>
+                <w:szCs w:val="24"/>
+              </w:rPr>
+              <w:lastRenderedPageBreak/>
+              <w:t>HU-04:</w:t>
+            </w:r>
+            <w:r>
+              <w:rPr>
+                <w:color w:val="1F1F1F"/>
+                <w:szCs w:val="24"/>
+              </w:rPr>
+              <w:t xml:space="preserve"> Crear expediente</w:t>
+            </w:r>
+          </w:p>
+        </w:tc>
+        <w:tc>
+          <w:tcPr>
+            <w:tcW w:w="2020" w:type="dxa"/>
+            <w:tcBorders>
+              <w:top w:val="single" w:sz="5" w:space="0" w:color="1F1F1F"/>
+              <w:left w:val="single" w:sz="5" w:space="0" w:color="1F1F1F"/>
+              <w:bottom w:val="single" w:sz="5" w:space="0" w:color="1F1F1F"/>
+              <w:right w:val="single" w:sz="5" w:space="0" w:color="1F1F1F"/>
+            </w:tcBorders>
+            <w:tcMar>
+              <w:top w:w="113" w:type="dxa"/>
+              <w:left w:w="113" w:type="dxa"/>
+              <w:bottom w:w="113" w:type="dxa"/>
+              <w:right w:w="113" w:type="dxa"/>
+            </w:tcMar>
+          </w:tcPr>
+          <w:p>
+            <w:pPr>
+              <w:spacing w:after="480" w:line="240" w:lineRule="auto"/>
+              <w:jc w:val="center"/>
+              <w:rPr>
+                <w:color w:val="1F1F1F"/>
+                <w:szCs w:val="24"/>
+              </w:rPr>
+            </w:pPr>
+            <w:r>
+              <w:rPr>
+                <w:b/>
+                <w:bCs/>
+                <w:color w:val="1F1F1F"/>
+                <w:szCs w:val="24"/>
+              </w:rPr>
+              <w:t>M</w:t>
+            </w:r>
+          </w:p>
+        </w:tc>
+        <w:tc>
+          <w:tcPr>
+            <w:tcW w:w="2019" w:type="dxa"/>
+            <w:tcBorders>
+              <w:top w:val="single" w:sz="5" w:space="0" w:color="1F1F1F"/>
+              <w:left w:val="single" w:sz="5" w:space="0" w:color="1F1F1F"/>
+              <w:bottom w:val="single" w:sz="5" w:space="0" w:color="1F1F1F"/>
+              <w:right w:val="single" w:sz="5" w:space="0" w:color="1F1F1F"/>
+            </w:tcBorders>
+            <w:tcMar>
+              <w:top w:w="113" w:type="dxa"/>
+              <w:left w:w="113" w:type="dxa"/>
+              <w:bottom w:w="113" w:type="dxa"/>
+              <w:right w:w="113" w:type="dxa"/>
+            </w:tcMar>
+          </w:tcPr>
+          <w:p>
+            <w:pPr>
+              <w:spacing w:after="480" w:line="240" w:lineRule="auto"/>
+              <w:jc w:val="center"/>
+              <w:rPr>
+                <w:color w:val="1F1F1F"/>
+                <w:szCs w:val="24"/>
+              </w:rPr>
+            </w:pPr>
+            <w:r>
+              <w:rPr>
+                <w:color w:val="1F1F1F"/>
+                <w:szCs w:val="24"/>
+              </w:rPr>
+              <w:t>Finalizada</w:t>
+            </w:r>
+          </w:p>
+        </w:tc>
+      </w:tr>
+      <w:tr>
+        <w:trPr>
+          <w:trHeight w:val="736"/>
+        </w:trPr>
+        <w:tc>
+          <w:tcPr>
+            <w:tcW w:w="5187" w:type="dxa"/>
+            <w:tcBorders>
+              <w:top w:val="single" w:sz="5" w:space="0" w:color="1F1F1F"/>
+              <w:left w:val="single" w:sz="5" w:space="0" w:color="1F1F1F"/>
+              <w:bottom w:val="single" w:sz="5" w:space="0" w:color="1F1F1F"/>
+              <w:right w:val="single" w:sz="5" w:space="0" w:color="1F1F1F"/>
+            </w:tcBorders>
+            <w:tcMar>
+              <w:top w:w="113" w:type="dxa"/>
+              <w:left w:w="113" w:type="dxa"/>
+              <w:bottom w:w="113" w:type="dxa"/>
+              <w:right w:w="113" w:type="dxa"/>
+            </w:tcMar>
+          </w:tcPr>
+          <w:p>
+            <w:pPr>
+              <w:spacing w:after="480" w:line="240" w:lineRule="auto"/>
+              <w:rPr>
+                <w:color w:val="1F1F1F"/>
+                <w:szCs w:val="24"/>
+              </w:rPr>
+            </w:pPr>
+            <w:r>
+              <w:rPr>
+                <w:rFonts w:eastAsia="Times New Roman" w:cs="Times New Roman"/>
+                <w:b/>
+                <w:bCs/>
+                <w:szCs w:val="24"/>
+              </w:rPr>
+              <w:t>HU-06</w:t>
+            </w:r>
+            <w:r>
+              <w:rPr>
+                <w:rFonts w:eastAsia="Times New Roman" w:cs="Times New Roman"/>
+                <w:szCs w:val="24"/>
+              </w:rPr>
+              <w:t>: Búsqueda de pacientes</w:t>
+            </w:r>
+          </w:p>
+        </w:tc>
+        <w:tc>
+          <w:tcPr>
+            <w:tcW w:w="2020" w:type="dxa"/>
+            <w:tcBorders>
+              <w:top w:val="single" w:sz="5" w:space="0" w:color="1F1F1F"/>
+              <w:left w:val="single" w:sz="5" w:space="0" w:color="1F1F1F"/>
+              <w:bottom w:val="single" w:sz="5" w:space="0" w:color="1F1F1F"/>
+              <w:right w:val="single" w:sz="5" w:space="0" w:color="1F1F1F"/>
+            </w:tcBorders>
+            <w:tcMar>
+              <w:top w:w="113" w:type="dxa"/>
+              <w:left w:w="113" w:type="dxa"/>
+              <w:bottom w:w="113" w:type="dxa"/>
+              <w:right w:w="113" w:type="dxa"/>
+            </w:tcMar>
+          </w:tcPr>
+          <w:p>
+            <w:pPr>
+              <w:spacing w:after="480" w:line="240" w:lineRule="auto"/>
+              <w:jc w:val="center"/>
+              <w:rPr>
+                <w:color w:val="1F1F1F"/>
+                <w:szCs w:val="24"/>
+              </w:rPr>
+            </w:pPr>
+            <w:r>
+              <w:rPr>
+                <w:b/>
+                <w:bCs/>
+                <w:color w:val="1F1F1F"/>
+                <w:szCs w:val="24"/>
+              </w:rPr>
+              <w:t>M</w:t>
+            </w:r>
+          </w:p>
+        </w:tc>
+        <w:tc>
+          <w:tcPr>
+            <w:tcW w:w="2019" w:type="dxa"/>
+            <w:tcBorders>
+              <w:top w:val="single" w:sz="5" w:space="0" w:color="1F1F1F"/>
+              <w:left w:val="single" w:sz="5" w:space="0" w:color="1F1F1F"/>
+              <w:bottom w:val="single" w:sz="5" w:space="0" w:color="1F1F1F"/>
+              <w:right w:val="single" w:sz="5" w:space="0" w:color="1F1F1F"/>
+            </w:tcBorders>
+            <w:tcMar>
+              <w:top w:w="113" w:type="dxa"/>
+              <w:left w:w="113" w:type="dxa"/>
+              <w:bottom w:w="113" w:type="dxa"/>
+              <w:right w:w="113" w:type="dxa"/>
+            </w:tcMar>
+          </w:tcPr>
+          <w:p>
+            <w:pPr>
+              <w:spacing w:after="480" w:line="240" w:lineRule="auto"/>
+              <w:jc w:val="center"/>
+              <w:rPr>
+                <w:color w:val="1F1F1F"/>
+                <w:szCs w:val="24"/>
+              </w:rPr>
+            </w:pPr>
+            <w:r>
+              <w:rPr>
+                <w:color w:val="1F1F1F"/>
+                <w:szCs w:val="24"/>
+              </w:rPr>
+              <w:t>Finalizada</w:t>
+            </w:r>
+          </w:p>
+        </w:tc>
+      </w:tr>
+      <w:tr>
+        <w:trPr>
+          <w:trHeight w:val="726"/>
+        </w:trPr>
+        <w:tc>
+          <w:tcPr>
+            <w:tcW w:w="5187" w:type="dxa"/>
+            <w:tcBorders>
+              <w:top w:val="single" w:sz="5" w:space="0" w:color="1F1F1F"/>
+              <w:left w:val="single" w:sz="5" w:space="0" w:color="1F1F1F"/>
+              <w:bottom w:val="single" w:sz="5" w:space="0" w:color="1F1F1F"/>
+              <w:right w:val="single" w:sz="5" w:space="0" w:color="1F1F1F"/>
+            </w:tcBorders>
+            <w:tcMar>
+              <w:top w:w="113" w:type="dxa"/>
+              <w:left w:w="113" w:type="dxa"/>
+              <w:bottom w:w="113" w:type="dxa"/>
+              <w:right w:w="113" w:type="dxa"/>
+            </w:tcMar>
+          </w:tcPr>
+          <w:p>
+            <w:pPr>
+              <w:spacing w:after="480" w:line="240" w:lineRule="auto"/>
+              <w:rPr>
+                <w:color w:val="1F1F1F"/>
+                <w:szCs w:val="24"/>
+              </w:rPr>
+            </w:pPr>
+            <w:r>
+              <w:rPr>
+                <w:b/>
+                <w:bCs/>
+                <w:color w:val="1F1F1F"/>
+                <w:szCs w:val="24"/>
+              </w:rPr>
+              <w:t xml:space="preserve">HU-07: </w:t>
+            </w:r>
+            <w:r>
+              <w:rPr>
+                <w:color w:val="1F1F1F"/>
+                <w:szCs w:val="24"/>
+              </w:rPr>
+              <w:t>Registro preclínico</w:t>
+            </w:r>
+          </w:p>
+        </w:tc>
+        <w:tc>
+          <w:tcPr>
+            <w:tcW w:w="2020" w:type="dxa"/>
+            <w:tcBorders>
+              <w:top w:val="single" w:sz="5" w:space="0" w:color="1F1F1F"/>
+              <w:left w:val="single" w:sz="5" w:space="0" w:color="1F1F1F"/>
+              <w:bottom w:val="single" w:sz="5" w:space="0" w:color="1F1F1F"/>
+              <w:right w:val="single" w:sz="5" w:space="0" w:color="1F1F1F"/>
+            </w:tcBorders>
+            <w:tcMar>
+              <w:top w:w="113" w:type="dxa"/>
+              <w:left w:w="113" w:type="dxa"/>
+              <w:bottom w:w="113" w:type="dxa"/>
+              <w:right w:w="113" w:type="dxa"/>
+            </w:tcMar>
+          </w:tcPr>
+          <w:p>
+            <w:pPr>
+              <w:spacing w:after="480" w:line="240" w:lineRule="auto"/>
+              <w:jc w:val="center"/>
+              <w:rPr>
+                <w:color w:val="1F1F1F"/>
+                <w:szCs w:val="24"/>
+              </w:rPr>
+            </w:pPr>
+            <w:r>
+              <w:rPr>
+                <w:b/>
+                <w:bCs/>
+                <w:color w:val="1F1F1F"/>
+                <w:szCs w:val="24"/>
+              </w:rPr>
+              <w:t>M</w:t>
+            </w:r>
+          </w:p>
+        </w:tc>
+        <w:tc>
+          <w:tcPr>
+            <w:tcW w:w="2019" w:type="dxa"/>
+            <w:tcBorders>
+              <w:top w:val="single" w:sz="5" w:space="0" w:color="1F1F1F"/>
+              <w:left w:val="single" w:sz="5" w:space="0" w:color="1F1F1F"/>
+              <w:bottom w:val="single" w:sz="5" w:space="0" w:color="1F1F1F"/>
+              <w:right w:val="single" w:sz="5" w:space="0" w:color="1F1F1F"/>
+            </w:tcBorders>
+            <w:tcMar>
+              <w:top w:w="113" w:type="dxa"/>
+              <w:left w:w="113" w:type="dxa"/>
+              <w:bottom w:w="113" w:type="dxa"/>
+              <w:right w:w="113" w:type="dxa"/>
+            </w:tcMar>
+          </w:tcPr>
+          <w:p>
+            <w:pPr>
+              <w:spacing w:after="480" w:line="240" w:lineRule="auto"/>
+              <w:jc w:val="center"/>
+              <w:rPr>
+                <w:color w:val="1F1F1F"/>
+                <w:szCs w:val="24"/>
+              </w:rPr>
+            </w:pPr>
+            <w:r>
+              <w:rPr>
+                <w:color w:val="1F1F1F"/>
+                <w:szCs w:val="24"/>
+              </w:rPr>
+              <w:t xml:space="preserve">Finalizada </w:t>
+            </w:r>
+          </w:p>
+        </w:tc>
+      </w:tr>
+      <w:tr>
+        <w:trPr>
+          <w:trHeight w:val="726"/>
+        </w:trPr>
+        <w:tc>
+          <w:tcPr>
+            <w:tcW w:w="5187" w:type="dxa"/>
+            <w:tcBorders>
+              <w:top w:val="single" w:sz="5" w:space="0" w:color="1F1F1F"/>
+              <w:left w:val="single" w:sz="5" w:space="0" w:color="1F1F1F"/>
+              <w:bottom w:val="single" w:sz="5" w:space="0" w:color="1F1F1F"/>
+              <w:right w:val="single" w:sz="5" w:space="0" w:color="1F1F1F"/>
+            </w:tcBorders>
+            <w:tcMar>
+              <w:top w:w="113" w:type="dxa"/>
+              <w:left w:w="113" w:type="dxa"/>
+              <w:bottom w:w="113" w:type="dxa"/>
+              <w:right w:w="113" w:type="dxa"/>
+            </w:tcMar>
+          </w:tcPr>
+          <w:p>
+            <w:pPr>
+              <w:spacing w:after="480" w:line="240" w:lineRule="auto"/>
+              <w:rPr>
+                <w:color w:val="1F1F1F"/>
+                <w:szCs w:val="24"/>
+              </w:rPr>
+            </w:pPr>
+            <w:r>
+              <w:rPr>
+                <w:b/>
+                <w:bCs/>
+                <w:color w:val="1F1F1F"/>
+                <w:szCs w:val="24"/>
+              </w:rPr>
+              <w:t>HU-0</w:t>
+            </w:r>
+            <w:r>
+              <w:rPr>
+                <w:b/>
+                <w:bCs/>
+                <w:color w:val="1F1F1F"/>
+                <w:szCs w:val="24"/>
+              </w:rPr>
+              <w:t xml:space="preserve">8: </w:t>
+            </w:r>
+            <w:r>
+              <w:rPr>
+                <w:color w:val="1F1F1F"/>
+                <w:szCs w:val="24"/>
+              </w:rPr>
+              <w:t xml:space="preserve">registro de consulta médica </w:t>
+            </w:r>
+          </w:p>
+        </w:tc>
+        <w:tc>
+          <w:tcPr>
+            <w:tcW w:w="2020" w:type="dxa"/>
+            <w:tcBorders>
+              <w:top w:val="single" w:sz="5" w:space="0" w:color="1F1F1F"/>
+              <w:left w:val="single" w:sz="5" w:space="0" w:color="1F1F1F"/>
+              <w:bottom w:val="single" w:sz="5" w:space="0" w:color="1F1F1F"/>
+              <w:right w:val="single" w:sz="5" w:space="0" w:color="1F1F1F"/>
+            </w:tcBorders>
+            <w:tcMar>
+              <w:top w:w="113" w:type="dxa"/>
+              <w:left w:w="113" w:type="dxa"/>
+              <w:bottom w:w="113" w:type="dxa"/>
+              <w:right w:w="113" w:type="dxa"/>
+            </w:tcMar>
+          </w:tcPr>
+          <w:p>
+            <w:pPr>
+              <w:spacing w:after="480" w:line="240" w:lineRule="auto"/>
+              <w:jc w:val="center"/>
+              <w:rPr>
+                <w:color w:val="1F1F1F"/>
+                <w:szCs w:val="24"/>
+              </w:rPr>
+            </w:pPr>
+            <w:r>
+              <w:rPr>
+                <w:b/>
+                <w:bCs/>
+                <w:color w:val="1F1F1F"/>
+                <w:szCs w:val="24"/>
+              </w:rPr>
+              <w:t>M</w:t>
+            </w:r>
+          </w:p>
+        </w:tc>
+        <w:tc>
+          <w:tcPr>
+            <w:tcW w:w="2019" w:type="dxa"/>
+            <w:tcBorders>
+              <w:top w:val="single" w:sz="5" w:space="0" w:color="1F1F1F"/>
+              <w:left w:val="single" w:sz="5" w:space="0" w:color="1F1F1F"/>
+              <w:bottom w:val="single" w:sz="5" w:space="0" w:color="1F1F1F"/>
+              <w:right w:val="single" w:sz="5" w:space="0" w:color="1F1F1F"/>
+            </w:tcBorders>
+            <w:tcMar>
+              <w:top w:w="113" w:type="dxa"/>
+              <w:left w:w="113" w:type="dxa"/>
+              <w:bottom w:w="113" w:type="dxa"/>
+              <w:right w:w="113" w:type="dxa"/>
+            </w:tcMar>
+          </w:tcPr>
+          <w:p>
+            <w:pPr>
+              <w:spacing w:after="480" w:line="240" w:lineRule="auto"/>
+              <w:jc w:val="center"/>
+              <w:rPr>
+                <w:color w:val="1F1F1F"/>
+                <w:szCs w:val="24"/>
+              </w:rPr>
+            </w:pPr>
+            <w:r>
+              <w:rPr>
+                <w:color w:val="1F1F1F"/>
+                <w:szCs w:val="24"/>
+              </w:rPr>
+              <w:t>Finalizada</w:t>
+            </w:r>
+          </w:p>
+        </w:tc>
+      </w:tr>
+      <w:tr>
+        <w:trPr>
+          <w:trHeight w:val="726"/>
+        </w:trPr>
+        <w:tc>
+          <w:tcPr>
+            <w:tcW w:w="5187" w:type="dxa"/>
+            <w:tcBorders>
+              <w:top w:val="single" w:sz="5" w:space="0" w:color="1F1F1F"/>
+              <w:left w:val="single" w:sz="5" w:space="0" w:color="1F1F1F"/>
+              <w:bottom w:val="single" w:sz="5" w:space="0" w:color="1F1F1F"/>
+              <w:right w:val="single" w:sz="5" w:space="0" w:color="1F1F1F"/>
+            </w:tcBorders>
+            <w:tcMar>
+              <w:top w:w="113" w:type="dxa"/>
+              <w:left w:w="113" w:type="dxa"/>
+              <w:bottom w:w="113" w:type="dxa"/>
+              <w:right w:w="113" w:type="dxa"/>
+            </w:tcMar>
+          </w:tcPr>
+          <w:p>
+            <w:pPr>
+              <w:spacing w:after="480" w:line="240" w:lineRule="auto"/>
+              <w:rPr>
+                <w:color w:val="1F1F1F"/>
+                <w:szCs w:val="24"/>
+              </w:rPr>
+            </w:pPr>
+            <w:r>
+              <w:rPr>
+                <w:b/>
+                <w:bCs/>
+                <w:color w:val="1F1F1F"/>
+                <w:szCs w:val="24"/>
+              </w:rPr>
+              <w:t>HU-16</w:t>
+            </w:r>
+            <w:r>
+              <w:rPr>
+                <w:b/>
+                <w:bCs/>
+                <w:color w:val="1F1F1F"/>
+                <w:szCs w:val="24"/>
+              </w:rPr>
+              <w:t xml:space="preserve">: </w:t>
+            </w:r>
+            <w:r>
+              <w:rPr>
+                <w:color w:val="1F1F1F"/>
+                <w:szCs w:val="24"/>
+              </w:rPr>
+              <w:t>Cambio de contraseña</w:t>
+            </w:r>
+          </w:p>
+        </w:tc>
+        <w:tc>
+          <w:tcPr>
+            <w:tcW w:w="2020" w:type="dxa"/>
+            <w:tcBorders>
+              <w:top w:val="single" w:sz="5" w:space="0" w:color="1F1F1F"/>
+              <w:left w:val="single" w:sz="5" w:space="0" w:color="1F1F1F"/>
+              <w:bottom w:val="single" w:sz="5" w:space="0" w:color="1F1F1F"/>
+              <w:right w:val="single" w:sz="5" w:space="0" w:color="1F1F1F"/>
+            </w:tcBorders>
+            <w:tcMar>
+              <w:top w:w="113" w:type="dxa"/>
+              <w:left w:w="113" w:type="dxa"/>
+              <w:bottom w:w="113" w:type="dxa"/>
+              <w:right w:w="113" w:type="dxa"/>
+            </w:tcMar>
+          </w:tcPr>
+          <w:p>
+            <w:pPr>
+              <w:spacing w:after="480" w:line="240" w:lineRule="auto"/>
+              <w:jc w:val="center"/>
+              <w:rPr>
+                <w:b/>
+                <w:bCs/>
+                <w:color w:val="1F1F1F"/>
+                <w:szCs w:val="24"/>
+              </w:rPr>
+            </w:pPr>
+            <w:r>
+              <w:rPr>
+                <w:b/>
+                <w:bCs/>
+                <w:color w:val="1F1F1F"/>
+                <w:szCs w:val="24"/>
+              </w:rPr>
+              <w:t>M</w:t>
+            </w:r>
+          </w:p>
+        </w:tc>
+        <w:tc>
+          <w:tcPr>
+            <w:tcW w:w="2019" w:type="dxa"/>
+            <w:tcBorders>
+              <w:top w:val="single" w:sz="5" w:space="0" w:color="1F1F1F"/>
+              <w:left w:val="single" w:sz="5" w:space="0" w:color="1F1F1F"/>
+              <w:bottom w:val="single" w:sz="5" w:space="0" w:color="1F1F1F"/>
+              <w:right w:val="single" w:sz="5" w:space="0" w:color="1F1F1F"/>
+            </w:tcBorders>
+            <w:tcMar>
+              <w:top w:w="113" w:type="dxa"/>
+              <w:left w:w="113" w:type="dxa"/>
+              <w:bottom w:w="113" w:type="dxa"/>
+              <w:right w:w="113" w:type="dxa"/>
+            </w:tcMar>
+          </w:tcPr>
+          <w:p>
+            <w:pPr>
+              <w:spacing w:after="480" w:line="240" w:lineRule="auto"/>
+              <w:jc w:val="center"/>
+              <w:rPr>
+                <w:color w:val="1F1F1F"/>
+                <w:szCs w:val="24"/>
+              </w:rPr>
+            </w:pPr>
+            <w:r>
+              <w:rPr>
+                <w:color w:val="1F1F1F"/>
+                <w:szCs w:val="24"/>
+              </w:rPr>
+              <w:t>Finalizada</w:t>
+            </w:r>
+          </w:p>
+        </w:tc>
+      </w:tr>
+      <w:tr>
+        <w:trPr>
+          <w:trHeight w:val="726"/>
+        </w:trPr>
+        <w:tc>
+          <w:tcPr>
+            <w:tcW w:w="5187" w:type="dxa"/>
+            <w:tcBorders>
+              <w:top w:val="single" w:sz="5" w:space="0" w:color="1F1F1F"/>
+              <w:left w:val="single" w:sz="5" w:space="0" w:color="1F1F1F"/>
+              <w:bottom w:val="single" w:sz="5" w:space="0" w:color="1F1F1F"/>
+              <w:right w:val="single" w:sz="5" w:space="0" w:color="1F1F1F"/>
+            </w:tcBorders>
+            <w:tcMar>
+              <w:top w:w="113" w:type="dxa"/>
+              <w:left w:w="113" w:type="dxa"/>
+              <w:bottom w:w="113" w:type="dxa"/>
+              <w:right w:w="113" w:type="dxa"/>
+            </w:tcMar>
+          </w:tcPr>
+          <w:p>
+            <w:pPr>
+              <w:spacing w:after="480" w:line="240" w:lineRule="auto"/>
+              <w:rPr>
+                <w:color w:val="1F1F1F"/>
+                <w:szCs w:val="24"/>
+              </w:rPr>
+            </w:pPr>
+            <w:r>
+              <w:rPr>
+                <w:b/>
+                <w:bCs/>
+                <w:color w:val="1F1F1F"/>
+                <w:szCs w:val="24"/>
+              </w:rPr>
+              <w:t xml:space="preserve">TT-06: </w:t>
+            </w:r>
+            <w:r>
+              <w:rPr>
+                <w:color w:val="1F1F1F"/>
+                <w:szCs w:val="24"/>
+              </w:rPr>
+              <w:t>Migrar manejo de roles y permisos a la base de datos</w:t>
+            </w:r>
+          </w:p>
+        </w:tc>
+        <w:tc>
+          <w:tcPr>
+            <w:tcW w:w="2020" w:type="dxa"/>
+            <w:tcBorders>
+              <w:top w:val="single" w:sz="5" w:space="0" w:color="1F1F1F"/>
+              <w:left w:val="single" w:sz="5" w:space="0" w:color="1F1F1F"/>
+              <w:bottom w:val="single" w:sz="5" w:space="0" w:color="1F1F1F"/>
+              <w:right w:val="single" w:sz="5" w:space="0" w:color="1F1F1F"/>
+            </w:tcBorders>
+            <w:tcMar>
+              <w:top w:w="113" w:type="dxa"/>
+              <w:left w:w="113" w:type="dxa"/>
+              <w:bottom w:w="113" w:type="dxa"/>
+              <w:right w:w="113" w:type="dxa"/>
+            </w:tcMar>
+          </w:tcPr>
+          <w:p>
+            <w:pPr>
+              <w:spacing w:after="480" w:line="240" w:lineRule="auto"/>
+              <w:jc w:val="center"/>
+              <w:rPr>
+                <w:b/>
+                <w:bCs/>
+                <w:color w:val="1F1F1F"/>
+                <w:szCs w:val="24"/>
+              </w:rPr>
+            </w:pPr>
+            <w:r>
+              <w:rPr>
+                <w:b/>
+                <w:bCs/>
+                <w:color w:val="1F1F1F"/>
+                <w:szCs w:val="24"/>
+              </w:rPr>
+              <w:t>L</w:t>
+            </w:r>
+          </w:p>
+        </w:tc>
+        <w:tc>
+          <w:tcPr>
+            <w:tcW w:w="2019" w:type="dxa"/>
+            <w:tcBorders>
+              <w:top w:val="single" w:sz="5" w:space="0" w:color="1F1F1F"/>
+              <w:left w:val="single" w:sz="5" w:space="0" w:color="1F1F1F"/>
+              <w:bottom w:val="single" w:sz="5" w:space="0" w:color="1F1F1F"/>
+              <w:right w:val="single" w:sz="5" w:space="0" w:color="1F1F1F"/>
+            </w:tcBorders>
+            <w:tcMar>
+              <w:top w:w="113" w:type="dxa"/>
+              <w:left w:w="113" w:type="dxa"/>
+              <w:bottom w:w="113" w:type="dxa"/>
+              <w:right w:w="113" w:type="dxa"/>
+            </w:tcMar>
+          </w:tcPr>
+          <w:p>
+            <w:pPr>
+              <w:spacing w:after="480" w:line="240" w:lineRule="auto"/>
+              <w:jc w:val="center"/>
+              <w:rPr>
+                <w:color w:val="1F1F1F"/>
+                <w:szCs w:val="24"/>
+              </w:rPr>
+            </w:pPr>
+            <w:r>
+              <w:rPr>
+                <w:color w:val="1F1F1F"/>
+                <w:szCs w:val="24"/>
+              </w:rPr>
+              <w:t>Finalizada</w:t>
+            </w:r>
+          </w:p>
+        </w:tc>
+      </w:tr>
+      <w:tr>
+        <w:trPr>
+          <w:trHeight w:val="726"/>
+        </w:trPr>
+        <w:tc>
+          <w:tcPr>
+            <w:tcW w:w="5187" w:type="dxa"/>
+            <w:tcBorders>
+              <w:top w:val="single" w:sz="5" w:space="0" w:color="1F1F1F"/>
+              <w:left w:val="single" w:sz="5" w:space="0" w:color="1F1F1F"/>
+              <w:bottom w:val="single" w:sz="5" w:space="0" w:color="1F1F1F"/>
+              <w:right w:val="single" w:sz="5" w:space="0" w:color="1F1F1F"/>
+            </w:tcBorders>
+            <w:tcMar>
+              <w:top w:w="113" w:type="dxa"/>
+              <w:left w:w="113" w:type="dxa"/>
+              <w:bottom w:w="113" w:type="dxa"/>
+              <w:right w:w="113" w:type="dxa"/>
+            </w:tcMar>
+          </w:tcPr>
+          <w:p>
+            <w:pPr>
+              <w:spacing w:after="480" w:line="240" w:lineRule="auto"/>
+              <w:rPr>
+                <w:color w:val="1F1F1F"/>
+                <w:szCs w:val="24"/>
+              </w:rPr>
+            </w:pPr>
+            <w:r>
+              <w:rPr>
+                <w:b/>
+                <w:bCs/>
+                <w:color w:val="1F1F1F"/>
+                <w:szCs w:val="24"/>
+              </w:rPr>
+              <w:t xml:space="preserve">TT-07: </w:t>
+            </w:r>
+            <w:r>
+              <w:rPr>
+                <w:color w:val="1F1F1F"/>
+                <w:szCs w:val="24"/>
+              </w:rPr>
+              <w:t xml:space="preserve">Configuración de pipeline de CI con </w:t>
+            </w:r>
+            <w:proofErr w:type="spellStart"/>
+            <w:r>
+              <w:rPr>
+                <w:color w:val="1F1F1F"/>
+                <w:szCs w:val="24"/>
+              </w:rPr>
+              <w:t>Github</w:t>
+            </w:r>
+            <w:proofErr w:type="spellEnd"/>
+            <w:r>
+              <w:rPr>
+                <w:color w:val="1F1F1F"/>
+                <w:szCs w:val="24"/>
+              </w:rPr>
+              <w:t xml:space="preserve"> </w:t>
+            </w:r>
+            <w:proofErr w:type="spellStart"/>
+            <w:r>
+              <w:rPr>
+                <w:color w:val="1F1F1F"/>
+                <w:szCs w:val="24"/>
+              </w:rPr>
+              <w:t>Actions</w:t>
+            </w:r>
+            <w:proofErr w:type="spellEnd"/>
+          </w:p>
+        </w:tc>
+        <w:tc>
+          <w:tcPr>
+            <w:tcW w:w="2020" w:type="dxa"/>
+            <w:tcBorders>
+              <w:top w:val="single" w:sz="5" w:space="0" w:color="1F1F1F"/>
+              <w:left w:val="single" w:sz="5" w:space="0" w:color="1F1F1F"/>
+              <w:bottom w:val="single" w:sz="5" w:space="0" w:color="1F1F1F"/>
+              <w:right w:val="single" w:sz="5" w:space="0" w:color="1F1F1F"/>
+            </w:tcBorders>
+            <w:tcMar>
+              <w:top w:w="113" w:type="dxa"/>
+              <w:left w:w="113" w:type="dxa"/>
+              <w:bottom w:w="113" w:type="dxa"/>
+              <w:right w:w="113" w:type="dxa"/>
+            </w:tcMar>
+          </w:tcPr>
+          <w:p>
+            <w:pPr>
+              <w:spacing w:after="480" w:line="240" w:lineRule="auto"/>
+              <w:jc w:val="center"/>
+              <w:rPr>
+                <w:b/>
+                <w:bCs/>
+                <w:color w:val="1F1F1F"/>
+                <w:szCs w:val="24"/>
+              </w:rPr>
+            </w:pPr>
+            <w:r>
+              <w:rPr>
+                <w:b/>
+                <w:bCs/>
+                <w:color w:val="1F1F1F"/>
+                <w:szCs w:val="24"/>
+              </w:rPr>
+              <w:t>L</w:t>
+            </w:r>
+          </w:p>
+        </w:tc>
+        <w:tc>
+          <w:tcPr>
+            <w:tcW w:w="2019" w:type="dxa"/>
+            <w:tcBorders>
+              <w:top w:val="single" w:sz="5" w:space="0" w:color="1F1F1F"/>
+              <w:left w:val="single" w:sz="5" w:space="0" w:color="1F1F1F"/>
+              <w:bottom w:val="single" w:sz="5" w:space="0" w:color="1F1F1F"/>
+              <w:right w:val="single" w:sz="5" w:space="0" w:color="1F1F1F"/>
+            </w:tcBorders>
+            <w:tcMar>
+              <w:top w:w="113" w:type="dxa"/>
+              <w:left w:w="113" w:type="dxa"/>
+              <w:bottom w:w="113" w:type="dxa"/>
+              <w:right w:w="113" w:type="dxa"/>
+            </w:tcMar>
+          </w:tcPr>
+          <w:p>
+            <w:pPr>
+              <w:spacing w:after="480" w:line="240" w:lineRule="auto"/>
+              <w:jc w:val="center"/>
+              <w:rPr>
+                <w:color w:val="1F1F1F"/>
+                <w:szCs w:val="24"/>
+              </w:rPr>
+            </w:pPr>
+            <w:r>
+              <w:rPr>
+                <w:color w:val="1F1F1F"/>
+                <w:szCs w:val="24"/>
+              </w:rPr>
+              <w:t>Finalizada</w:t>
+            </w:r>
+          </w:p>
+        </w:tc>
+      </w:tr>
+      <w:tr>
+        <w:trPr>
+          <w:trHeight w:val="726"/>
+        </w:trPr>
+        <w:tc>
+          <w:tcPr>
+            <w:tcW w:w="5187" w:type="dxa"/>
+            <w:tcBorders>
+              <w:top w:val="single" w:sz="5" w:space="0" w:color="1F1F1F"/>
+              <w:left w:val="single" w:sz="5" w:space="0" w:color="1F1F1F"/>
+              <w:bottom w:val="single" w:sz="5" w:space="0" w:color="1F1F1F"/>
+              <w:right w:val="single" w:sz="5" w:space="0" w:color="1F1F1F"/>
+            </w:tcBorders>
+            <w:tcMar>
+              <w:top w:w="113" w:type="dxa"/>
+              <w:left w:w="113" w:type="dxa"/>
+              <w:bottom w:w="113" w:type="dxa"/>
+              <w:right w:w="113" w:type="dxa"/>
+            </w:tcMar>
+          </w:tcPr>
+          <w:p>
+            <w:pPr>
+              <w:spacing w:after="480" w:line="240" w:lineRule="auto"/>
+              <w:rPr>
+                <w:color w:val="1F1F1F"/>
+                <w:szCs w:val="24"/>
+              </w:rPr>
+            </w:pPr>
+            <w:r>
+              <w:rPr>
+                <w:b/>
+                <w:bCs/>
+                <w:color w:val="1F1F1F"/>
+                <w:szCs w:val="24"/>
+              </w:rPr>
+              <w:t xml:space="preserve">TT-08: </w:t>
+            </w:r>
+            <w:r>
+              <w:rPr>
+                <w:color w:val="1F1F1F"/>
+                <w:szCs w:val="24"/>
+              </w:rPr>
+              <w:t xml:space="preserve">Implementar manejo de errores en los controladores </w:t>
+            </w:r>
+          </w:p>
+        </w:tc>
+        <w:tc>
+          <w:tcPr>
+            <w:tcW w:w="2020" w:type="dxa"/>
+            <w:tcBorders>
+              <w:top w:val="single" w:sz="5" w:space="0" w:color="1F1F1F"/>
+              <w:left w:val="single" w:sz="5" w:space="0" w:color="1F1F1F"/>
+              <w:bottom w:val="single" w:sz="5" w:space="0" w:color="1F1F1F"/>
+              <w:right w:val="single" w:sz="5" w:space="0" w:color="1F1F1F"/>
+            </w:tcBorders>
+            <w:tcMar>
+              <w:top w:w="113" w:type="dxa"/>
+              <w:left w:w="113" w:type="dxa"/>
+              <w:bottom w:w="113" w:type="dxa"/>
+              <w:right w:w="113" w:type="dxa"/>
+            </w:tcMar>
+          </w:tcPr>
+          <w:p>
+            <w:pPr>
+              <w:spacing w:after="480" w:line="240" w:lineRule="auto"/>
+              <w:jc w:val="center"/>
+              <w:rPr>
+                <w:b/>
+                <w:bCs/>
+                <w:color w:val="1F1F1F"/>
+                <w:szCs w:val="24"/>
+              </w:rPr>
+            </w:pPr>
+            <w:r>
+              <w:rPr>
+                <w:b/>
+                <w:bCs/>
+                <w:color w:val="1F1F1F"/>
+                <w:szCs w:val="24"/>
+              </w:rPr>
+              <w:t>M</w:t>
+            </w:r>
+          </w:p>
+        </w:tc>
+        <w:tc>
+          <w:tcPr>
+            <w:tcW w:w="2019" w:type="dxa"/>
+            <w:tcBorders>
+              <w:top w:val="single" w:sz="5" w:space="0" w:color="1F1F1F"/>
+              <w:left w:val="single" w:sz="5" w:space="0" w:color="1F1F1F"/>
+              <w:bottom w:val="single" w:sz="5" w:space="0" w:color="1F1F1F"/>
+              <w:right w:val="single" w:sz="5" w:space="0" w:color="1F1F1F"/>
+            </w:tcBorders>
+            <w:tcMar>
+              <w:top w:w="113" w:type="dxa"/>
+              <w:left w:w="113" w:type="dxa"/>
+              <w:bottom w:w="113" w:type="dxa"/>
+              <w:right w:w="113" w:type="dxa"/>
+            </w:tcMar>
+          </w:tcPr>
+          <w:p>
+            <w:pPr>
+              <w:spacing w:after="480" w:line="240" w:lineRule="auto"/>
+              <w:jc w:val="center"/>
+              <w:rPr>
+                <w:color w:val="1F1F1F"/>
+                <w:szCs w:val="24"/>
+              </w:rPr>
+            </w:pPr>
+            <w:r>
+              <w:rPr>
+                <w:color w:val="1F1F1F"/>
+                <w:szCs w:val="24"/>
+              </w:rPr>
+              <w:t>Finalizada</w:t>
+            </w:r>
+          </w:p>
+        </w:tc>
+      </w:tr>
+      <w:tr>
+        <w:trPr>
+          <w:trHeight w:val="726"/>
+        </w:trPr>
+        <w:tc>
+          <w:tcPr>
+            <w:tcW w:w="5187" w:type="dxa"/>
+            <w:tcBorders>
+              <w:top w:val="single" w:sz="5" w:space="0" w:color="1F1F1F"/>
+              <w:left w:val="single" w:sz="5" w:space="0" w:color="1F1F1F"/>
+              <w:bottom w:val="single" w:sz="5" w:space="0" w:color="1F1F1F"/>
+              <w:right w:val="single" w:sz="5" w:space="0" w:color="1F1F1F"/>
+            </w:tcBorders>
+            <w:tcMar>
+              <w:top w:w="113" w:type="dxa"/>
+              <w:left w:w="113" w:type="dxa"/>
+              <w:bottom w:w="113" w:type="dxa"/>
+              <w:right w:w="113" w:type="dxa"/>
+            </w:tcMar>
+          </w:tcPr>
+          <w:p>
+            <w:pPr>
+              <w:spacing w:after="480" w:line="240" w:lineRule="auto"/>
+              <w:rPr>
+                <w:color w:val="1F1F1F"/>
+                <w:szCs w:val="24"/>
+              </w:rPr>
+            </w:pPr>
+            <w:r>
+              <w:rPr>
+                <w:b/>
+                <w:bCs/>
+                <w:color w:val="1F1F1F"/>
+                <w:szCs w:val="24"/>
+              </w:rPr>
+              <w:t xml:space="preserve">TT-10: </w:t>
+            </w:r>
+            <w:proofErr w:type="spellStart"/>
+            <w:r>
+              <w:rPr>
+                <w:rFonts w:eastAsia="Times New Roman" w:cs="Times New Roman"/>
+                <w:szCs w:val="24"/>
+              </w:rPr>
+              <w:t>Componentizar</w:t>
+            </w:r>
+            <w:proofErr w:type="spellEnd"/>
+            <w:r>
+              <w:rPr>
+                <w:rFonts w:eastAsia="Times New Roman" w:cs="Times New Roman"/>
+                <w:szCs w:val="24"/>
+              </w:rPr>
+              <w:t xml:space="preserve"> formularios del </w:t>
+            </w:r>
+            <w:proofErr w:type="spellStart"/>
+            <w:r>
+              <w:rPr>
+                <w:rFonts w:eastAsia="Times New Roman" w:cs="Times New Roman"/>
+                <w:szCs w:val="24"/>
+              </w:rPr>
+              <w:t>frontend</w:t>
+            </w:r>
+            <w:proofErr w:type="spellEnd"/>
+            <w:r>
+              <w:rPr>
+                <w:rFonts w:eastAsia="Times New Roman" w:cs="Times New Roman"/>
+                <w:szCs w:val="24"/>
+              </w:rPr>
+              <w:t xml:space="preserve"> y mostrar vistas según rol</w:t>
+            </w:r>
+          </w:p>
+        </w:tc>
+        <w:tc>
+          <w:tcPr>
+            <w:tcW w:w="2020" w:type="dxa"/>
+            <w:tcBorders>
+              <w:top w:val="single" w:sz="5" w:space="0" w:color="1F1F1F"/>
+              <w:left w:val="single" w:sz="5" w:space="0" w:color="1F1F1F"/>
+              <w:bottom w:val="single" w:sz="5" w:space="0" w:color="1F1F1F"/>
+              <w:right w:val="single" w:sz="5" w:space="0" w:color="1F1F1F"/>
+            </w:tcBorders>
+            <w:tcMar>
+              <w:top w:w="113" w:type="dxa"/>
+              <w:left w:w="113" w:type="dxa"/>
+              <w:bottom w:w="113" w:type="dxa"/>
+              <w:right w:w="113" w:type="dxa"/>
+            </w:tcMar>
+          </w:tcPr>
+          <w:p>
+            <w:pPr>
+              <w:spacing w:after="480" w:line="240" w:lineRule="auto"/>
+              <w:jc w:val="center"/>
+              <w:rPr>
+                <w:b/>
+                <w:bCs/>
+                <w:color w:val="1F1F1F"/>
+                <w:szCs w:val="24"/>
+              </w:rPr>
+            </w:pPr>
+            <w:r>
+              <w:rPr>
+                <w:b/>
+                <w:bCs/>
+                <w:color w:val="1F1F1F"/>
+                <w:szCs w:val="24"/>
+              </w:rPr>
+              <w:t>L</w:t>
+            </w:r>
+          </w:p>
+        </w:tc>
+        <w:tc>
+          <w:tcPr>
+            <w:tcW w:w="2019" w:type="dxa"/>
+            <w:tcBorders>
+              <w:top w:val="single" w:sz="5" w:space="0" w:color="1F1F1F"/>
+              <w:left w:val="single" w:sz="5" w:space="0" w:color="1F1F1F"/>
+              <w:bottom w:val="single" w:sz="5" w:space="0" w:color="1F1F1F"/>
+              <w:right w:val="single" w:sz="5" w:space="0" w:color="1F1F1F"/>
+            </w:tcBorders>
+            <w:tcMar>
+              <w:top w:w="113" w:type="dxa"/>
+              <w:left w:w="113" w:type="dxa"/>
+              <w:bottom w:w="113" w:type="dxa"/>
+              <w:right w:w="113" w:type="dxa"/>
+            </w:tcMar>
+          </w:tcPr>
+          <w:p>
+            <w:pPr>
+              <w:spacing w:after="480" w:line="240" w:lineRule="auto"/>
+              <w:jc w:val="center"/>
+              <w:rPr>
+                <w:color w:val="1F1F1F"/>
+                <w:szCs w:val="24"/>
+              </w:rPr>
+            </w:pPr>
+            <w:r>
+              <w:rPr>
+                <w:color w:val="1F1F1F"/>
+                <w:szCs w:val="24"/>
+              </w:rPr>
+              <w:t>Finalizada</w:t>
+            </w:r>
+          </w:p>
+        </w:tc>
+      </w:tr>
+    </w:tbl>
+    <w:p/>
+    <w:p>
+      <w:pPr>
+        <w:rPr>
+          <w:i/>
+          <w:iCs/>
+        </w:rPr>
+      </w:pPr>
+      <w:r>
+        <w:rPr>
+          <w:i/>
+          <w:iCs/>
+        </w:rPr>
+        <w:t xml:space="preserve">Nota: Como se observa, se incluyeron las tareas técnicas, ya que también representan el esfuerzo del equipo. </w:t>
+      </w:r>
+    </w:p>
+    <w:p/>
+    <w:p>
+      <w:pPr>
+        <w:pStyle w:val="Ttulo3"/>
+      </w:pPr>
+      <w:bookmarkStart w:id="17" w:name="_Toc224125962"/>
+      <w:bookmarkStart w:id="18" w:name="_Toc225170502"/>
+      <w:r>
+        <w:t>Cálculo de velocidad</w:t>
+      </w:r>
+      <w:bookmarkEnd w:id="17"/>
+      <w:bookmarkEnd w:id="18"/>
+    </w:p>
+    <w:p>
+      <w:r>
+        <w:t xml:space="preserve">En retrospectiva al sprint anterior, en este sprint si es posible calcular la velocidad del equipo de acuerdo a la moda, es decir, la talla de camiseta que más se repite en los pesos de las tareas. </w:t>
+      </w:r>
+      <w:r>
+        <w:br/>
+      </w:r>
+      <w:r>
+        <w:lastRenderedPageBreak/>
+        <w:t xml:space="preserve">Las tallas utilizadas en las tareas, han sido M y L; calculando estadísticamente que </w:t>
+      </w:r>
+      <w:r>
+        <w:rPr>
+          <w:b/>
+          <w:bCs/>
+        </w:rPr>
+        <w:t>la moda es: M</w:t>
+      </w:r>
+      <w:r>
+        <w:t xml:space="preserve">, ya que se repite con mayor frecuencia en el conjunto de tareas del segundo sprint, repitiéndose 6 veces.  </w:t>
+      </w:r>
+    </w:p>
+    <w:p>
+      <w:r>
+        <w:t xml:space="preserve">Si hacemos la comparación con el sprint anterior, podemos concluir, que hasta ahorita se mantiene la velocidad del equipo realizando tareas de </w:t>
+      </w:r>
+      <w:r>
+        <w:rPr>
+          <w:b/>
+          <w:bCs/>
+        </w:rPr>
+        <w:t>complejidad media</w:t>
+      </w:r>
+      <w:r>
+        <w:t>.</w:t>
+      </w:r>
+    </w:p>
+    <w:p/>
+    <w:p/>
+    <w:p>
+      <w:pPr>
+        <w:pStyle w:val="Ttulo3"/>
+      </w:pPr>
+      <w:bookmarkStart w:id="19" w:name="_Toc225170503"/>
+      <w:r>
+        <w:t>Retrospectiva de la Dinámica del Equipo</w:t>
+      </w:r>
+      <w:bookmarkEnd w:id="19"/>
+    </w:p>
+    <w:p>
+      <w:pPr>
+        <w:rPr>
+          <w:b/>
+          <w:bCs/>
+        </w:rPr>
+      </w:pPr>
+      <w:r>
+        <w:rPr>
+          <w:b/>
+          <w:bCs/>
+        </w:rPr>
+        <w:t>¿Qué salió bien?</w:t>
+      </w:r>
+    </w:p>
+    <w:p>
+      <w:pPr>
+        <w:pStyle w:val="Prrafodelista"/>
+        <w:numPr>
+          <w:ilvl w:val="0"/>
+          <w:numId w:val="6"/>
+        </w:numPr>
+        <w:rPr>
+          <w:b/>
+          <w:bCs/>
+        </w:rPr>
+      </w:pPr>
+      <w:r>
+        <w:t xml:space="preserve">Se describieron mejor las tareas técnicas en el tablero, considerando la motivación/contexto y los criterios de aceptación. </w:t>
+      </w:r>
+    </w:p>
+    <w:p>
+      <w:pPr>
+        <w:pStyle w:val="Prrafodelista"/>
+        <w:numPr>
+          <w:ilvl w:val="0"/>
+          <w:numId w:val="6"/>
+        </w:numPr>
+        <w:rPr>
+          <w:b/>
+          <w:bCs/>
+        </w:rPr>
+      </w:pPr>
+      <w:r>
+        <w:t>Mejoro la comunicación en el equipo y la nomenclatura de las ramas en el repositorio, por funcionalidad (</w:t>
+      </w:r>
+      <w:proofErr w:type="spellStart"/>
+      <w:r>
+        <w:t>feature</w:t>
+      </w:r>
+      <w:proofErr w:type="spellEnd"/>
+      <w:r>
+        <w:t xml:space="preserve">). </w:t>
+      </w:r>
+    </w:p>
+    <w:p>
+      <w:pPr>
+        <w:pStyle w:val="Prrafodelista"/>
+        <w:numPr>
+          <w:ilvl w:val="0"/>
+          <w:numId w:val="6"/>
+        </w:numPr>
+        <w:rPr>
+          <w:b/>
+          <w:bCs/>
+        </w:rPr>
+      </w:pPr>
+      <w:r>
+        <w:t xml:space="preserve">Se realizó en general un buen incremento del producto. </w:t>
+      </w:r>
+    </w:p>
+    <w:p>
+      <w:pPr>
+        <w:rPr>
+          <w:b/>
+          <w:bCs/>
+        </w:rPr>
+      </w:pPr>
+    </w:p>
+    <w:p>
+      <w:pPr>
+        <w:rPr>
+          <w:b/>
+          <w:bCs/>
+        </w:rPr>
+      </w:pPr>
+      <w:r>
+        <w:rPr>
+          <w:b/>
+          <w:bCs/>
+        </w:rPr>
+        <w:t>¿Qué no salió bien?</w:t>
+      </w:r>
+    </w:p>
+    <w:p>
+      <w:pPr>
+        <w:pStyle w:val="Prrafodelista"/>
+        <w:numPr>
+          <w:ilvl w:val="0"/>
+          <w:numId w:val="7"/>
+        </w:numPr>
+        <w:rPr>
+          <w:b/>
+          <w:bCs/>
+        </w:rPr>
+      </w:pPr>
+      <w:r>
+        <w:t xml:space="preserve">Retrasos y conflictos con la integración de las pruebas unitarias tanto de </w:t>
+      </w:r>
+      <w:proofErr w:type="spellStart"/>
+      <w:r>
+        <w:t>frontend</w:t>
+      </w:r>
+      <w:proofErr w:type="spellEnd"/>
+      <w:r>
+        <w:t xml:space="preserve"> como de </w:t>
+      </w:r>
+      <w:proofErr w:type="spellStart"/>
+      <w:r>
+        <w:t>backend</w:t>
+      </w:r>
+      <w:proofErr w:type="spellEnd"/>
+      <w:r>
+        <w:t xml:space="preserve">. Lo que representó demora para poder pasar las tareas a done. </w:t>
+      </w:r>
+    </w:p>
+    <w:p>
+      <w:pPr>
+        <w:rPr>
+          <w:b/>
+          <w:bCs/>
+        </w:rPr>
+      </w:pPr>
+    </w:p>
+    <w:p>
+      <w:pPr>
+        <w:rPr>
+          <w:b/>
+          <w:bCs/>
+        </w:rPr>
+      </w:pPr>
+      <w:r>
+        <w:rPr>
+          <w:b/>
+          <w:bCs/>
+        </w:rPr>
+        <w:t>¿Qué podemos mejorar?</w:t>
+      </w:r>
+    </w:p>
+    <w:p>
+      <w:pPr>
+        <w:pStyle w:val="Prrafodelista"/>
+        <w:numPr>
+          <w:ilvl w:val="0"/>
+          <w:numId w:val="7"/>
+        </w:numPr>
+        <w:rPr>
+          <w:b/>
+          <w:bCs/>
+        </w:rPr>
+      </w:pPr>
+      <w:r>
+        <w:t xml:space="preserve">Asociar las ramas o los </w:t>
+      </w:r>
+      <w:proofErr w:type="spellStart"/>
+      <w:r>
+        <w:t>pull</w:t>
+      </w:r>
+      <w:proofErr w:type="spellEnd"/>
+      <w:r>
+        <w:t xml:space="preserve"> </w:t>
+      </w:r>
+      <w:proofErr w:type="spellStart"/>
+      <w:r>
+        <w:t>request</w:t>
+      </w:r>
+      <w:proofErr w:type="spellEnd"/>
+      <w:r>
+        <w:t xml:space="preserve"> con cada </w:t>
+      </w:r>
+      <w:proofErr w:type="spellStart"/>
+      <w:r>
+        <w:t>issue</w:t>
+      </w:r>
+      <w:proofErr w:type="spellEnd"/>
+      <w:r>
+        <w:t xml:space="preserve"> que represente la HU.</w:t>
+      </w:r>
+    </w:p>
+    <w:p>
+      <w:pPr>
+        <w:rPr>
+          <w:b/>
+          <w:bCs/>
+        </w:rPr>
+      </w:pPr>
+    </w:p>
+    <w:p>
+      <w:pPr>
+        <w:pStyle w:val="Ttulo3"/>
+      </w:pPr>
+      <w:bookmarkStart w:id="20" w:name="_Toc225170504"/>
+      <w:r>
+        <w:t>Metas del próximo Sprint</w:t>
+      </w:r>
+      <w:bookmarkEnd w:id="20"/>
+    </w:p>
+    <w:p>
+      <w:r>
+        <w:t xml:space="preserve">Finalizar </w:t>
+      </w:r>
+      <w:r>
+        <w:t xml:space="preserve">la parte de gestión de usuarios, gestión de expedientes y su historial. Así mismo la trazabilidad del expediente para los distintos roles que tienen acceso a él. </w:t>
+      </w:r>
+    </w:p>
+    <w:p/>
+    <w:p/>
+    <w:p>
+      <w:pPr>
+        <w:rPr>
+          <w:i/>
+          <w:iCs/>
+        </w:rPr>
+      </w:pPr>
+      <w:r>
+        <w:rPr>
+          <w:i/>
+          <w:iCs/>
+        </w:rPr>
+        <w:t xml:space="preserve"> </w:t>
       </w:r>
     </w:p>
     <w:sectPr>
@@ -3209,6 +6478,232 @@
     </w:lvl>
   </w:abstractNum>
   <w:abstractNum w:abstractNumId="1" w15:restartNumberingAfterBreak="0">
+    <w:nsid w:val="34196877"/>
+    <w:multiLevelType w:val="hybridMultilevel"/>
+    <w:tmpl w:val="D04EC110"/>
+    <w:lvl w:ilvl="0" w:tplc="480A0001">
+      <w:start w:val="1"/>
+      <w:numFmt w:val="bullet"/>
+      <w:lvlText w:val=""/>
+      <w:lvlJc w:val="left"/>
+      <w:pPr>
+        <w:ind w:left="720" w:hanging="360"/>
+      </w:pPr>
+      <w:rPr>
+        <w:rFonts w:ascii="Symbol" w:hAnsi="Symbol" w:hint="default"/>
+      </w:rPr>
+    </w:lvl>
+    <w:lvl w:ilvl="1" w:tplc="480A0003" w:tentative="1">
+      <w:start w:val="1"/>
+      <w:numFmt w:val="bullet"/>
+      <w:lvlText w:val="o"/>
+      <w:lvlJc w:val="left"/>
+      <w:pPr>
+        <w:ind w:left="1440" w:hanging="360"/>
+      </w:pPr>
+      <w:rPr>
+        <w:rFonts w:ascii="Courier New" w:hAnsi="Courier New" w:cs="Courier New" w:hint="default"/>
+      </w:rPr>
+    </w:lvl>
+    <w:lvl w:ilvl="2" w:tplc="480A0005" w:tentative="1">
+      <w:start w:val="1"/>
+      <w:numFmt w:val="bullet"/>
+      <w:lvlText w:val=""/>
+      <w:lvlJc w:val="left"/>
+      <w:pPr>
+        <w:ind w:left="2160" w:hanging="360"/>
+      </w:pPr>
+      <w:rPr>
+        <w:rFonts w:ascii="Wingdings" w:hAnsi="Wingdings" w:hint="default"/>
+      </w:rPr>
+    </w:lvl>
+    <w:lvl w:ilvl="3" w:tplc="480A0001" w:tentative="1">
+      <w:start w:val="1"/>
+      <w:numFmt w:val="bullet"/>
+      <w:lvlText w:val=""/>
+      <w:lvlJc w:val="left"/>
+      <w:pPr>
+        <w:ind w:left="2880" w:hanging="360"/>
+      </w:pPr>
+      <w:rPr>
+        <w:rFonts w:ascii="Symbol" w:hAnsi="Symbol" w:hint="default"/>
+      </w:rPr>
+    </w:lvl>
+    <w:lvl w:ilvl="4" w:tplc="480A0003" w:tentative="1">
+      <w:start w:val="1"/>
+      <w:numFmt w:val="bullet"/>
+      <w:lvlText w:val="o"/>
+      <w:lvlJc w:val="left"/>
+      <w:pPr>
+        <w:ind w:left="3600" w:hanging="360"/>
+      </w:pPr>
+      <w:rPr>
+        <w:rFonts w:ascii="Courier New" w:hAnsi="Courier New" w:cs="Courier New" w:hint="default"/>
+      </w:rPr>
+    </w:lvl>
+    <w:lvl w:ilvl="5" w:tplc="480A0005" w:tentative="1">
+      <w:start w:val="1"/>
+      <w:numFmt w:val="bullet"/>
+      <w:lvlText w:val=""/>
+      <w:lvlJc w:val="left"/>
+      <w:pPr>
+        <w:ind w:left="4320" w:hanging="360"/>
+      </w:pPr>
+      <w:rPr>
+        <w:rFonts w:ascii="Wingdings" w:hAnsi="Wingdings" w:hint="default"/>
+      </w:rPr>
+    </w:lvl>
+    <w:lvl w:ilvl="6" w:tplc="480A0001" w:tentative="1">
+      <w:start w:val="1"/>
+      <w:numFmt w:val="bullet"/>
+      <w:lvlText w:val=""/>
+      <w:lvlJc w:val="left"/>
+      <w:pPr>
+        <w:ind w:left="5040" w:hanging="360"/>
+      </w:pPr>
+      <w:rPr>
+        <w:rFonts w:ascii="Symbol" w:hAnsi="Symbol" w:hint="default"/>
+      </w:rPr>
+    </w:lvl>
+    <w:lvl w:ilvl="7" w:tplc="480A0003" w:tentative="1">
+      <w:start w:val="1"/>
+      <w:numFmt w:val="bullet"/>
+      <w:lvlText w:val="o"/>
+      <w:lvlJc w:val="left"/>
+      <w:pPr>
+        <w:ind w:left="5760" w:hanging="360"/>
+      </w:pPr>
+      <w:rPr>
+        <w:rFonts w:ascii="Courier New" w:hAnsi="Courier New" w:cs="Courier New" w:hint="default"/>
+      </w:rPr>
+    </w:lvl>
+    <w:lvl w:ilvl="8" w:tplc="480A0005" w:tentative="1">
+      <w:start w:val="1"/>
+      <w:numFmt w:val="bullet"/>
+      <w:lvlText w:val=""/>
+      <w:lvlJc w:val="left"/>
+      <w:pPr>
+        <w:ind w:left="6480" w:hanging="360"/>
+      </w:pPr>
+      <w:rPr>
+        <w:rFonts w:ascii="Wingdings" w:hAnsi="Wingdings" w:hint="default"/>
+      </w:rPr>
+    </w:lvl>
+  </w:abstractNum>
+  <w:abstractNum w:abstractNumId="2" w15:restartNumberingAfterBreak="0">
+    <w:nsid w:val="4B4F6C6D"/>
+    <w:multiLevelType w:val="hybridMultilevel"/>
+    <w:tmpl w:val="159C86F2"/>
+    <w:lvl w:ilvl="0" w:tplc="480A0001">
+      <w:start w:val="1"/>
+      <w:numFmt w:val="bullet"/>
+      <w:lvlText w:val=""/>
+      <w:lvlJc w:val="left"/>
+      <w:pPr>
+        <w:ind w:left="720" w:hanging="360"/>
+      </w:pPr>
+      <w:rPr>
+        <w:rFonts w:ascii="Symbol" w:hAnsi="Symbol" w:hint="default"/>
+      </w:rPr>
+    </w:lvl>
+    <w:lvl w:ilvl="1" w:tplc="480A0003" w:tentative="1">
+      <w:start w:val="1"/>
+      <w:numFmt w:val="bullet"/>
+      <w:lvlText w:val="o"/>
+      <w:lvlJc w:val="left"/>
+      <w:pPr>
+        <w:ind w:left="1440" w:hanging="360"/>
+      </w:pPr>
+      <w:rPr>
+        <w:rFonts w:ascii="Courier New" w:hAnsi="Courier New" w:cs="Courier New" w:hint="default"/>
+      </w:rPr>
+    </w:lvl>
+    <w:lvl w:ilvl="2" w:tplc="480A0005" w:tentative="1">
+      <w:start w:val="1"/>
+      <w:numFmt w:val="bullet"/>
+      <w:lvlText w:val=""/>
+      <w:lvlJc w:val="left"/>
+      <w:pPr>
+        <w:ind w:left="2160" w:hanging="360"/>
+      </w:pPr>
+      <w:rPr>
+        <w:rFonts w:ascii="Wingdings" w:hAnsi="Wingdings" w:hint="default"/>
+      </w:rPr>
+    </w:lvl>
+    <w:lvl w:ilvl="3" w:tplc="480A0001" w:tentative="1">
+      <w:start w:val="1"/>
+      <w:numFmt w:val="bullet"/>
+      <w:lvlText w:val=""/>
+      <w:lvlJc w:val="left"/>
+      <w:pPr>
+        <w:ind w:left="2880" w:hanging="360"/>
+      </w:pPr>
+      <w:rPr>
+        <w:rFonts w:ascii="Symbol" w:hAnsi="Symbol" w:hint="default"/>
+      </w:rPr>
+    </w:lvl>
+    <w:lvl w:ilvl="4" w:tplc="480A0003" w:tentative="1">
+      <w:start w:val="1"/>
+      <w:numFmt w:val="bullet"/>
+      <w:lvlText w:val="o"/>
+      <w:lvlJc w:val="left"/>
+      <w:pPr>
+        <w:ind w:left="3600" w:hanging="360"/>
+      </w:pPr>
+      <w:rPr>
+        <w:rFonts w:ascii="Courier New" w:hAnsi="Courier New" w:cs="Courier New" w:hint="default"/>
+      </w:rPr>
+    </w:lvl>
+    <w:lvl w:ilvl="5" w:tplc="480A0005" w:tentative="1">
+      <w:start w:val="1"/>
+      <w:numFmt w:val="bullet"/>
+      <w:lvlText w:val=""/>
+      <w:lvlJc w:val="left"/>
+      <w:pPr>
+        <w:ind w:left="4320" w:hanging="360"/>
+      </w:pPr>
+      <w:rPr>
+        <w:rFonts w:ascii="Wingdings" w:hAnsi="Wingdings" w:hint="default"/>
+      </w:rPr>
+    </w:lvl>
+    <w:lvl w:ilvl="6" w:tplc="480A0001" w:tentative="1">
+      <w:start w:val="1"/>
+      <w:numFmt w:val="bullet"/>
+      <w:lvlText w:val=""/>
+      <w:lvlJc w:val="left"/>
+      <w:pPr>
+        <w:ind w:left="5040" w:hanging="360"/>
+      </w:pPr>
+      <w:rPr>
+        <w:rFonts w:ascii="Symbol" w:hAnsi="Symbol" w:hint="default"/>
+      </w:rPr>
+    </w:lvl>
+    <w:lvl w:ilvl="7" w:tplc="480A0003" w:tentative="1">
+      <w:start w:val="1"/>
+      <w:numFmt w:val="bullet"/>
+      <w:lvlText w:val="o"/>
+      <w:lvlJc w:val="left"/>
+      <w:pPr>
+        <w:ind w:left="5760" w:hanging="360"/>
+      </w:pPr>
+      <w:rPr>
+        <w:rFonts w:ascii="Courier New" w:hAnsi="Courier New" w:cs="Courier New" w:hint="default"/>
+      </w:rPr>
+    </w:lvl>
+    <w:lvl w:ilvl="8" w:tplc="480A0005" w:tentative="1">
+      <w:start w:val="1"/>
+      <w:numFmt w:val="bullet"/>
+      <w:lvlText w:val=""/>
+      <w:lvlJc w:val="left"/>
+      <w:pPr>
+        <w:ind w:left="6480" w:hanging="360"/>
+      </w:pPr>
+      <w:rPr>
+        <w:rFonts w:ascii="Wingdings" w:hAnsi="Wingdings" w:hint="default"/>
+      </w:rPr>
+    </w:lvl>
+  </w:abstractNum>
+  <w:abstractNum w:abstractNumId="3" w15:restartNumberingAfterBreak="0">
     <w:nsid w:val="56D4541B"/>
     <w:multiLevelType w:val="multilevel"/>
     <w:tmpl w:val="A3547C44"/>
@@ -3321,8 +6816,8 @@
       </w:rPr>
     </w:lvl>
   </w:abstractNum>
-  <w:abstractNum w:abstractNumId="2" w15:restartNumberingAfterBreak="0">
-    <w:nsid w:val="70234DD8"/>
+  <w:abstractNum w:abstractNumId="4" w15:restartNumberingAfterBreak="0">
+    <w:nsid w:val="6C0551D0"/>
     <w:multiLevelType w:val="multilevel"/>
     <w:tmpl w:val="638C7918"/>
     <w:lvl w:ilvl="0">
@@ -3434,7 +6929,120 @@
       </w:rPr>
     </w:lvl>
   </w:abstractNum>
-  <w:abstractNum w:abstractNumId="3" w15:restartNumberingAfterBreak="0">
+  <w:abstractNum w:abstractNumId="5" w15:restartNumberingAfterBreak="0">
+    <w:nsid w:val="70234DD8"/>
+    <w:multiLevelType w:val="multilevel"/>
+    <w:tmpl w:val="638C7918"/>
+    <w:lvl w:ilvl="0">
+      <w:start w:val="1"/>
+      <w:numFmt w:val="decimal"/>
+      <w:lvlText w:val="%1."/>
+      <w:lvlJc w:val="left"/>
+      <w:pPr>
+        <w:ind w:left="720" w:hanging="360"/>
+      </w:pPr>
+      <w:rPr>
+        <w:u w:val="none"/>
+      </w:rPr>
+    </w:lvl>
+    <w:lvl w:ilvl="1">
+      <w:start w:val="1"/>
+      <w:numFmt w:val="lowerLetter"/>
+      <w:lvlText w:val="%2."/>
+      <w:lvlJc w:val="left"/>
+      <w:pPr>
+        <w:ind w:left="1440" w:hanging="360"/>
+      </w:pPr>
+      <w:rPr>
+        <w:u w:val="none"/>
+      </w:rPr>
+    </w:lvl>
+    <w:lvl w:ilvl="2">
+      <w:start w:val="1"/>
+      <w:numFmt w:val="lowerRoman"/>
+      <w:lvlText w:val="%3."/>
+      <w:lvlJc w:val="right"/>
+      <w:pPr>
+        <w:ind w:left="2160" w:hanging="360"/>
+      </w:pPr>
+      <w:rPr>
+        <w:u w:val="none"/>
+      </w:rPr>
+    </w:lvl>
+    <w:lvl w:ilvl="3">
+      <w:start w:val="1"/>
+      <w:numFmt w:val="decimal"/>
+      <w:lvlText w:val="%4."/>
+      <w:lvlJc w:val="left"/>
+      <w:pPr>
+        <w:ind w:left="2880" w:hanging="360"/>
+      </w:pPr>
+      <w:rPr>
+        <w:u w:val="none"/>
+      </w:rPr>
+    </w:lvl>
+    <w:lvl w:ilvl="4">
+      <w:start w:val="1"/>
+      <w:numFmt w:val="lowerLetter"/>
+      <w:lvlText w:val="%5."/>
+      <w:lvlJc w:val="left"/>
+      <w:pPr>
+        <w:ind w:left="3600" w:hanging="360"/>
+      </w:pPr>
+      <w:rPr>
+        <w:u w:val="none"/>
+      </w:rPr>
+    </w:lvl>
+    <w:lvl w:ilvl="5">
+      <w:start w:val="1"/>
+      <w:numFmt w:val="lowerRoman"/>
+      <w:lvlText w:val="%6."/>
+      <w:lvlJc w:val="right"/>
+      <w:pPr>
+        <w:ind w:left="4320" w:hanging="360"/>
+      </w:pPr>
+      <w:rPr>
+        <w:u w:val="none"/>
+      </w:rPr>
+    </w:lvl>
+    <w:lvl w:ilvl="6">
+      <w:start w:val="1"/>
+      <w:numFmt w:val="decimal"/>
+      <w:lvlText w:val="%7."/>
+      <w:lvlJc w:val="left"/>
+      <w:pPr>
+        <w:ind w:left="5040" w:hanging="360"/>
+      </w:pPr>
+      <w:rPr>
+        <w:u w:val="none"/>
+      </w:rPr>
+    </w:lvl>
+    <w:lvl w:ilvl="7">
+      <w:start w:val="1"/>
+      <w:numFmt w:val="lowerLetter"/>
+      <w:lvlText w:val="%8."/>
+      <w:lvlJc w:val="left"/>
+      <w:pPr>
+        <w:ind w:left="5760" w:hanging="360"/>
+      </w:pPr>
+      <w:rPr>
+        <w:u w:val="none"/>
+      </w:rPr>
+    </w:lvl>
+    <w:lvl w:ilvl="8">
+      <w:start w:val="1"/>
+      <w:numFmt w:val="lowerRoman"/>
+      <w:lvlText w:val="%9."/>
+      <w:lvlJc w:val="right"/>
+      <w:pPr>
+        <w:ind w:left="6480" w:hanging="360"/>
+      </w:pPr>
+      <w:rPr>
+        <w:u w:val="none"/>
+      </w:rPr>
+    </w:lvl>
+  </w:abstractNum>
+  <w:abstractNum w:abstractNumId="6" w15:restartNumberingAfterBreak="0">
     <w:nsid w:val="7CA51E71"/>
     <w:multiLevelType w:val="multilevel"/>
     <w:tmpl w:val="14901C0C"/>
@@ -3548,16 +7156,25 @@
     </w:lvl>
   </w:abstractNum>
   <w:num w:numId="1" w16cid:durableId="1439787843">
-    <w:abstractNumId w:val="2"/>
+    <w:abstractNumId w:val="5"/>
   </w:num>
   <w:num w:numId="2" w16cid:durableId="446241866">
-    <w:abstractNumId w:val="1"/>
+    <w:abstractNumId w:val="3"/>
   </w:num>
   <w:num w:numId="3" w16cid:durableId="307634270">
     <w:abstractNumId w:val="0"/>
   </w:num>
   <w:num w:numId="4" w16cid:durableId="1092318485">
-    <w:abstractNumId w:val="3"/>
+    <w:abstractNumId w:val="6"/>
+  </w:num>
+  <w:num w:numId="5" w16cid:durableId="1329558205">
+    <w:abstractNumId w:val="4"/>
+  </w:num>
+  <w:num w:numId="6" w16cid:durableId="1528325871">
+    <w:abstractNumId w:val="1"/>
+  </w:num>
+  <w:num w:numId="7" w16cid:durableId="310602293">
+    <w:abstractNumId w:val="2"/>
   </w:num>
 </w:numbering>
 </file>
@@ -3960,7 +7577,7 @@
   <w:style w:type="paragraph" w:default="1" w:styleId="Normal">
     <w:name w:val="Normal"/>
     <w:qFormat/>
-    <w:rsid w:val="00B22016"/>
+    <w:rsid w:val="0078789E"/>
     <w:rPr>
       <w:rFonts w:ascii="Times New Roman" w:hAnsi="Times New Roman"/>
       <w:sz w:val="24"/>
@@ -3990,6 +7607,7 @@
     <w:name w:val="heading 2"/>
     <w:basedOn w:val="Normal"/>
     <w:next w:val="Normal"/>
+    <w:link w:val="Ttulo2Car"/>
     <w:uiPriority w:val="9"/>
     <w:unhideWhenUsed/>
     <w:qFormat/>
@@ -4010,6 +7628,7 @@
     <w:name w:val="heading 3"/>
     <w:basedOn w:val="Normal"/>
     <w:next w:val="Normal"/>
+    <w:link w:val="Ttulo3Car"/>
     <w:uiPriority w:val="9"/>
     <w:unhideWhenUsed/>
     <w:qFormat/>
@@ -4283,6 +7902,43 @@
     <w:pPr>
       <w:spacing w:after="100"/>
       <w:ind w:left="480"/>
+    </w:pPr>
+  </w:style>
+  <w:style w:type="character" w:customStyle="1" w:styleId="Ttulo2Car">
+    <w:name w:val="Título 2 Car"/>
+    <w:basedOn w:val="Fuentedeprrafopredeter"/>
+    <w:link w:val="Ttulo2"/>
+    <w:uiPriority w:val="9"/>
+    <w:rsid w:val="00660315"/>
+    <w:rPr>
+      <w:rFonts w:ascii="Times New Roman" w:hAnsi="Times New Roman"/>
+      <w:b/>
+      <w:sz w:val="28"/>
+      <w:szCs w:val="32"/>
+    </w:rPr>
+  </w:style>
+  <w:style w:type="character" w:customStyle="1" w:styleId="Ttulo3Car">
+    <w:name w:val="Título 3 Car"/>
+    <w:basedOn w:val="Fuentedeprrafopredeter"/>
+    <w:link w:val="Ttulo3"/>
+    <w:uiPriority w:val="9"/>
+    <w:rsid w:val="00660315"/>
+    <w:rPr>
+      <w:rFonts w:ascii="Times New Roman" w:hAnsi="Times New Roman"/>
+      <w:color w:val="434343"/>
+      <w:sz w:val="28"/>
+      <w:szCs w:val="28"/>
+    </w:rPr>
+  </w:style>
+  <w:style w:type="paragraph" w:styleId="Prrafodelista">
+    <w:name w:val="List Paragraph"/>
+    <w:basedOn w:val="Normal"/>
+    <w:uiPriority w:val="34"/>
+    <w:qFormat/>
+    <w:rsid w:val="00A93E4C"/>
+    <w:pPr>
+      <w:ind w:left="720"/>
+      <w:contextualSpacing/>
     </w:pPr>
   </w:style>
 </w:styles>

</xml_diff>

<commit_message>
docs: cambios en documentacion
</commit_message>
<xml_diff>
--- a/docs/events/review-retrospective-kaizen.docx
+++ b/docs/events/review-retrospective-kaizen.docx
@@ -1429,21 +1429,7 @@
                 <w:rStyle w:val="Hipervnculo"/>
                 <w:noProof/>
               </w:rPr>
-              <w:t>Retrospectiva de la Dinámic</w:t>
-            </w:r>
-            <w:r>
-              <w:rPr>
-                <w:rStyle w:val="Hipervnculo"/>
-                <w:noProof/>
-              </w:rPr>
-              <w:t>a</w:t>
-            </w:r>
-            <w:r>
-              <w:rPr>
-                <w:rStyle w:val="Hipervnculo"/>
-                <w:noProof/>
-              </w:rPr>
-              <w:t xml:space="preserve"> del Equipo</w:t>
+              <w:t>Retrospectiva de la Dinámica del Equipo</w:t>
             </w:r>
             <w:r>
               <w:rPr>
@@ -3072,23 +3058,7 @@
                 <w:color w:val="1F1F1F"/>
                 <w:szCs w:val="24"/>
               </w:rPr>
-              <w:t>Finalizada (</w:t>
-            </w:r>
-            <w:proofErr w:type="gramStart"/>
-            <w:r>
-              <w:rPr>
-                <w:color w:val="1F1F1F"/>
-                <w:szCs w:val="24"/>
-              </w:rPr>
-              <w:t>Sábado</w:t>
-            </w:r>
-            <w:proofErr w:type="gramEnd"/>
-            <w:r>
-              <w:rPr>
-                <w:color w:val="1F1F1F"/>
-                <w:szCs w:val="24"/>
-              </w:rPr>
-              <w:t>)</w:t>
+              <w:t>Finalizada (Sábado)</w:t>
             </w:r>
           </w:p>
         </w:tc>
@@ -3628,6 +3598,60 @@
     </w:p>
     <w:p>
       <w:pPr>
+        <w:spacing w:line="480" w:lineRule="auto"/>
+        <w:rPr>
+          <w:rFonts w:eastAsia="Times New Roman" w:cs="Times New Roman"/>
+          <w:szCs w:val="24"/>
+        </w:rPr>
+      </w:pPr>
+      <w:r>
+        <w:rPr>
+          <w:rFonts w:eastAsia="Times New Roman" w:cs="Times New Roman"/>
+          <w:b/>
+          <w:bCs/>
+          <w:szCs w:val="24"/>
+        </w:rPr>
+        <w:t xml:space="preserve">Fecha </w:t>
+      </w:r>
+      <w:proofErr w:type="spellStart"/>
+      <w:r>
+        <w:rPr>
+          <w:rFonts w:eastAsia="Times New Roman" w:cs="Times New Roman"/>
+          <w:b/>
+          <w:bCs/>
+          <w:szCs w:val="24"/>
+        </w:rPr>
+        <w:t>Review</w:t>
+      </w:r>
+      <w:proofErr w:type="spellEnd"/>
+      <w:r>
+        <w:rPr>
+          <w:rFonts w:eastAsia="Times New Roman" w:cs="Times New Roman"/>
+          <w:b/>
+          <w:bCs/>
+          <w:szCs w:val="24"/>
+        </w:rPr>
+        <w:t>/Retrospective:</w:t>
+      </w:r>
+      <w:r>
+        <w:rPr>
+          <w:rFonts w:eastAsia="Times New Roman" w:cs="Times New Roman"/>
+          <w:b/>
+          <w:bCs/>
+          <w:szCs w:val="24"/>
+        </w:rPr>
+        <w:t xml:space="preserve"> </w:t>
+      </w:r>
+      <w:r>
+        <w:rPr>
+          <w:rFonts w:eastAsia="Times New Roman" w:cs="Times New Roman"/>
+          <w:szCs w:val="24"/>
+        </w:rPr>
+        <w:t>26 de marzo de 2026</w:t>
+      </w:r>
+    </w:p>
+    <w:p>
+      <w:pPr>
         <w:pStyle w:val="Ttulo2"/>
       </w:pPr>
       <w:bookmarkStart w:id="12" w:name="_Toc225170497"/>
@@ -3994,6 +4018,7 @@
           <w:bCs/>
           <w:szCs w:val="24"/>
         </w:rPr>
+        <w:lastRenderedPageBreak/>
         <w:t>HU-06 – Búsqueda de pacientes</w:t>
       </w:r>
       <w:r>
@@ -4056,7 +4081,6 @@
           <w:bCs/>
           <w:szCs w:val="24"/>
         </w:rPr>
-        <w:lastRenderedPageBreak/>
         <w:t>HU-07 – Registro preclínico</w:t>
       </w:r>
       <w:r>
@@ -4584,10 +4608,25 @@
     </w:p>
     <w:p>
       <w:pPr>
+        <w:pStyle w:val="Ttulo3"/>
+      </w:pPr>
+      <w:proofErr w:type="spellStart"/>
+      <w:r>
+        <w:t>Feedback</w:t>
+      </w:r>
+      <w:proofErr w:type="spellEnd"/>
+      <w:r>
+        <w:t xml:space="preserve"> recibido</w:t>
+      </w:r>
+    </w:p>
+    <w:p/>
+    <w:p>
+      <w:pPr>
         <w:pStyle w:val="Ttulo2"/>
       </w:pPr>
       <w:bookmarkStart w:id="15" w:name="_Toc225170500"/>
       <w:r>
+        <w:lastRenderedPageBreak/>
         <w:t>Sprint Retrospective</w:t>
       </w:r>
       <w:bookmarkEnd w:id="15"/>
@@ -4672,16 +4711,7 @@
                 <w:color w:val="1F1F1F"/>
                 <w:szCs w:val="24"/>
               </w:rPr>
-              <w:t>Historia de Usuario (HU)</w:t>
-            </w:r>
-            <w:r>
-              <w:rPr>
-                <w:b/>
-                <w:bCs/>
-                <w:color w:val="1F1F1F"/>
-                <w:szCs w:val="24"/>
-              </w:rPr>
-              <w:t xml:space="preserve"> / Tarea Técnica (TT)</w:t>
+              <w:t>Historia de Usuario (HU) / Tarea Técnica (TT)</w:t>
             </w:r>
           </w:p>
         </w:tc>
@@ -4795,7 +4825,6 @@
                 <w:color w:val="1F1F1F"/>
                 <w:szCs w:val="24"/>
               </w:rPr>
-              <w:lastRenderedPageBreak/>
               <w:t>HU-04:</w:t>
             </w:r>
             <w:r>
@@ -5783,6 +5812,7 @@
                 <w:color w:val="1F1F1F"/>
                 <w:szCs w:val="24"/>
               </w:rPr>
+              <w:lastRenderedPageBreak/>
               <w:t xml:space="preserve">TT-10: </w:t>
             </w:r>
             <w:proofErr w:type="spellStart"/>
@@ -5928,9 +5958,6 @@
       </w:r>
       <w:r>
         <w:br/>
-      </w:r>
-      <w:r>
-        <w:lastRenderedPageBreak/>
         <w:t xml:space="preserve">Las tallas utilizadas en las tareas, han sido M y L; calculando estadísticamente que </w:t>
       </w:r>
       <w:r>

</xml_diff>

<commit_message>
docs: se agregó feedback recibido en la presentación del segundo avance
</commit_message>
<xml_diff>
--- a/docs/events/review-retrospective-kaizen.docx
+++ b/docs/events/review-retrospective-kaizen.docx
@@ -182,7 +182,7 @@
           <w:r>
             <w:fldChar w:fldCharType="separate"/>
           </w:r>
-          <w:hyperlink w:anchor="_Toc225170486" w:history="1">
+          <w:hyperlink w:anchor="_Toc225523986" w:history="1">
             <w:r>
               <w:rPr>
                 <w:rStyle w:val="Hipervnculo"/>
@@ -209,7 +209,7 @@
                 <w:noProof/>
                 <w:webHidden/>
               </w:rPr>
-              <w:instrText xml:space="preserve"> PAGEREF _Toc225170486 \h </w:instrText>
+              <w:instrText xml:space="preserve"> PAGEREF _Toc225523986 \h </w:instrText>
             </w:r>
             <w:r>
               <w:rPr>
@@ -255,7 +255,7 @@
               <w14:ligatures w14:val="standardContextual"/>
             </w:rPr>
           </w:pPr>
-          <w:hyperlink w:anchor="_Toc225170487" w:history="1">
+          <w:hyperlink w:anchor="_Toc225523987" w:history="1">
             <w:r>
               <w:rPr>
                 <w:rStyle w:val="Hipervnculo"/>
@@ -282,7 +282,7 @@
                 <w:noProof/>
                 <w:webHidden/>
               </w:rPr>
-              <w:instrText xml:space="preserve"> PAGEREF _Toc225170487 \h </w:instrText>
+              <w:instrText xml:space="preserve"> PAGEREF _Toc225523987 \h </w:instrText>
             </w:r>
             <w:r>
               <w:rPr>
@@ -328,7 +328,7 @@
               <w14:ligatures w14:val="standardContextual"/>
             </w:rPr>
           </w:pPr>
-          <w:hyperlink w:anchor="_Toc225170488" w:history="1">
+          <w:hyperlink w:anchor="_Toc225523988" w:history="1">
             <w:r>
               <w:rPr>
                 <w:rStyle w:val="Hipervnculo"/>
@@ -355,7 +355,7 @@
                 <w:noProof/>
                 <w:webHidden/>
               </w:rPr>
-              <w:instrText xml:space="preserve"> PAGEREF _Toc225170488 \h </w:instrText>
+              <w:instrText xml:space="preserve"> PAGEREF _Toc225523988 \h </w:instrText>
             </w:r>
             <w:r>
               <w:rPr>
@@ -401,7 +401,7 @@
               <w14:ligatures w14:val="standardContextual"/>
             </w:rPr>
           </w:pPr>
-          <w:hyperlink w:anchor="_Toc225170489" w:history="1">
+          <w:hyperlink w:anchor="_Toc225523989" w:history="1">
             <w:r>
               <w:rPr>
                 <w:rStyle w:val="Hipervnculo"/>
@@ -428,7 +428,7 @@
                 <w:noProof/>
                 <w:webHidden/>
               </w:rPr>
-              <w:instrText xml:space="preserve"> PAGEREF _Toc225170489 \h </w:instrText>
+              <w:instrText xml:space="preserve"> PAGEREF _Toc225523989 \h </w:instrText>
             </w:r>
             <w:r>
               <w:rPr>
@@ -474,7 +474,7 @@
               <w14:ligatures w14:val="standardContextual"/>
             </w:rPr>
           </w:pPr>
-          <w:hyperlink w:anchor="_Toc225170490" w:history="1">
+          <w:hyperlink w:anchor="_Toc225523990" w:history="1">
             <w:r>
               <w:rPr>
                 <w:rStyle w:val="Hipervnculo"/>
@@ -501,7 +501,7 @@
                 <w:noProof/>
                 <w:webHidden/>
               </w:rPr>
-              <w:instrText xml:space="preserve"> PAGEREF _Toc225170490 \h </w:instrText>
+              <w:instrText xml:space="preserve"> PAGEREF _Toc225523990 \h </w:instrText>
             </w:r>
             <w:r>
               <w:rPr>
@@ -547,7 +547,7 @@
               <w14:ligatures w14:val="standardContextual"/>
             </w:rPr>
           </w:pPr>
-          <w:hyperlink w:anchor="_Toc225170491" w:history="1">
+          <w:hyperlink w:anchor="_Toc225523991" w:history="1">
             <w:r>
               <w:rPr>
                 <w:rStyle w:val="Hipervnculo"/>
@@ -574,7 +574,7 @@
                 <w:noProof/>
                 <w:webHidden/>
               </w:rPr>
-              <w:instrText xml:space="preserve"> PAGEREF _Toc225170491 \h </w:instrText>
+              <w:instrText xml:space="preserve"> PAGEREF _Toc225523991 \h </w:instrText>
             </w:r>
             <w:r>
               <w:rPr>
@@ -620,7 +620,7 @@
               <w14:ligatures w14:val="standardContextual"/>
             </w:rPr>
           </w:pPr>
-          <w:hyperlink w:anchor="_Toc225170492" w:history="1">
+          <w:hyperlink w:anchor="_Toc225523992" w:history="1">
             <w:r>
               <w:rPr>
                 <w:rStyle w:val="Hipervnculo"/>
@@ -647,7 +647,7 @@
                 <w:noProof/>
                 <w:webHidden/>
               </w:rPr>
-              <w:instrText xml:space="preserve"> PAGEREF _Toc225170492 \h </w:instrText>
+              <w:instrText xml:space="preserve"> PAGEREF _Toc225523992 \h </w:instrText>
             </w:r>
             <w:r>
               <w:rPr>
@@ -693,7 +693,7 @@
               <w14:ligatures w14:val="standardContextual"/>
             </w:rPr>
           </w:pPr>
-          <w:hyperlink w:anchor="_Toc225170493" w:history="1">
+          <w:hyperlink w:anchor="_Toc225523993" w:history="1">
             <w:r>
               <w:rPr>
                 <w:rStyle w:val="Hipervnculo"/>
@@ -720,7 +720,7 @@
                 <w:noProof/>
                 <w:webHidden/>
               </w:rPr>
-              <w:instrText xml:space="preserve"> PAGEREF _Toc225170493 \h </w:instrText>
+              <w:instrText xml:space="preserve"> PAGEREF _Toc225523993 \h </w:instrText>
             </w:r>
             <w:r>
               <w:rPr>
@@ -766,7 +766,7 @@
               <w14:ligatures w14:val="standardContextual"/>
             </w:rPr>
           </w:pPr>
-          <w:hyperlink w:anchor="_Toc225170494" w:history="1">
+          <w:hyperlink w:anchor="_Toc225523994" w:history="1">
             <w:r>
               <w:rPr>
                 <w:rStyle w:val="Hipervnculo"/>
@@ -793,7 +793,7 @@
                 <w:noProof/>
                 <w:webHidden/>
               </w:rPr>
-              <w:instrText xml:space="preserve"> PAGEREF _Toc225170494 \h </w:instrText>
+              <w:instrText xml:space="preserve"> PAGEREF _Toc225523994 \h </w:instrText>
             </w:r>
             <w:r>
               <w:rPr>
@@ -813,7 +813,7 @@
                 <w:noProof/>
                 <w:webHidden/>
               </w:rPr>
-              <w:t>4</w:t>
+              <w:t>5</w:t>
             </w:r>
             <w:r>
               <w:rPr>
@@ -839,7 +839,7 @@
               <w14:ligatures w14:val="standardContextual"/>
             </w:rPr>
           </w:pPr>
-          <w:hyperlink w:anchor="_Toc225170495" w:history="1">
+          <w:hyperlink w:anchor="_Toc225523995" w:history="1">
             <w:r>
               <w:rPr>
                 <w:rStyle w:val="Hipervnculo"/>
@@ -866,7 +866,7 @@
                 <w:noProof/>
                 <w:webHidden/>
               </w:rPr>
-              <w:instrText xml:space="preserve"> PAGEREF _Toc225170495 \h </w:instrText>
+              <w:instrText xml:space="preserve"> PAGEREF _Toc225523995 \h </w:instrText>
             </w:r>
             <w:r>
               <w:rPr>
@@ -912,7 +912,7 @@
               <w14:ligatures w14:val="standardContextual"/>
             </w:rPr>
           </w:pPr>
-          <w:hyperlink w:anchor="_Toc225170496" w:history="1">
+          <w:hyperlink w:anchor="_Toc225523996" w:history="1">
             <w:r>
               <w:rPr>
                 <w:rStyle w:val="Hipervnculo"/>
@@ -939,7 +939,7 @@
                 <w:noProof/>
                 <w:webHidden/>
               </w:rPr>
-              <w:instrText xml:space="preserve"> PAGEREF _Toc225170496 \h </w:instrText>
+              <w:instrText xml:space="preserve"> PAGEREF _Toc225523996 \h </w:instrText>
             </w:r>
             <w:r>
               <w:rPr>
@@ -985,7 +985,7 @@
               <w14:ligatures w14:val="standardContextual"/>
             </w:rPr>
           </w:pPr>
-          <w:hyperlink w:anchor="_Toc225170497" w:history="1">
+          <w:hyperlink w:anchor="_Toc225523997" w:history="1">
             <w:r>
               <w:rPr>
                 <w:rStyle w:val="Hipervnculo"/>
@@ -1012,7 +1012,7 @@
                 <w:noProof/>
                 <w:webHidden/>
               </w:rPr>
-              <w:instrText xml:space="preserve"> PAGEREF _Toc225170497 \h </w:instrText>
+              <w:instrText xml:space="preserve"> PAGEREF _Toc225523997 \h </w:instrText>
             </w:r>
             <w:r>
               <w:rPr>
@@ -1032,7 +1032,7 @@
                 <w:noProof/>
                 <w:webHidden/>
               </w:rPr>
-              <w:t>5</w:t>
+              <w:t>6</w:t>
             </w:r>
             <w:r>
               <w:rPr>
@@ -1058,7 +1058,7 @@
               <w14:ligatures w14:val="standardContextual"/>
             </w:rPr>
           </w:pPr>
-          <w:hyperlink w:anchor="_Toc225170498" w:history="1">
+          <w:hyperlink w:anchor="_Toc225523998" w:history="1">
             <w:r>
               <w:rPr>
                 <w:rStyle w:val="Hipervnculo"/>
@@ -1085,7 +1085,7 @@
                 <w:noProof/>
                 <w:webHidden/>
               </w:rPr>
-              <w:instrText xml:space="preserve"> PAGEREF _Toc225170498 \h </w:instrText>
+              <w:instrText xml:space="preserve"> PAGEREF _Toc225523998 \h </w:instrText>
             </w:r>
             <w:r>
               <w:rPr>
@@ -1105,7 +1105,7 @@
                 <w:noProof/>
                 <w:webHidden/>
               </w:rPr>
-              <w:t>5</w:t>
+              <w:t>6</w:t>
             </w:r>
             <w:r>
               <w:rPr>
@@ -1131,7 +1131,7 @@
               <w14:ligatures w14:val="standardContextual"/>
             </w:rPr>
           </w:pPr>
-          <w:hyperlink w:anchor="_Toc225170499" w:history="1">
+          <w:hyperlink w:anchor="_Toc225523999" w:history="1">
             <w:r>
               <w:rPr>
                 <w:rStyle w:val="Hipervnculo"/>
@@ -1158,7 +1158,7 @@
                 <w:noProof/>
                 <w:webHidden/>
               </w:rPr>
-              <w:instrText xml:space="preserve"> PAGEREF _Toc225170499 \h </w:instrText>
+              <w:instrText xml:space="preserve"> PAGEREF _Toc225523999 \h </w:instrText>
             </w:r>
             <w:r>
               <w:rPr>
@@ -1178,7 +1178,94 @@
                 <w:noProof/>
                 <w:webHidden/>
               </w:rPr>
-              <w:t>5</w:t>
+              <w:t>6</w:t>
+            </w:r>
+            <w:r>
+              <w:rPr>
+                <w:noProof/>
+                <w:webHidden/>
+              </w:rPr>
+              <w:fldChar w:fldCharType="end"/>
+            </w:r>
+          </w:hyperlink>
+        </w:p>
+        <w:p>
+          <w:pPr>
+            <w:pStyle w:val="TDC3"/>
+            <w:tabs>
+              <w:tab w:val="right" w:leader="dot" w:pos="9350"/>
+            </w:tabs>
+            <w:rPr>
+              <w:rFonts w:asciiTheme="minorHAnsi" w:eastAsiaTheme="minorEastAsia" w:hAnsiTheme="minorHAnsi" w:cstheme="minorBidi"/>
+              <w:noProof/>
+              <w:kern w:val="2"/>
+              <w:szCs w:val="24"/>
+              <w:lang w:val="es-HN"/>
+              <w14:ligatures w14:val="standardContextual"/>
+            </w:rPr>
+          </w:pPr>
+          <w:hyperlink w:anchor="_Toc225524000" w:history="1">
+            <w:r>
+              <w:rPr>
+                <w:rStyle w:val="Hipervnculo"/>
+                <w:noProof/>
+              </w:rPr>
+              <w:t>Feedb</w:t>
+            </w:r>
+            <w:r>
+              <w:rPr>
+                <w:rStyle w:val="Hipervnculo"/>
+                <w:noProof/>
+              </w:rPr>
+              <w:t>a</w:t>
+            </w:r>
+            <w:r>
+              <w:rPr>
+                <w:rStyle w:val="Hipervnculo"/>
+                <w:noProof/>
+              </w:rPr>
+              <w:t>ck recibido</w:t>
+            </w:r>
+            <w:r>
+              <w:rPr>
+                <w:noProof/>
+                <w:webHidden/>
+              </w:rPr>
+              <w:tab/>
+            </w:r>
+            <w:r>
+              <w:rPr>
+                <w:noProof/>
+                <w:webHidden/>
+              </w:rPr>
+              <w:fldChar w:fldCharType="begin"/>
+            </w:r>
+            <w:r>
+              <w:rPr>
+                <w:noProof/>
+                <w:webHidden/>
+              </w:rPr>
+              <w:instrText xml:space="preserve"> PAGEREF _Toc225524000 \h </w:instrText>
+            </w:r>
+            <w:r>
+              <w:rPr>
+                <w:noProof/>
+                <w:webHidden/>
+              </w:rPr>
+            </w:r>
+            <w:r>
+              <w:rPr>
+                <w:noProof/>
+                <w:webHidden/>
+              </w:rPr>
+              <w:fldChar w:fldCharType="separate"/>
+            </w:r>
+            <w:r>
+              <w:rPr>
+                <w:noProof/>
+                <w:webHidden/>
+              </w:rPr>
+              <w:t>7</w:t>
             </w:r>
             <w:r>
               <w:rPr>
@@ -1204,7 +1291,7 @@
               <w14:ligatures w14:val="standardContextual"/>
             </w:rPr>
           </w:pPr>
-          <w:hyperlink w:anchor="_Toc225170500" w:history="1">
+          <w:hyperlink w:anchor="_Toc225524001" w:history="1">
             <w:r>
               <w:rPr>
                 <w:rStyle w:val="Hipervnculo"/>
@@ -1231,7 +1318,7 @@
                 <w:noProof/>
                 <w:webHidden/>
               </w:rPr>
-              <w:instrText xml:space="preserve"> PAGEREF _Toc225170500 \h </w:instrText>
+              <w:instrText xml:space="preserve"> PAGEREF _Toc225524001 \h </w:instrText>
             </w:r>
             <w:r>
               <w:rPr>
@@ -1251,7 +1338,7 @@
                 <w:noProof/>
                 <w:webHidden/>
               </w:rPr>
-              <w:t>6</w:t>
+              <w:t>7</w:t>
             </w:r>
             <w:r>
               <w:rPr>
@@ -1277,7 +1364,7 @@
               <w14:ligatures w14:val="standardContextual"/>
             </w:rPr>
           </w:pPr>
-          <w:hyperlink w:anchor="_Toc225170501" w:history="1">
+          <w:hyperlink w:anchor="_Toc225524002" w:history="1">
             <w:r>
               <w:rPr>
                 <w:rStyle w:val="Hipervnculo"/>
@@ -1304,7 +1391,7 @@
                 <w:noProof/>
                 <w:webHidden/>
               </w:rPr>
-              <w:instrText xml:space="preserve"> PAGEREF _Toc225170501 \h </w:instrText>
+              <w:instrText xml:space="preserve"> PAGEREF _Toc225524002 \h </w:instrText>
             </w:r>
             <w:r>
               <w:rPr>
@@ -1324,7 +1411,7 @@
                 <w:noProof/>
                 <w:webHidden/>
               </w:rPr>
-              <w:t>6</w:t>
+              <w:t>7</w:t>
             </w:r>
             <w:r>
               <w:rPr>
@@ -1350,7 +1437,7 @@
               <w14:ligatures w14:val="standardContextual"/>
             </w:rPr>
           </w:pPr>
-          <w:hyperlink w:anchor="_Toc225170502" w:history="1">
+          <w:hyperlink w:anchor="_Toc225524003" w:history="1">
             <w:r>
               <w:rPr>
                 <w:rStyle w:val="Hipervnculo"/>
@@ -1377,7 +1464,7 @@
                 <w:noProof/>
                 <w:webHidden/>
               </w:rPr>
-              <w:instrText xml:space="preserve"> PAGEREF _Toc225170502 \h </w:instrText>
+              <w:instrText xml:space="preserve"> PAGEREF _Toc225524003 \h </w:instrText>
             </w:r>
             <w:r>
               <w:rPr>
@@ -1397,7 +1484,7 @@
                 <w:noProof/>
                 <w:webHidden/>
               </w:rPr>
-              <w:t>7</w:t>
+              <w:t>8</w:t>
             </w:r>
             <w:r>
               <w:rPr>
@@ -1423,27 +1510,13 @@
               <w14:ligatures w14:val="standardContextual"/>
             </w:rPr>
           </w:pPr>
-          <w:hyperlink w:anchor="_Toc225170503" w:history="1">
+          <w:hyperlink w:anchor="_Toc225524004" w:history="1">
             <w:r>
               <w:rPr>
                 <w:rStyle w:val="Hipervnculo"/>
                 <w:noProof/>
               </w:rPr>
-              <w:t>Retrospectiva de la Dinámic</w:t>
-            </w:r>
-            <w:r>
-              <w:rPr>
-                <w:rStyle w:val="Hipervnculo"/>
-                <w:noProof/>
-              </w:rPr>
-              <w:t>a</w:t>
-            </w:r>
-            <w:r>
-              <w:rPr>
-                <w:rStyle w:val="Hipervnculo"/>
-                <w:noProof/>
-              </w:rPr>
-              <w:t xml:space="preserve"> del Equipo</w:t>
+              <w:t>Retrospectiva de la Dinámica del Equipo</w:t>
             </w:r>
             <w:r>
               <w:rPr>
@@ -1464,7 +1537,7 @@
                 <w:noProof/>
                 <w:webHidden/>
               </w:rPr>
-              <w:instrText xml:space="preserve"> PAGEREF _Toc225170503 \h </w:instrText>
+              <w:instrText xml:space="preserve"> PAGEREF _Toc225524004 \h </w:instrText>
             </w:r>
             <w:r>
               <w:rPr>
@@ -1484,7 +1557,7 @@
                 <w:noProof/>
                 <w:webHidden/>
               </w:rPr>
-              <w:t>8</w:t>
+              <w:t>9</w:t>
             </w:r>
             <w:r>
               <w:rPr>
@@ -1510,7 +1583,7 @@
               <w14:ligatures w14:val="standardContextual"/>
             </w:rPr>
           </w:pPr>
-          <w:hyperlink w:anchor="_Toc225170504" w:history="1">
+          <w:hyperlink w:anchor="_Toc225524005" w:history="1">
             <w:r>
               <w:rPr>
                 <w:rStyle w:val="Hipervnculo"/>
@@ -1537,7 +1610,7 @@
                 <w:noProof/>
                 <w:webHidden/>
               </w:rPr>
-              <w:instrText xml:space="preserve"> PAGEREF _Toc225170504 \h </w:instrText>
+              <w:instrText xml:space="preserve"> PAGEREF _Toc225524005 \h </w:instrText>
             </w:r>
             <w:r>
               <w:rPr>
@@ -1557,7 +1630,7 @@
                 <w:noProof/>
                 <w:webHidden/>
               </w:rPr>
-              <w:t>8</w:t>
+              <w:t>9</w:t>
             </w:r>
             <w:r>
               <w:rPr>
@@ -1662,7 +1735,7 @@
       <w:pPr>
         <w:pStyle w:val="Ttulo1"/>
       </w:pPr>
-      <w:bookmarkStart w:id="0" w:name="_Toc225170486"/>
+      <w:bookmarkStart w:id="0" w:name="_Toc225523986"/>
       <w:r>
         <w:t>Sprint 1</w:t>
       </w:r>
@@ -1785,7 +1858,7 @@
       <w:pPr>
         <w:pStyle w:val="Ttulo2"/>
       </w:pPr>
-      <w:bookmarkStart w:id="1" w:name="_Toc225170487"/>
+      <w:bookmarkStart w:id="1" w:name="_Toc225523987"/>
       <w:r>
         <w:t xml:space="preserve">Sprint </w:t>
       </w:r>
@@ -1839,7 +1912,7 @@
           <w:sz w:val="24"/>
         </w:rPr>
       </w:pPr>
-      <w:bookmarkStart w:id="2" w:name="_Toc225170488"/>
+      <w:bookmarkStart w:id="2" w:name="_Toc225523988"/>
       <w:r>
         <w:t xml:space="preserve">Historias de </w:t>
       </w:r>
@@ -1986,7 +2059,7 @@
           <w:sz w:val="24"/>
         </w:rPr>
       </w:pPr>
-      <w:bookmarkStart w:id="3" w:name="_Toc225170489"/>
+      <w:bookmarkStart w:id="3" w:name="_Toc225523989"/>
       <w:r>
         <w:t>Incremento del producto</w:t>
       </w:r>
@@ -2116,7 +2189,7 @@
       <w:pPr>
         <w:pStyle w:val="Ttulo3"/>
       </w:pPr>
-      <w:bookmarkStart w:id="4" w:name="_Toc225170490"/>
+      <w:bookmarkStart w:id="4" w:name="_Toc225523990"/>
       <w:proofErr w:type="spellStart"/>
       <w:r>
         <w:t>Feedback</w:t>
@@ -2185,6 +2258,7 @@
           <w:rFonts w:eastAsia="Times New Roman" w:cs="Times New Roman"/>
           <w:szCs w:val="24"/>
         </w:rPr>
+        <w:lastRenderedPageBreak/>
         <w:t xml:space="preserve">Configurar Pruebas Unitarias con GitHub </w:t>
       </w:r>
       <w:proofErr w:type="spellStart"/>
@@ -2238,7 +2312,6 @@
           <w:rFonts w:eastAsia="Times New Roman" w:cs="Times New Roman"/>
           <w:szCs w:val="24"/>
         </w:rPr>
-        <w:lastRenderedPageBreak/>
         <w:t xml:space="preserve">Documentar </w:t>
       </w:r>
       <w:r>
@@ -2358,7 +2431,7 @@
       <w:pPr>
         <w:pStyle w:val="Ttulo2"/>
       </w:pPr>
-      <w:bookmarkStart w:id="5" w:name="_Toc225170491"/>
+      <w:bookmarkStart w:id="5" w:name="_Toc225523991"/>
       <w:r>
         <w:t>Sprint Retrospective</w:t>
       </w:r>
@@ -2401,7 +2474,7 @@
       <w:pPr>
         <w:pStyle w:val="Ttulo3"/>
       </w:pPr>
-      <w:bookmarkStart w:id="6" w:name="_Toc225170492"/>
+      <w:bookmarkStart w:id="6" w:name="_Toc225523992"/>
       <w:r>
         <w:t xml:space="preserve">Análisis de </w:t>
       </w:r>
@@ -2811,6 +2884,7 @@
                 <w:color w:val="1F1F1F"/>
                 <w:szCs w:val="24"/>
               </w:rPr>
+              <w:lastRenderedPageBreak/>
               <w:t>HU-03:</w:t>
             </w:r>
             <w:r>
@@ -2960,7 +3034,6 @@
                 <w:color w:val="1F1F1F"/>
                 <w:szCs w:val="24"/>
               </w:rPr>
-              <w:lastRenderedPageBreak/>
               <w:t>HU-04:</w:t>
             </w:r>
             <w:r>
@@ -3072,23 +3145,7 @@
                 <w:color w:val="1F1F1F"/>
                 <w:szCs w:val="24"/>
               </w:rPr>
-              <w:t>Finalizada (</w:t>
-            </w:r>
-            <w:proofErr w:type="gramStart"/>
-            <w:r>
-              <w:rPr>
-                <w:color w:val="1F1F1F"/>
-                <w:szCs w:val="24"/>
-              </w:rPr>
-              <w:t>Sábado</w:t>
-            </w:r>
-            <w:proofErr w:type="gramEnd"/>
-            <w:r>
-              <w:rPr>
-                <w:color w:val="1F1F1F"/>
-                <w:szCs w:val="24"/>
-              </w:rPr>
-              <w:t>)</w:t>
+              <w:t>Finalizada (Sábado)</w:t>
             </w:r>
           </w:p>
         </w:tc>
@@ -3258,7 +3315,7 @@
         <w:pStyle w:val="Ttulo3"/>
       </w:pPr>
       <w:bookmarkStart w:id="7" w:name="_lxded7iqfzj6" w:colFirst="0" w:colLast="0"/>
-      <w:bookmarkStart w:id="8" w:name="_Toc225170493"/>
+      <w:bookmarkStart w:id="8" w:name="_Toc225523993"/>
       <w:bookmarkEnd w:id="7"/>
       <w:r>
         <w:t xml:space="preserve">Cálculo de </w:t>
@@ -3405,8 +3462,9 @@
       <w:pPr>
         <w:pStyle w:val="Ttulo3"/>
       </w:pPr>
-      <w:bookmarkStart w:id="9" w:name="_Toc225170494"/>
-      <w:r>
+      <w:bookmarkStart w:id="9" w:name="_Toc225523994"/>
+      <w:r>
+        <w:lastRenderedPageBreak/>
         <w:t>Inspección del Proceso (Dinámica del Equipo)</w:t>
       </w:r>
       <w:bookmarkEnd w:id="9"/>
@@ -3515,12 +3573,129 @@
       <w:pPr>
         <w:pStyle w:val="Ttulo3"/>
       </w:pPr>
-      <w:bookmarkStart w:id="10" w:name="_Toc225170495"/>
+      <w:bookmarkStart w:id="10" w:name="_Toc225523995"/>
+      <w:r>
+        <w:t>Metas del próximo Sprint</w:t>
+      </w:r>
+      <w:bookmarkEnd w:id="10"/>
+    </w:p>
+    <w:p>
+      <w:pPr>
+        <w:spacing w:line="480" w:lineRule="auto"/>
+        <w:rPr>
+          <w:rFonts w:eastAsia="Times New Roman" w:cs="Times New Roman"/>
+          <w:szCs w:val="24"/>
+        </w:rPr>
+      </w:pPr>
+      <w:r>
+        <w:rPr>
+          <w:rFonts w:eastAsia="Times New Roman" w:cs="Times New Roman"/>
+          <w:szCs w:val="24"/>
+        </w:rPr>
+        <w:t xml:space="preserve">Mantener nuestra velocidad de 12-13 puntos, priorizando la estabilidad del </w:t>
+      </w:r>
+      <w:proofErr w:type="spellStart"/>
+      <w:r>
+        <w:rPr>
+          <w:rFonts w:eastAsia="Times New Roman" w:cs="Times New Roman"/>
+          <w:szCs w:val="24"/>
+        </w:rPr>
+        <w:t>Backend</w:t>
+      </w:r>
+      <w:proofErr w:type="spellEnd"/>
+      <w:r>
+        <w:rPr>
+          <w:rFonts w:eastAsia="Times New Roman" w:cs="Times New Roman"/>
+          <w:szCs w:val="24"/>
+        </w:rPr>
+        <w:t xml:space="preserve"> y la configuración de accesos por rol desde la base de datos.</w:t>
+      </w:r>
+    </w:p>
+    <w:p>
+      <w:pPr>
+        <w:spacing w:line="480" w:lineRule="auto"/>
+        <w:rPr>
+          <w:rFonts w:eastAsia="Times New Roman" w:cs="Times New Roman"/>
+          <w:szCs w:val="24"/>
+        </w:rPr>
+      </w:pPr>
+    </w:p>
+    <w:p>
+      <w:pPr>
+        <w:spacing w:line="480" w:lineRule="auto"/>
+        <w:rPr>
+          <w:rFonts w:eastAsia="Times New Roman" w:cs="Times New Roman"/>
+          <w:szCs w:val="24"/>
+        </w:rPr>
+      </w:pPr>
+    </w:p>
+    <w:p>
+      <w:pPr>
+        <w:spacing w:line="480" w:lineRule="auto"/>
+        <w:rPr>
+          <w:rFonts w:eastAsia="Times New Roman" w:cs="Times New Roman"/>
+          <w:szCs w:val="24"/>
+        </w:rPr>
+      </w:pPr>
+    </w:p>
+    <w:p>
+      <w:pPr>
+        <w:spacing w:line="480" w:lineRule="auto"/>
+        <w:rPr>
+          <w:rFonts w:eastAsia="Times New Roman" w:cs="Times New Roman"/>
+          <w:szCs w:val="24"/>
+        </w:rPr>
+      </w:pPr>
+    </w:p>
+    <w:p>
+      <w:pPr>
+        <w:spacing w:line="480" w:lineRule="auto"/>
+        <w:rPr>
+          <w:rFonts w:eastAsia="Times New Roman" w:cs="Times New Roman"/>
+          <w:szCs w:val="24"/>
+        </w:rPr>
+      </w:pPr>
+    </w:p>
+    <w:p>
+      <w:pPr>
+        <w:spacing w:line="480" w:lineRule="auto"/>
+        <w:rPr>
+          <w:rFonts w:eastAsia="Times New Roman" w:cs="Times New Roman"/>
+          <w:szCs w:val="24"/>
+        </w:rPr>
+      </w:pPr>
+    </w:p>
+    <w:p>
+      <w:pPr>
+        <w:spacing w:line="480" w:lineRule="auto"/>
+        <w:rPr>
+          <w:rFonts w:eastAsia="Times New Roman" w:cs="Times New Roman"/>
+          <w:szCs w:val="24"/>
+        </w:rPr>
+      </w:pPr>
+    </w:p>
+    <w:p>
+      <w:pPr>
+        <w:spacing w:line="480" w:lineRule="auto"/>
+        <w:rPr>
+          <w:rFonts w:eastAsia="Times New Roman" w:cs="Times New Roman"/>
+          <w:szCs w:val="24"/>
+        </w:rPr>
+      </w:pPr>
+    </w:p>
+    <w:p>
+      <w:pPr>
+        <w:pStyle w:val="Ttulo1"/>
+      </w:pPr>
+      <w:bookmarkStart w:id="11" w:name="_Toc225523996"/>
       <w:r>
         <w:lastRenderedPageBreak/>
-        <w:t>Metas del próximo Sprint</w:t>
-      </w:r>
-      <w:bookmarkEnd w:id="10"/>
+        <w:t>Sprint 2</w:t>
+      </w:r>
+      <w:bookmarkEnd w:id="11"/>
+      <w:r>
+        <w:t xml:space="preserve"> </w:t>
+      </w:r>
     </w:p>
     <w:p>
       <w:pPr>
@@ -3533,104 +3708,95 @@
       <w:r>
         <w:rPr>
           <w:rFonts w:eastAsia="Times New Roman" w:cs="Times New Roman"/>
-          <w:szCs w:val="24"/>
-        </w:rPr>
-        <w:t xml:space="preserve">Mantener nuestra velocidad de 12-13 puntos, priorizando la estabilidad del </w:t>
+          <w:b/>
+          <w:bCs/>
+          <w:szCs w:val="24"/>
+        </w:rPr>
+        <w:t xml:space="preserve">Fecha de inicio: </w:t>
+      </w:r>
+      <w:r>
+        <w:rPr>
+          <w:rFonts w:eastAsia="Times New Roman" w:cs="Times New Roman"/>
+          <w:szCs w:val="24"/>
+        </w:rPr>
+        <w:t xml:space="preserve">28 de febrero de 2026 </w:t>
+      </w:r>
+    </w:p>
+    <w:p>
+      <w:pPr>
+        <w:spacing w:line="480" w:lineRule="auto"/>
+        <w:rPr>
+          <w:rFonts w:eastAsia="Times New Roman" w:cs="Times New Roman"/>
+          <w:szCs w:val="24"/>
+        </w:rPr>
+      </w:pPr>
+      <w:r>
+        <w:rPr>
+          <w:rFonts w:eastAsia="Times New Roman" w:cs="Times New Roman"/>
+          <w:b/>
+          <w:bCs/>
+          <w:szCs w:val="24"/>
+        </w:rPr>
+        <w:t xml:space="preserve">Fecha de finalización: </w:t>
+      </w:r>
+      <w:r>
+        <w:rPr>
+          <w:rFonts w:eastAsia="Times New Roman" w:cs="Times New Roman"/>
+          <w:szCs w:val="24"/>
+        </w:rPr>
+        <w:t xml:space="preserve">13 de marzo de 2026 </w:t>
+      </w:r>
+    </w:p>
+    <w:p>
+      <w:pPr>
+        <w:spacing w:line="480" w:lineRule="auto"/>
+        <w:rPr>
+          <w:rFonts w:eastAsia="Times New Roman" w:cs="Times New Roman"/>
+          <w:szCs w:val="24"/>
+        </w:rPr>
+      </w:pPr>
+      <w:r>
+        <w:rPr>
+          <w:rFonts w:eastAsia="Times New Roman" w:cs="Times New Roman"/>
+          <w:b/>
+          <w:bCs/>
+          <w:szCs w:val="24"/>
+        </w:rPr>
+        <w:t xml:space="preserve">Fecha </w:t>
       </w:r>
       <w:proofErr w:type="spellStart"/>
       <w:r>
         <w:rPr>
           <w:rFonts w:eastAsia="Times New Roman" w:cs="Times New Roman"/>
-          <w:szCs w:val="24"/>
-        </w:rPr>
-        <w:t>Backend</w:t>
+          <w:b/>
+          <w:bCs/>
+          <w:szCs w:val="24"/>
+        </w:rPr>
+        <w:t>Review</w:t>
       </w:r>
       <w:proofErr w:type="spellEnd"/>
       <w:r>
         <w:rPr>
           <w:rFonts w:eastAsia="Times New Roman" w:cs="Times New Roman"/>
-          <w:szCs w:val="24"/>
-        </w:rPr>
-        <w:t xml:space="preserve"> y la configuración de accesos por rol desde la base de datos.</w:t>
-      </w:r>
-    </w:p>
-    <w:p>
-      <w:pPr>
-        <w:spacing w:line="480" w:lineRule="auto"/>
-        <w:rPr>
-          <w:rFonts w:eastAsia="Times New Roman" w:cs="Times New Roman"/>
-          <w:szCs w:val="24"/>
-        </w:rPr>
-      </w:pPr>
-    </w:p>
-    <w:p>
-      <w:pPr>
-        <w:pStyle w:val="Ttulo1"/>
-      </w:pPr>
-      <w:bookmarkStart w:id="11" w:name="_Toc225170496"/>
-      <w:r>
-        <w:t>Sprint 2</w:t>
-      </w:r>
-      <w:bookmarkEnd w:id="11"/>
-      <w:r>
-        <w:t xml:space="preserve"> </w:t>
-      </w:r>
-    </w:p>
-    <w:p>
-      <w:pPr>
-        <w:spacing w:line="480" w:lineRule="auto"/>
-        <w:rPr>
-          <w:rFonts w:eastAsia="Times New Roman" w:cs="Times New Roman"/>
-          <w:szCs w:val="24"/>
-        </w:rPr>
-      </w:pPr>
-      <w:r>
-        <w:rPr>
-          <w:rFonts w:eastAsia="Times New Roman" w:cs="Times New Roman"/>
-          <w:b/>
-          <w:bCs/>
-          <w:szCs w:val="24"/>
-        </w:rPr>
-        <w:t xml:space="preserve">Fecha de inicio: </w:t>
-      </w:r>
-      <w:r>
-        <w:rPr>
-          <w:rFonts w:eastAsia="Times New Roman" w:cs="Times New Roman"/>
-          <w:szCs w:val="24"/>
-        </w:rPr>
-        <w:t xml:space="preserve">28 de febrero de 2026 </w:t>
-      </w:r>
-    </w:p>
-    <w:p>
-      <w:pPr>
-        <w:spacing w:line="480" w:lineRule="auto"/>
-        <w:rPr>
-          <w:rFonts w:eastAsia="Times New Roman" w:cs="Times New Roman"/>
-          <w:szCs w:val="24"/>
-        </w:rPr>
-      </w:pPr>
-      <w:r>
-        <w:rPr>
-          <w:rFonts w:eastAsia="Times New Roman" w:cs="Times New Roman"/>
-          <w:b/>
-          <w:bCs/>
-          <w:szCs w:val="24"/>
-        </w:rPr>
-        <w:t xml:space="preserve">Fecha de finalización: </w:t>
-      </w:r>
-      <w:r>
-        <w:rPr>
-          <w:rFonts w:eastAsia="Times New Roman" w:cs="Times New Roman"/>
-          <w:szCs w:val="24"/>
-        </w:rPr>
-        <w:t xml:space="preserve">13 de marzo de 2026 </w:t>
+          <w:b/>
+          <w:bCs/>
+          <w:szCs w:val="24"/>
+        </w:rPr>
+        <w:t xml:space="preserve">/Retrospective: </w:t>
+      </w:r>
+      <w:r>
+        <w:rPr>
+          <w:rFonts w:eastAsia="Times New Roman" w:cs="Times New Roman"/>
+          <w:szCs w:val="24"/>
+        </w:rPr>
+        <w:t>26 de marzo de 2026</w:t>
       </w:r>
     </w:p>
     <w:p>
       <w:pPr>
         <w:pStyle w:val="Ttulo2"/>
       </w:pPr>
-      <w:bookmarkStart w:id="12" w:name="_Toc225170497"/>
+      <w:bookmarkStart w:id="12" w:name="_Toc225523997"/>
       <w:r>
         <w:t xml:space="preserve">Sprint </w:t>
       </w:r>
@@ -3651,7 +3817,7 @@
           <w:sz w:val="24"/>
         </w:rPr>
       </w:pPr>
-      <w:bookmarkStart w:id="13" w:name="_Toc225170498"/>
+      <w:bookmarkStart w:id="13" w:name="_Toc225523998"/>
       <w:r>
         <w:t xml:space="preserve">Historias de </w:t>
       </w:r>
@@ -3907,7 +4073,7 @@
           <w:sz w:val="24"/>
         </w:rPr>
       </w:pPr>
-      <w:bookmarkStart w:id="14" w:name="_Toc225170499"/>
+      <w:bookmarkStart w:id="14" w:name="_Toc225523999"/>
       <w:r>
         <w:t>Incremento del producto</w:t>
       </w:r>
@@ -4056,7 +4222,6 @@
           <w:bCs/>
           <w:szCs w:val="24"/>
         </w:rPr>
-        <w:lastRenderedPageBreak/>
         <w:t>HU-07 – Registro preclínico</w:t>
       </w:r>
       <w:r>
@@ -4112,6 +4277,7 @@
           <w:bCs/>
           <w:szCs w:val="24"/>
         </w:rPr>
+        <w:lastRenderedPageBreak/>
         <w:t>HU-08 – Registro de consulta médica</w:t>
       </w:r>
       <w:r>
@@ -4584,23 +4750,91 @@
     </w:p>
     <w:p>
       <w:pPr>
+        <w:pStyle w:val="Ttulo3"/>
+      </w:pPr>
+      <w:bookmarkStart w:id="15" w:name="_Toc225524000"/>
+      <w:proofErr w:type="spellStart"/>
+      <w:r>
+        <w:t>Feedback</w:t>
+      </w:r>
+      <w:proofErr w:type="spellEnd"/>
+      <w:r>
+        <w:t xml:space="preserve"> recibido</w:t>
+      </w:r>
+      <w:bookmarkEnd w:id="15"/>
+    </w:p>
+    <w:p>
+      <w:pPr>
+        <w:pStyle w:val="Prrafodelista"/>
+        <w:numPr>
+          <w:ilvl w:val="0"/>
+          <w:numId w:val="8"/>
+        </w:numPr>
+      </w:pPr>
+      <w:r>
+        <w:t xml:space="preserve">Mejorar la implementación del CD, verificar que todo el proceso de despliegue se hace correctamente. </w:t>
+      </w:r>
+    </w:p>
+    <w:p>
+      <w:pPr>
+        <w:pStyle w:val="Prrafodelista"/>
+        <w:numPr>
+          <w:ilvl w:val="0"/>
+          <w:numId w:val="8"/>
+        </w:numPr>
+      </w:pPr>
+      <w:r>
+        <w:t xml:space="preserve">Oportunidades de mejora en la aplicación de los patrones de diseño y principios SOLID </w:t>
+      </w:r>
+    </w:p>
+    <w:p>
+      <w:pPr>
+        <w:pStyle w:val="Prrafodelista"/>
+        <w:numPr>
+          <w:ilvl w:val="0"/>
+          <w:numId w:val="8"/>
+        </w:numPr>
+      </w:pPr>
+      <w:r>
+        <w:t xml:space="preserve">Mejorar la organización de las versiones (ramas), mantener estable la rama </w:t>
+      </w:r>
+      <w:proofErr w:type="spellStart"/>
+      <w:r>
+        <w:t>main</w:t>
+      </w:r>
+      <w:proofErr w:type="spellEnd"/>
+      <w:r>
+        <w:t xml:space="preserve"> con todos los cambios a mostrar en el </w:t>
+      </w:r>
+      <w:proofErr w:type="spellStart"/>
+      <w:r>
+        <w:t>review</w:t>
+      </w:r>
+      <w:proofErr w:type="spellEnd"/>
+      <w:r>
+        <w:t xml:space="preserve">. </w:t>
+      </w:r>
+    </w:p>
+    <w:p/>
+    <w:p>
+      <w:pPr>
         <w:pStyle w:val="Ttulo2"/>
       </w:pPr>
-      <w:bookmarkStart w:id="15" w:name="_Toc225170500"/>
+      <w:bookmarkStart w:id="16" w:name="_Toc225524001"/>
       <w:r>
         <w:t>Sprint Retrospective</w:t>
       </w:r>
-      <w:bookmarkEnd w:id="15"/>
+      <w:bookmarkEnd w:id="16"/>
     </w:p>
     <w:p>
       <w:pPr>
         <w:pStyle w:val="Ttulo3"/>
       </w:pPr>
-      <w:bookmarkStart w:id="16" w:name="_Toc225170501"/>
+      <w:bookmarkStart w:id="17" w:name="_Toc225524002"/>
       <w:r>
         <w:t>Análisis de la velocidad del equipo</w:t>
       </w:r>
-      <w:bookmarkEnd w:id="16"/>
+      <w:bookmarkEnd w:id="17"/>
       <w:r>
         <w:t xml:space="preserve"> </w:t>
       </w:r>
@@ -4672,16 +4906,8 @@
                 <w:color w:val="1F1F1F"/>
                 <w:szCs w:val="24"/>
               </w:rPr>
-              <w:t>Historia de Usuario (HU)</w:t>
-            </w:r>
-            <w:r>
-              <w:rPr>
-                <w:b/>
-                <w:bCs/>
-                <w:color w:val="1F1F1F"/>
-                <w:szCs w:val="24"/>
-              </w:rPr>
-              <w:t xml:space="preserve"> / Tarea Técnica (TT)</w:t>
+              <w:lastRenderedPageBreak/>
+              <w:t>Historia de Usuario (HU) / Tarea Técnica (TT)</w:t>
             </w:r>
           </w:p>
         </w:tc>
@@ -4795,7 +5021,6 @@
                 <w:color w:val="1F1F1F"/>
                 <w:szCs w:val="24"/>
               </w:rPr>
-              <w:lastRenderedPageBreak/>
               <w:t>HU-04:</w:t>
             </w:r>
             <w:r>
@@ -5914,13 +6139,14 @@
       <w:pPr>
         <w:pStyle w:val="Ttulo3"/>
       </w:pPr>
-      <w:bookmarkStart w:id="17" w:name="_Toc224125962"/>
-      <w:bookmarkStart w:id="18" w:name="_Toc225170502"/>
-      <w:r>
+      <w:bookmarkStart w:id="18" w:name="_Toc224125962"/>
+      <w:bookmarkStart w:id="19" w:name="_Toc225524003"/>
+      <w:r>
+        <w:lastRenderedPageBreak/>
         <w:t>Cálculo de velocidad</w:t>
       </w:r>
-      <w:bookmarkEnd w:id="17"/>
       <w:bookmarkEnd w:id="18"/>
+      <w:bookmarkEnd w:id="19"/>
     </w:p>
     <w:p>
       <w:r>
@@ -5928,9 +6154,6 @@
       </w:r>
       <w:r>
         <w:br/>
-      </w:r>
-      <w:r>
-        <w:lastRenderedPageBreak/>
         <w:t xml:space="preserve">Las tallas utilizadas en las tareas, han sido M y L; calculando estadísticamente que </w:t>
       </w:r>
       <w:r>
@@ -5960,16 +6183,15 @@
       </w:r>
     </w:p>
     <w:p/>
-    <w:p/>
     <w:p>
       <w:pPr>
         <w:pStyle w:val="Ttulo3"/>
       </w:pPr>
-      <w:bookmarkStart w:id="19" w:name="_Toc225170503"/>
+      <w:bookmarkStart w:id="20" w:name="_Toc225524004"/>
       <w:r>
         <w:t>Retrospectiva de la Dinámica del Equipo</w:t>
       </w:r>
-      <w:bookmarkEnd w:id="19"/>
+      <w:bookmarkEnd w:id="20"/>
     </w:p>
     <w:p>
       <w:pPr>
@@ -6172,11 +6394,11 @@
       <w:pPr>
         <w:pStyle w:val="Ttulo3"/>
       </w:pPr>
-      <w:bookmarkStart w:id="20" w:name="_Toc225170504"/>
+      <w:bookmarkStart w:id="21" w:name="_Toc225524005"/>
       <w:r>
         <w:t>Metas del próximo Sprint</w:t>
       </w:r>
-      <w:bookmarkEnd w:id="20"/>
+      <w:bookmarkEnd w:id="21"/>
     </w:p>
     <w:p>
       <w:r>
@@ -6365,6 +6587,119 @@
 <file path=word/numbering.xml><?xml version="1.0" encoding="utf-8"?>
 <w:numbering xmlns:wpc="http://schemas.microsoft.com/office/word/2010/wordprocessingCanvas" xmlns:cx="http://schemas.microsoft.com/office/drawing/2014/chartex" xmlns:cx1="http://schemas.microsoft.com/office/drawing/2015/9/8/chartex" xmlns:cx2="http://schemas.microsoft.com/office/drawing/2015/10/21/chartex" xmlns:cx3="http://schemas.microsoft.com/office/drawing/2016/5/9/chartex" xmlns:cx4="http://schemas.microsoft.com/office/drawing/2016/5/10/chartex" xmlns:cx5="http://schemas.microsoft.com/office/drawing/2016/5/11/chartex" xmlns:cx6="http://schemas.microsoft.com/office/drawing/2016/5/12/chartex" xmlns:cx7="http://schemas.microsoft.com/office/drawing/2016/5/13/chartex" xmlns:cx8="http://schemas.microsoft.com/office/drawing/2016/5/14/chartex" xmlns:mc="http://schemas.openxmlformats.org/markup-compatibility/2006" xmlns:aink="http://schemas.microsoft.com/office/drawing/2016/ink" xmlns:am3d="http://schemas.microsoft.com/office/drawing/2017/model3d" xmlns:o="urn:schemas-microsoft-com:office:office" xmlns:oel="http://schemas.microsoft.com/office/2019/extlst" xmlns:r="http://schemas.openxmlformats.org/officeDocument/2006/relationships" xmlns:m="http://schemas.openxmlformats.org/officeDocument/2006/math" xmlns:v="urn:schemas-microsoft-com:vml" xmlns:wp14="http://schemas.microsoft.com/office/word/2010/wordprocessingDrawing" xmlns:wp="http://schemas.openxmlformats.org/drawingml/2006/wordprocessingDrawing" xmlns:w10="urn:schemas-microsoft-com:office:word" xmlns:w="http://schemas.openxmlformats.org/wordprocessingml/2006/main" xmlns:w14="http://schemas.microsoft.com/office/word/2010/wordml" xmlns:w15="http://schemas.microsoft.com/office/word/2012/wordml" xmlns:w16cex="http://schemas.microsoft.com/office/word/2018/wordml/cex" xmlns:w16cid="http://schemas.microsoft.com/office/word/2016/wordml/cid" xmlns:w16="http://schemas.microsoft.com/office/word/2018/wordml" xmlns:w16du="http://schemas.microsoft.com/office/word/2023/wordml/word16du" xmlns:w16sdtdh="http://schemas.microsoft.com/office/word/2020/wordml/sdtdatahash" xmlns:w16sdtfl="http://schemas.microsoft.com/office/word/2024/wordml/sdtformatlock" xmlns:w16se="http://schemas.microsoft.com/office/word/2015/wordml/symex" xmlns:wpg="http://schemas.microsoft.com/office/word/2010/wordprocessingGroup" xmlns:wpi="http://schemas.microsoft.com/office/word/2010/wordprocessingInk" xmlns:wne="http://schemas.microsoft.com/office/word/2006/wordml" xmlns:wps="http://schemas.microsoft.com/office/word/2010/wordprocessingShape" mc:Ignorable="w14 w15 w16se w16cid w16 w16cex w16sdtdh w16sdtfl w16du wp14">
   <w:abstractNum w:abstractNumId="0" w15:restartNumberingAfterBreak="0">
+    <w:nsid w:val="09E65AE5"/>
+    <w:multiLevelType w:val="hybridMultilevel"/>
+    <w:tmpl w:val="BC6AD39A"/>
+    <w:lvl w:ilvl="0" w:tplc="480A0001">
+      <w:start w:val="1"/>
+      <w:numFmt w:val="bullet"/>
+      <w:lvlText w:val=""/>
+      <w:lvlJc w:val="left"/>
+      <w:pPr>
+        <w:ind w:left="720" w:hanging="360"/>
+      </w:pPr>
+      <w:rPr>
+        <w:rFonts w:ascii="Symbol" w:hAnsi="Symbol" w:hint="default"/>
+      </w:rPr>
+    </w:lvl>
+    <w:lvl w:ilvl="1" w:tplc="480A0003" w:tentative="1">
+      <w:start w:val="1"/>
+      <w:numFmt w:val="bullet"/>
+      <w:lvlText w:val="o"/>
+      <w:lvlJc w:val="left"/>
+      <w:pPr>
+        <w:ind w:left="1440" w:hanging="360"/>
+      </w:pPr>
+      <w:rPr>
+        <w:rFonts w:ascii="Courier New" w:hAnsi="Courier New" w:cs="Courier New" w:hint="default"/>
+      </w:rPr>
+    </w:lvl>
+    <w:lvl w:ilvl="2" w:tplc="480A0005" w:tentative="1">
+      <w:start w:val="1"/>
+      <w:numFmt w:val="bullet"/>
+      <w:lvlText w:val=""/>
+      <w:lvlJc w:val="left"/>
+      <w:pPr>
+        <w:ind w:left="2160" w:hanging="360"/>
+      </w:pPr>
+      <w:rPr>
+        <w:rFonts w:ascii="Wingdings" w:hAnsi="Wingdings" w:hint="default"/>
+      </w:rPr>
+    </w:lvl>
+    <w:lvl w:ilvl="3" w:tplc="480A0001" w:tentative="1">
+      <w:start w:val="1"/>
+      <w:numFmt w:val="bullet"/>
+      <w:lvlText w:val=""/>
+      <w:lvlJc w:val="left"/>
+      <w:pPr>
+        <w:ind w:left="2880" w:hanging="360"/>
+      </w:pPr>
+      <w:rPr>
+        <w:rFonts w:ascii="Symbol" w:hAnsi="Symbol" w:hint="default"/>
+      </w:rPr>
+    </w:lvl>
+    <w:lvl w:ilvl="4" w:tplc="480A0003" w:tentative="1">
+      <w:start w:val="1"/>
+      <w:numFmt w:val="bullet"/>
+      <w:lvlText w:val="o"/>
+      <w:lvlJc w:val="left"/>
+      <w:pPr>
+        <w:ind w:left="3600" w:hanging="360"/>
+      </w:pPr>
+      <w:rPr>
+        <w:rFonts w:ascii="Courier New" w:hAnsi="Courier New" w:cs="Courier New" w:hint="default"/>
+      </w:rPr>
+    </w:lvl>
+    <w:lvl w:ilvl="5" w:tplc="480A0005" w:tentative="1">
+      <w:start w:val="1"/>
+      <w:numFmt w:val="bullet"/>
+      <w:lvlText w:val=""/>
+      <w:lvlJc w:val="left"/>
+      <w:pPr>
+        <w:ind w:left="4320" w:hanging="360"/>
+      </w:pPr>
+      <w:rPr>
+        <w:rFonts w:ascii="Wingdings" w:hAnsi="Wingdings" w:hint="default"/>
+      </w:rPr>
+    </w:lvl>
+    <w:lvl w:ilvl="6" w:tplc="480A0001" w:tentative="1">
+      <w:start w:val="1"/>
+      <w:numFmt w:val="bullet"/>
+      <w:lvlText w:val=""/>
+      <w:lvlJc w:val="left"/>
+      <w:pPr>
+        <w:ind w:left="5040" w:hanging="360"/>
+      </w:pPr>
+      <w:rPr>
+        <w:rFonts w:ascii="Symbol" w:hAnsi="Symbol" w:hint="default"/>
+      </w:rPr>
+    </w:lvl>
+    <w:lvl w:ilvl="7" w:tplc="480A0003" w:tentative="1">
+      <w:start w:val="1"/>
+      <w:numFmt w:val="bullet"/>
+      <w:lvlText w:val="o"/>
+      <w:lvlJc w:val="left"/>
+      <w:pPr>
+        <w:ind w:left="5760" w:hanging="360"/>
+      </w:pPr>
+      <w:rPr>
+        <w:rFonts w:ascii="Courier New" w:hAnsi="Courier New" w:cs="Courier New" w:hint="default"/>
+      </w:rPr>
+    </w:lvl>
+    <w:lvl w:ilvl="8" w:tplc="480A0005" w:tentative="1">
+      <w:start w:val="1"/>
+      <w:numFmt w:val="bullet"/>
+      <w:lvlText w:val=""/>
+      <w:lvlJc w:val="left"/>
+      <w:pPr>
+        <w:ind w:left="6480" w:hanging="360"/>
+      </w:pPr>
+      <w:rPr>
+        <w:rFonts w:ascii="Wingdings" w:hAnsi="Wingdings" w:hint="default"/>
+      </w:rPr>
+    </w:lvl>
+  </w:abstractNum>
+  <w:abstractNum w:abstractNumId="1" w15:restartNumberingAfterBreak="0">
     <w:nsid w:val="17974104"/>
     <w:multiLevelType w:val="multilevel"/>
     <w:tmpl w:val="F20C37AA"/>
@@ -6477,7 +6812,7 @@
       </w:rPr>
     </w:lvl>
   </w:abstractNum>
-  <w:abstractNum w:abstractNumId="1" w15:restartNumberingAfterBreak="0">
+  <w:abstractNum w:abstractNumId="2" w15:restartNumberingAfterBreak="0">
     <w:nsid w:val="34196877"/>
     <w:multiLevelType w:val="hybridMultilevel"/>
     <w:tmpl w:val="D04EC110"/>
@@ -6590,7 +6925,7 @@
       </w:rPr>
     </w:lvl>
   </w:abstractNum>
-  <w:abstractNum w:abstractNumId="2" w15:restartNumberingAfterBreak="0">
+  <w:abstractNum w:abstractNumId="3" w15:restartNumberingAfterBreak="0">
     <w:nsid w:val="4B4F6C6D"/>
     <w:multiLevelType w:val="hybridMultilevel"/>
     <w:tmpl w:val="159C86F2"/>
@@ -6703,7 +7038,7 @@
       </w:rPr>
     </w:lvl>
   </w:abstractNum>
-  <w:abstractNum w:abstractNumId="3" w15:restartNumberingAfterBreak="0">
+  <w:abstractNum w:abstractNumId="4" w15:restartNumberingAfterBreak="0">
     <w:nsid w:val="56D4541B"/>
     <w:multiLevelType w:val="multilevel"/>
     <w:tmpl w:val="A3547C44"/>
@@ -6816,7 +7151,7 @@
       </w:rPr>
     </w:lvl>
   </w:abstractNum>
-  <w:abstractNum w:abstractNumId="4" w15:restartNumberingAfterBreak="0">
+  <w:abstractNum w:abstractNumId="5" w15:restartNumberingAfterBreak="0">
     <w:nsid w:val="6C0551D0"/>
     <w:multiLevelType w:val="multilevel"/>
     <w:tmpl w:val="638C7918"/>
@@ -6929,7 +7264,7 @@
       </w:rPr>
     </w:lvl>
   </w:abstractNum>
-  <w:abstractNum w:abstractNumId="5" w15:restartNumberingAfterBreak="0">
+  <w:abstractNum w:abstractNumId="6" w15:restartNumberingAfterBreak="0">
     <w:nsid w:val="70234DD8"/>
     <w:multiLevelType w:val="multilevel"/>
     <w:tmpl w:val="638C7918"/>
@@ -7042,7 +7377,7 @@
       </w:rPr>
     </w:lvl>
   </w:abstractNum>
-  <w:abstractNum w:abstractNumId="6" w15:restartNumberingAfterBreak="0">
+  <w:abstractNum w:abstractNumId="7" w15:restartNumberingAfterBreak="0">
     <w:nsid w:val="7CA51E71"/>
     <w:multiLevelType w:val="multilevel"/>
     <w:tmpl w:val="14901C0C"/>
@@ -7156,25 +7491,28 @@
     </w:lvl>
   </w:abstractNum>
   <w:num w:numId="1" w16cid:durableId="1439787843">
+    <w:abstractNumId w:val="6"/>
+  </w:num>
+  <w:num w:numId="2" w16cid:durableId="446241866">
+    <w:abstractNumId w:val="4"/>
+  </w:num>
+  <w:num w:numId="3" w16cid:durableId="307634270">
+    <w:abstractNumId w:val="1"/>
+  </w:num>
+  <w:num w:numId="4" w16cid:durableId="1092318485">
+    <w:abstractNumId w:val="7"/>
+  </w:num>
+  <w:num w:numId="5" w16cid:durableId="1329558205">
     <w:abstractNumId w:val="5"/>
   </w:num>
-  <w:num w:numId="2" w16cid:durableId="446241866">
+  <w:num w:numId="6" w16cid:durableId="1528325871">
+    <w:abstractNumId w:val="2"/>
+  </w:num>
+  <w:num w:numId="7" w16cid:durableId="310602293">
     <w:abstractNumId w:val="3"/>
   </w:num>
-  <w:num w:numId="3" w16cid:durableId="307634270">
+  <w:num w:numId="8" w16cid:durableId="786847853">
     <w:abstractNumId w:val="0"/>
-  </w:num>
-  <w:num w:numId="4" w16cid:durableId="1092318485">
-    <w:abstractNumId w:val="6"/>
-  </w:num>
-  <w:num w:numId="5" w16cid:durableId="1329558205">
-    <w:abstractNumId w:val="4"/>
-  </w:num>
-  <w:num w:numId="6" w16cid:durableId="1528325871">
-    <w:abstractNumId w:val="1"/>
-  </w:num>
-  <w:num w:numId="7" w16cid:durableId="310602293">
-    <w:abstractNumId w:val="2"/>
   </w:num>
 </w:numbering>
 </file>

</xml_diff>

<commit_message>
docs: actualización sprint 4
</commit_message>
<xml_diff>
--- a/docs/events/review-retrospective-kaizen.docx
+++ b/docs/events/review-retrospective-kaizen.docx
@@ -182,7 +182,7 @@
           <w:r>
             <w:fldChar w:fldCharType="separate"/>
           </w:r>
-          <w:hyperlink w:anchor="_Toc226897745" w:history="1">
+          <w:hyperlink w:anchor="_Toc226927126" w:history="1">
             <w:r>
               <w:rPr>
                 <w:rStyle w:val="Hipervnculo"/>
@@ -209,7 +209,7 @@
                 <w:noProof/>
                 <w:webHidden/>
               </w:rPr>
-              <w:instrText xml:space="preserve"> PAGEREF _Toc226897745 \h </w:instrText>
+              <w:instrText xml:space="preserve"> PAGEREF _Toc226927126 \h </w:instrText>
             </w:r>
             <w:r>
               <w:rPr>
@@ -255,7 +255,7 @@
               <w14:ligatures w14:val="standardContextual"/>
             </w:rPr>
           </w:pPr>
-          <w:hyperlink w:anchor="_Toc226897746" w:history="1">
+          <w:hyperlink w:anchor="_Toc226927127" w:history="1">
             <w:r>
               <w:rPr>
                 <w:rStyle w:val="Hipervnculo"/>
@@ -282,7 +282,7 @@
                 <w:noProof/>
                 <w:webHidden/>
               </w:rPr>
-              <w:instrText xml:space="preserve"> PAGEREF _Toc226897746 \h </w:instrText>
+              <w:instrText xml:space="preserve"> PAGEREF _Toc226927127 \h </w:instrText>
             </w:r>
             <w:r>
               <w:rPr>
@@ -328,7 +328,7 @@
               <w14:ligatures w14:val="standardContextual"/>
             </w:rPr>
           </w:pPr>
-          <w:hyperlink w:anchor="_Toc226897747" w:history="1">
+          <w:hyperlink w:anchor="_Toc226927128" w:history="1">
             <w:r>
               <w:rPr>
                 <w:rStyle w:val="Hipervnculo"/>
@@ -355,7 +355,7 @@
                 <w:noProof/>
                 <w:webHidden/>
               </w:rPr>
-              <w:instrText xml:space="preserve"> PAGEREF _Toc226897747 \h </w:instrText>
+              <w:instrText xml:space="preserve"> PAGEREF _Toc226927128 \h </w:instrText>
             </w:r>
             <w:r>
               <w:rPr>
@@ -401,7 +401,7 @@
               <w14:ligatures w14:val="standardContextual"/>
             </w:rPr>
           </w:pPr>
-          <w:hyperlink w:anchor="_Toc226897748" w:history="1">
+          <w:hyperlink w:anchor="_Toc226927129" w:history="1">
             <w:r>
               <w:rPr>
                 <w:rStyle w:val="Hipervnculo"/>
@@ -428,7 +428,7 @@
                 <w:noProof/>
                 <w:webHidden/>
               </w:rPr>
-              <w:instrText xml:space="preserve"> PAGEREF _Toc226897748 \h </w:instrText>
+              <w:instrText xml:space="preserve"> PAGEREF _Toc226927129 \h </w:instrText>
             </w:r>
             <w:r>
               <w:rPr>
@@ -474,7 +474,7 @@
               <w14:ligatures w14:val="standardContextual"/>
             </w:rPr>
           </w:pPr>
-          <w:hyperlink w:anchor="_Toc226897749" w:history="1">
+          <w:hyperlink w:anchor="_Toc226927130" w:history="1">
             <w:r>
               <w:rPr>
                 <w:rStyle w:val="Hipervnculo"/>
@@ -501,7 +501,7 @@
                 <w:noProof/>
                 <w:webHidden/>
               </w:rPr>
-              <w:instrText xml:space="preserve"> PAGEREF _Toc226897749 \h </w:instrText>
+              <w:instrText xml:space="preserve"> PAGEREF _Toc226927130 \h </w:instrText>
             </w:r>
             <w:r>
               <w:rPr>
@@ -547,7 +547,7 @@
               <w14:ligatures w14:val="standardContextual"/>
             </w:rPr>
           </w:pPr>
-          <w:hyperlink w:anchor="_Toc226897750" w:history="1">
+          <w:hyperlink w:anchor="_Toc226927131" w:history="1">
             <w:r>
               <w:rPr>
                 <w:rStyle w:val="Hipervnculo"/>
@@ -574,7 +574,7 @@
                 <w:noProof/>
                 <w:webHidden/>
               </w:rPr>
-              <w:instrText xml:space="preserve"> PAGEREF _Toc226897750 \h </w:instrText>
+              <w:instrText xml:space="preserve"> PAGEREF _Toc226927131 \h </w:instrText>
             </w:r>
             <w:r>
               <w:rPr>
@@ -620,7 +620,7 @@
               <w14:ligatures w14:val="standardContextual"/>
             </w:rPr>
           </w:pPr>
-          <w:hyperlink w:anchor="_Toc226897751" w:history="1">
+          <w:hyperlink w:anchor="_Toc226927132" w:history="1">
             <w:r>
               <w:rPr>
                 <w:rStyle w:val="Hipervnculo"/>
@@ -647,7 +647,7 @@
                 <w:noProof/>
                 <w:webHidden/>
               </w:rPr>
-              <w:instrText xml:space="preserve"> PAGEREF _Toc226897751 \h </w:instrText>
+              <w:instrText xml:space="preserve"> PAGEREF _Toc226927132 \h </w:instrText>
             </w:r>
             <w:r>
               <w:rPr>
@@ -693,7 +693,7 @@
               <w14:ligatures w14:val="standardContextual"/>
             </w:rPr>
           </w:pPr>
-          <w:hyperlink w:anchor="_Toc226897752" w:history="1">
+          <w:hyperlink w:anchor="_Toc226927133" w:history="1">
             <w:r>
               <w:rPr>
                 <w:rStyle w:val="Hipervnculo"/>
@@ -720,7 +720,7 @@
                 <w:noProof/>
                 <w:webHidden/>
               </w:rPr>
-              <w:instrText xml:space="preserve"> PAGEREF _Toc226897752 \h </w:instrText>
+              <w:instrText xml:space="preserve"> PAGEREF _Toc226927133 \h </w:instrText>
             </w:r>
             <w:r>
               <w:rPr>
@@ -766,7 +766,7 @@
               <w14:ligatures w14:val="standardContextual"/>
             </w:rPr>
           </w:pPr>
-          <w:hyperlink w:anchor="_Toc226897753" w:history="1">
+          <w:hyperlink w:anchor="_Toc226927134" w:history="1">
             <w:r>
               <w:rPr>
                 <w:rStyle w:val="Hipervnculo"/>
@@ -793,7 +793,7 @@
                 <w:noProof/>
                 <w:webHidden/>
               </w:rPr>
-              <w:instrText xml:space="preserve"> PAGEREF _Toc226897753 \h </w:instrText>
+              <w:instrText xml:space="preserve"> PAGEREF _Toc226927134 \h </w:instrText>
             </w:r>
             <w:r>
               <w:rPr>
@@ -839,7 +839,7 @@
               <w14:ligatures w14:val="standardContextual"/>
             </w:rPr>
           </w:pPr>
-          <w:hyperlink w:anchor="_Toc226897754" w:history="1">
+          <w:hyperlink w:anchor="_Toc226927135" w:history="1">
             <w:r>
               <w:rPr>
                 <w:rStyle w:val="Hipervnculo"/>
@@ -866,7 +866,7 @@
                 <w:noProof/>
                 <w:webHidden/>
               </w:rPr>
-              <w:instrText xml:space="preserve"> PAGEREF _Toc226897754 \h </w:instrText>
+              <w:instrText xml:space="preserve"> PAGEREF _Toc226927135 \h </w:instrText>
             </w:r>
             <w:r>
               <w:rPr>
@@ -912,7 +912,7 @@
               <w14:ligatures w14:val="standardContextual"/>
             </w:rPr>
           </w:pPr>
-          <w:hyperlink w:anchor="_Toc226897755" w:history="1">
+          <w:hyperlink w:anchor="_Toc226927136" w:history="1">
             <w:r>
               <w:rPr>
                 <w:rStyle w:val="Hipervnculo"/>
@@ -939,7 +939,7 @@
                 <w:noProof/>
                 <w:webHidden/>
               </w:rPr>
-              <w:instrText xml:space="preserve"> PAGEREF _Toc226897755 \h </w:instrText>
+              <w:instrText xml:space="preserve"> PAGEREF _Toc226927136 \h </w:instrText>
             </w:r>
             <w:r>
               <w:rPr>
@@ -985,7 +985,7 @@
               <w14:ligatures w14:val="standardContextual"/>
             </w:rPr>
           </w:pPr>
-          <w:hyperlink w:anchor="_Toc226897756" w:history="1">
+          <w:hyperlink w:anchor="_Toc226927137" w:history="1">
             <w:r>
               <w:rPr>
                 <w:rStyle w:val="Hipervnculo"/>
@@ -1012,7 +1012,7 @@
                 <w:noProof/>
                 <w:webHidden/>
               </w:rPr>
-              <w:instrText xml:space="preserve"> PAGEREF _Toc226897756 \h </w:instrText>
+              <w:instrText xml:space="preserve"> PAGEREF _Toc226927137 \h </w:instrText>
             </w:r>
             <w:r>
               <w:rPr>
@@ -1058,7 +1058,7 @@
               <w14:ligatures w14:val="standardContextual"/>
             </w:rPr>
           </w:pPr>
-          <w:hyperlink w:anchor="_Toc226897757" w:history="1">
+          <w:hyperlink w:anchor="_Toc226927138" w:history="1">
             <w:r>
               <w:rPr>
                 <w:rStyle w:val="Hipervnculo"/>
@@ -1085,7 +1085,7 @@
                 <w:noProof/>
                 <w:webHidden/>
               </w:rPr>
-              <w:instrText xml:space="preserve"> PAGEREF _Toc226897757 \h </w:instrText>
+              <w:instrText xml:space="preserve"> PAGEREF _Toc226927138 \h </w:instrText>
             </w:r>
             <w:r>
               <w:rPr>
@@ -1131,7 +1131,7 @@
               <w14:ligatures w14:val="standardContextual"/>
             </w:rPr>
           </w:pPr>
-          <w:hyperlink w:anchor="_Toc226897758" w:history="1">
+          <w:hyperlink w:anchor="_Toc226927139" w:history="1">
             <w:r>
               <w:rPr>
                 <w:rStyle w:val="Hipervnculo"/>
@@ -1158,7 +1158,7 @@
                 <w:noProof/>
                 <w:webHidden/>
               </w:rPr>
-              <w:instrText xml:space="preserve"> PAGEREF _Toc226897758 \h </w:instrText>
+              <w:instrText xml:space="preserve"> PAGEREF _Toc226927139 \h </w:instrText>
             </w:r>
             <w:r>
               <w:rPr>
@@ -1204,7 +1204,7 @@
               <w14:ligatures w14:val="standardContextual"/>
             </w:rPr>
           </w:pPr>
-          <w:hyperlink w:anchor="_Toc226897759" w:history="1">
+          <w:hyperlink w:anchor="_Toc226927140" w:history="1">
             <w:r>
               <w:rPr>
                 <w:rStyle w:val="Hipervnculo"/>
@@ -1231,7 +1231,7 @@
                 <w:noProof/>
                 <w:webHidden/>
               </w:rPr>
-              <w:instrText xml:space="preserve"> PAGEREF _Toc226897759 \h </w:instrText>
+              <w:instrText xml:space="preserve"> PAGEREF _Toc226927140 \h </w:instrText>
             </w:r>
             <w:r>
               <w:rPr>
@@ -1277,7 +1277,7 @@
               <w14:ligatures w14:val="standardContextual"/>
             </w:rPr>
           </w:pPr>
-          <w:hyperlink w:anchor="_Toc226897760" w:history="1">
+          <w:hyperlink w:anchor="_Toc226927141" w:history="1">
             <w:r>
               <w:rPr>
                 <w:rStyle w:val="Hipervnculo"/>
@@ -1304,7 +1304,7 @@
                 <w:noProof/>
                 <w:webHidden/>
               </w:rPr>
-              <w:instrText xml:space="preserve"> PAGEREF _Toc226897760 \h </w:instrText>
+              <w:instrText xml:space="preserve"> PAGEREF _Toc226927141 \h </w:instrText>
             </w:r>
             <w:r>
               <w:rPr>
@@ -1350,7 +1350,7 @@
               <w14:ligatures w14:val="standardContextual"/>
             </w:rPr>
           </w:pPr>
-          <w:hyperlink w:anchor="_Toc226897761" w:history="1">
+          <w:hyperlink w:anchor="_Toc226927142" w:history="1">
             <w:r>
               <w:rPr>
                 <w:rStyle w:val="Hipervnculo"/>
@@ -1377,7 +1377,7 @@
                 <w:noProof/>
                 <w:webHidden/>
               </w:rPr>
-              <w:instrText xml:space="preserve"> PAGEREF _Toc226897761 \h </w:instrText>
+              <w:instrText xml:space="preserve"> PAGEREF _Toc226927142 \h </w:instrText>
             </w:r>
             <w:r>
               <w:rPr>
@@ -1423,7 +1423,7 @@
               <w14:ligatures w14:val="standardContextual"/>
             </w:rPr>
           </w:pPr>
-          <w:hyperlink w:anchor="_Toc226897762" w:history="1">
+          <w:hyperlink w:anchor="_Toc226927143" w:history="1">
             <w:r>
               <w:rPr>
                 <w:rStyle w:val="Hipervnculo"/>
@@ -1450,7 +1450,7 @@
                 <w:noProof/>
                 <w:webHidden/>
               </w:rPr>
-              <w:instrText xml:space="preserve"> PAGEREF _Toc226897762 \h </w:instrText>
+              <w:instrText xml:space="preserve"> PAGEREF _Toc226927143 \h </w:instrText>
             </w:r>
             <w:r>
               <w:rPr>
@@ -1496,7 +1496,7 @@
               <w14:ligatures w14:val="standardContextual"/>
             </w:rPr>
           </w:pPr>
-          <w:hyperlink w:anchor="_Toc226897763" w:history="1">
+          <w:hyperlink w:anchor="_Toc226927144" w:history="1">
             <w:r>
               <w:rPr>
                 <w:rStyle w:val="Hipervnculo"/>
@@ -1523,7 +1523,7 @@
                 <w:noProof/>
                 <w:webHidden/>
               </w:rPr>
-              <w:instrText xml:space="preserve"> PAGEREF _Toc226897763 \h </w:instrText>
+              <w:instrText xml:space="preserve"> PAGEREF _Toc226927144 \h </w:instrText>
             </w:r>
             <w:r>
               <w:rPr>
@@ -1569,7 +1569,7 @@
               <w14:ligatures w14:val="standardContextual"/>
             </w:rPr>
           </w:pPr>
-          <w:hyperlink w:anchor="_Toc226897764" w:history="1">
+          <w:hyperlink w:anchor="_Toc226927145" w:history="1">
             <w:r>
               <w:rPr>
                 <w:rStyle w:val="Hipervnculo"/>
@@ -1596,7 +1596,7 @@
                 <w:noProof/>
                 <w:webHidden/>
               </w:rPr>
-              <w:instrText xml:space="preserve"> PAGEREF _Toc226897764 \h </w:instrText>
+              <w:instrText xml:space="preserve"> PAGEREF _Toc226927145 \h </w:instrText>
             </w:r>
             <w:r>
               <w:rPr>
@@ -1642,7 +1642,7 @@
               <w14:ligatures w14:val="standardContextual"/>
             </w:rPr>
           </w:pPr>
-          <w:hyperlink w:anchor="_Toc226897765" w:history="1">
+          <w:hyperlink w:anchor="_Toc226927146" w:history="1">
             <w:r>
               <w:rPr>
                 <w:rStyle w:val="Hipervnculo"/>
@@ -1669,7 +1669,7 @@
                 <w:noProof/>
                 <w:webHidden/>
               </w:rPr>
-              <w:instrText xml:space="preserve"> PAGEREF _Toc226897765 \h </w:instrText>
+              <w:instrText xml:space="preserve"> PAGEREF _Toc226927146 \h </w:instrText>
             </w:r>
             <w:r>
               <w:rPr>
@@ -1715,7 +1715,7 @@
               <w14:ligatures w14:val="standardContextual"/>
             </w:rPr>
           </w:pPr>
-          <w:hyperlink w:anchor="_Toc226897766" w:history="1">
+          <w:hyperlink w:anchor="_Toc226927147" w:history="1">
             <w:r>
               <w:rPr>
                 <w:rStyle w:val="Hipervnculo"/>
@@ -1742,7 +1742,7 @@
                 <w:noProof/>
                 <w:webHidden/>
               </w:rPr>
-              <w:instrText xml:space="preserve"> PAGEREF _Toc226897766 \h </w:instrText>
+              <w:instrText xml:space="preserve"> PAGEREF _Toc226927147 \h </w:instrText>
             </w:r>
             <w:r>
               <w:rPr>
@@ -1788,7 +1788,7 @@
               <w14:ligatures w14:val="standardContextual"/>
             </w:rPr>
           </w:pPr>
-          <w:hyperlink w:anchor="_Toc226897767" w:history="1">
+          <w:hyperlink w:anchor="_Toc226927148" w:history="1">
             <w:r>
               <w:rPr>
                 <w:rStyle w:val="Hipervnculo"/>
@@ -1815,7 +1815,7 @@
                 <w:noProof/>
                 <w:webHidden/>
               </w:rPr>
-              <w:instrText xml:space="preserve"> PAGEREF _Toc226897767 \h </w:instrText>
+              <w:instrText xml:space="preserve"> PAGEREF _Toc226927148 \h </w:instrText>
             </w:r>
             <w:r>
               <w:rPr>
@@ -1861,7 +1861,7 @@
               <w14:ligatures w14:val="standardContextual"/>
             </w:rPr>
           </w:pPr>
-          <w:hyperlink w:anchor="_Toc226897768" w:history="1">
+          <w:hyperlink w:anchor="_Toc226927149" w:history="1">
             <w:r>
               <w:rPr>
                 <w:rStyle w:val="Hipervnculo"/>
@@ -1888,7 +1888,7 @@
                 <w:noProof/>
                 <w:webHidden/>
               </w:rPr>
-              <w:instrText xml:space="preserve"> PAGEREF _Toc226897768 \h </w:instrText>
+              <w:instrText xml:space="preserve"> PAGEREF _Toc226927149 \h </w:instrText>
             </w:r>
             <w:r>
               <w:rPr>
@@ -1934,7 +1934,7 @@
               <w14:ligatures w14:val="standardContextual"/>
             </w:rPr>
           </w:pPr>
-          <w:hyperlink w:anchor="_Toc226897769" w:history="1">
+          <w:hyperlink w:anchor="_Toc226927150" w:history="1">
             <w:r>
               <w:rPr>
                 <w:rStyle w:val="Hipervnculo"/>
@@ -1961,7 +1961,7 @@
                 <w:noProof/>
                 <w:webHidden/>
               </w:rPr>
-              <w:instrText xml:space="preserve"> PAGEREF _Toc226897769 \h </w:instrText>
+              <w:instrText xml:space="preserve"> PAGEREF _Toc226927150 \h </w:instrText>
             </w:r>
             <w:r>
               <w:rPr>
@@ -2007,7 +2007,7 @@
               <w14:ligatures w14:val="standardContextual"/>
             </w:rPr>
           </w:pPr>
-          <w:hyperlink w:anchor="_Toc226897770" w:history="1">
+          <w:hyperlink w:anchor="_Toc226927151" w:history="1">
             <w:r>
               <w:rPr>
                 <w:rStyle w:val="Hipervnculo"/>
@@ -2034,7 +2034,7 @@
                 <w:noProof/>
                 <w:webHidden/>
               </w:rPr>
-              <w:instrText xml:space="preserve"> PAGEREF _Toc226897770 \h </w:instrText>
+              <w:instrText xml:space="preserve"> PAGEREF _Toc226927151 \h </w:instrText>
             </w:r>
             <w:r>
               <w:rPr>
@@ -2080,7 +2080,7 @@
               <w14:ligatures w14:val="standardContextual"/>
             </w:rPr>
           </w:pPr>
-          <w:hyperlink w:anchor="_Toc226897771" w:history="1">
+          <w:hyperlink w:anchor="_Toc226927152" w:history="1">
             <w:r>
               <w:rPr>
                 <w:rStyle w:val="Hipervnculo"/>
@@ -2107,7 +2107,7 @@
                 <w:noProof/>
                 <w:webHidden/>
               </w:rPr>
-              <w:instrText xml:space="preserve"> PAGEREF _Toc226897771 \h </w:instrText>
+              <w:instrText xml:space="preserve"> PAGEREF _Toc226927152 \h </w:instrText>
             </w:r>
             <w:r>
               <w:rPr>
@@ -2153,7 +2153,7 @@
               <w14:ligatures w14:val="standardContextual"/>
             </w:rPr>
           </w:pPr>
-          <w:hyperlink w:anchor="_Toc226897772" w:history="1">
+          <w:hyperlink w:anchor="_Toc226927153" w:history="1">
             <w:r>
               <w:rPr>
                 <w:rStyle w:val="Hipervnculo"/>
@@ -2180,7 +2180,7 @@
                 <w:noProof/>
                 <w:webHidden/>
               </w:rPr>
-              <w:instrText xml:space="preserve"> PAGEREF _Toc226897772 \h </w:instrText>
+              <w:instrText xml:space="preserve"> PAGEREF _Toc226927153 \h </w:instrText>
             </w:r>
             <w:r>
               <w:rPr>
@@ -2226,7 +2226,7 @@
               <w14:ligatures w14:val="standardContextual"/>
             </w:rPr>
           </w:pPr>
-          <w:hyperlink w:anchor="_Toc226897773" w:history="1">
+          <w:hyperlink w:anchor="_Toc226927154" w:history="1">
             <w:r>
               <w:rPr>
                 <w:rStyle w:val="Hipervnculo"/>
@@ -2253,7 +2253,7 @@
                 <w:noProof/>
                 <w:webHidden/>
               </w:rPr>
-              <w:instrText xml:space="preserve"> PAGEREF _Toc226897773 \h </w:instrText>
+              <w:instrText xml:space="preserve"> PAGEREF _Toc226927154 \h </w:instrText>
             </w:r>
             <w:r>
               <w:rPr>
@@ -2299,7 +2299,7 @@
               <w14:ligatures w14:val="standardContextual"/>
             </w:rPr>
           </w:pPr>
-          <w:hyperlink w:anchor="_Toc226897774" w:history="1">
+          <w:hyperlink w:anchor="_Toc226927155" w:history="1">
             <w:r>
               <w:rPr>
                 <w:rStyle w:val="Hipervnculo"/>
@@ -2326,7 +2326,7 @@
                 <w:noProof/>
                 <w:webHidden/>
               </w:rPr>
-              <w:instrText xml:space="preserve"> PAGEREF _Toc226897774 \h </w:instrText>
+              <w:instrText xml:space="preserve"> PAGEREF _Toc226927155 \h </w:instrText>
             </w:r>
             <w:r>
               <w:rPr>
@@ -2372,7 +2372,7 @@
               <w14:ligatures w14:val="standardContextual"/>
             </w:rPr>
           </w:pPr>
-          <w:hyperlink w:anchor="_Toc226897775" w:history="1">
+          <w:hyperlink w:anchor="_Toc226927156" w:history="1">
             <w:r>
               <w:rPr>
                 <w:rStyle w:val="Hipervnculo"/>
@@ -2399,7 +2399,7 @@
                 <w:noProof/>
                 <w:webHidden/>
               </w:rPr>
-              <w:instrText xml:space="preserve"> PAGEREF _Toc226897775 \h </w:instrText>
+              <w:instrText xml:space="preserve"> PAGEREF _Toc226927156 \h </w:instrText>
             </w:r>
             <w:r>
               <w:rPr>
@@ -2445,7 +2445,7 @@
               <w14:ligatures w14:val="standardContextual"/>
             </w:rPr>
           </w:pPr>
-          <w:hyperlink w:anchor="_Toc226897776" w:history="1">
+          <w:hyperlink w:anchor="_Toc226927157" w:history="1">
             <w:r>
               <w:rPr>
                 <w:rStyle w:val="Hipervnculo"/>
@@ -2472,7 +2472,7 @@
                 <w:noProof/>
                 <w:webHidden/>
               </w:rPr>
-              <w:instrText xml:space="preserve"> PAGEREF _Toc226897776 \h </w:instrText>
+              <w:instrText xml:space="preserve"> PAGEREF _Toc226927157 \h </w:instrText>
             </w:r>
             <w:r>
               <w:rPr>
@@ -2493,6 +2493,371 @@
                 <w:webHidden/>
               </w:rPr>
               <w:t>14</w:t>
+            </w:r>
+            <w:r>
+              <w:rPr>
+                <w:noProof/>
+                <w:webHidden/>
+              </w:rPr>
+              <w:fldChar w:fldCharType="end"/>
+            </w:r>
+          </w:hyperlink>
+        </w:p>
+        <w:p>
+          <w:pPr>
+            <w:pStyle w:val="TDC3"/>
+            <w:tabs>
+              <w:tab w:val="right" w:leader="dot" w:pos="9350"/>
+            </w:tabs>
+            <w:rPr>
+              <w:rFonts w:asciiTheme="minorHAnsi" w:eastAsiaTheme="minorEastAsia" w:hAnsiTheme="minorHAnsi" w:cstheme="minorBidi"/>
+              <w:noProof/>
+              <w:kern w:val="2"/>
+              <w:szCs w:val="24"/>
+              <w:lang w:val="es-HN"/>
+              <w14:ligatures w14:val="standardContextual"/>
+            </w:rPr>
+          </w:pPr>
+          <w:hyperlink w:anchor="_Toc226927158" w:history="1">
+            <w:r>
+              <w:rPr>
+                <w:rStyle w:val="Hipervnculo"/>
+                <w:noProof/>
+              </w:rPr>
+              <w:t>Incremento del producto</w:t>
+            </w:r>
+            <w:r>
+              <w:rPr>
+                <w:noProof/>
+                <w:webHidden/>
+              </w:rPr>
+              <w:tab/>
+            </w:r>
+            <w:r>
+              <w:rPr>
+                <w:noProof/>
+                <w:webHidden/>
+              </w:rPr>
+              <w:fldChar w:fldCharType="begin"/>
+            </w:r>
+            <w:r>
+              <w:rPr>
+                <w:noProof/>
+                <w:webHidden/>
+              </w:rPr>
+              <w:instrText xml:space="preserve"> PAGEREF _Toc226927158 \h </w:instrText>
+            </w:r>
+            <w:r>
+              <w:rPr>
+                <w:noProof/>
+                <w:webHidden/>
+              </w:rPr>
+            </w:r>
+            <w:r>
+              <w:rPr>
+                <w:noProof/>
+                <w:webHidden/>
+              </w:rPr>
+              <w:fldChar w:fldCharType="separate"/>
+            </w:r>
+            <w:r>
+              <w:rPr>
+                <w:noProof/>
+                <w:webHidden/>
+              </w:rPr>
+              <w:t>14</w:t>
+            </w:r>
+            <w:r>
+              <w:rPr>
+                <w:noProof/>
+                <w:webHidden/>
+              </w:rPr>
+              <w:fldChar w:fldCharType="end"/>
+            </w:r>
+          </w:hyperlink>
+        </w:p>
+        <w:p>
+          <w:pPr>
+            <w:pStyle w:val="TDC2"/>
+            <w:tabs>
+              <w:tab w:val="right" w:leader="dot" w:pos="9350"/>
+            </w:tabs>
+            <w:rPr>
+              <w:rFonts w:asciiTheme="minorHAnsi" w:eastAsiaTheme="minorEastAsia" w:hAnsiTheme="minorHAnsi" w:cstheme="minorBidi"/>
+              <w:noProof/>
+              <w:kern w:val="2"/>
+              <w:szCs w:val="24"/>
+              <w:lang w:val="es-HN"/>
+              <w14:ligatures w14:val="standardContextual"/>
+            </w:rPr>
+          </w:pPr>
+          <w:hyperlink w:anchor="_Toc226927159" w:history="1">
+            <w:r>
+              <w:rPr>
+                <w:rStyle w:val="Hipervnculo"/>
+                <w:noProof/>
+              </w:rPr>
+              <w:t>Sprint Retrospective</w:t>
+            </w:r>
+            <w:r>
+              <w:rPr>
+                <w:noProof/>
+                <w:webHidden/>
+              </w:rPr>
+              <w:tab/>
+            </w:r>
+            <w:r>
+              <w:rPr>
+                <w:noProof/>
+                <w:webHidden/>
+              </w:rPr>
+              <w:fldChar w:fldCharType="begin"/>
+            </w:r>
+            <w:r>
+              <w:rPr>
+                <w:noProof/>
+                <w:webHidden/>
+              </w:rPr>
+              <w:instrText xml:space="preserve"> PAGEREF _Toc226927159 \h </w:instrText>
+            </w:r>
+            <w:r>
+              <w:rPr>
+                <w:noProof/>
+                <w:webHidden/>
+              </w:rPr>
+            </w:r>
+            <w:r>
+              <w:rPr>
+                <w:noProof/>
+                <w:webHidden/>
+              </w:rPr>
+              <w:fldChar w:fldCharType="separate"/>
+            </w:r>
+            <w:r>
+              <w:rPr>
+                <w:noProof/>
+                <w:webHidden/>
+              </w:rPr>
+              <w:t>15</w:t>
+            </w:r>
+            <w:r>
+              <w:rPr>
+                <w:noProof/>
+                <w:webHidden/>
+              </w:rPr>
+              <w:fldChar w:fldCharType="end"/>
+            </w:r>
+          </w:hyperlink>
+        </w:p>
+        <w:p>
+          <w:pPr>
+            <w:pStyle w:val="TDC3"/>
+            <w:tabs>
+              <w:tab w:val="right" w:leader="dot" w:pos="9350"/>
+            </w:tabs>
+            <w:rPr>
+              <w:rFonts w:asciiTheme="minorHAnsi" w:eastAsiaTheme="minorEastAsia" w:hAnsiTheme="minorHAnsi" w:cstheme="minorBidi"/>
+              <w:noProof/>
+              <w:kern w:val="2"/>
+              <w:szCs w:val="24"/>
+              <w:lang w:val="es-HN"/>
+              <w14:ligatures w14:val="standardContextual"/>
+            </w:rPr>
+          </w:pPr>
+          <w:hyperlink w:anchor="_Toc226927160" w:history="1">
+            <w:r>
+              <w:rPr>
+                <w:rStyle w:val="Hipervnculo"/>
+                <w:noProof/>
+              </w:rPr>
+              <w:t>Análisis de la velocidad del equipo</w:t>
+            </w:r>
+            <w:r>
+              <w:rPr>
+                <w:noProof/>
+                <w:webHidden/>
+              </w:rPr>
+              <w:tab/>
+            </w:r>
+            <w:r>
+              <w:rPr>
+                <w:noProof/>
+                <w:webHidden/>
+              </w:rPr>
+              <w:fldChar w:fldCharType="begin"/>
+            </w:r>
+            <w:r>
+              <w:rPr>
+                <w:noProof/>
+                <w:webHidden/>
+              </w:rPr>
+              <w:instrText xml:space="preserve"> PAGEREF _Toc226927160 \h </w:instrText>
+            </w:r>
+            <w:r>
+              <w:rPr>
+                <w:noProof/>
+                <w:webHidden/>
+              </w:rPr>
+            </w:r>
+            <w:r>
+              <w:rPr>
+                <w:noProof/>
+                <w:webHidden/>
+              </w:rPr>
+              <w:fldChar w:fldCharType="separate"/>
+            </w:r>
+            <w:r>
+              <w:rPr>
+                <w:noProof/>
+                <w:webHidden/>
+              </w:rPr>
+              <w:t>15</w:t>
+            </w:r>
+            <w:r>
+              <w:rPr>
+                <w:noProof/>
+                <w:webHidden/>
+              </w:rPr>
+              <w:fldChar w:fldCharType="end"/>
+            </w:r>
+          </w:hyperlink>
+        </w:p>
+        <w:p>
+          <w:pPr>
+            <w:pStyle w:val="TDC3"/>
+            <w:tabs>
+              <w:tab w:val="right" w:leader="dot" w:pos="9350"/>
+            </w:tabs>
+            <w:rPr>
+              <w:rFonts w:asciiTheme="minorHAnsi" w:eastAsiaTheme="minorEastAsia" w:hAnsiTheme="minorHAnsi" w:cstheme="minorBidi"/>
+              <w:noProof/>
+              <w:kern w:val="2"/>
+              <w:szCs w:val="24"/>
+              <w:lang w:val="es-HN"/>
+              <w14:ligatures w14:val="standardContextual"/>
+            </w:rPr>
+          </w:pPr>
+          <w:hyperlink w:anchor="_Toc226927161" w:history="1">
+            <w:r>
+              <w:rPr>
+                <w:rStyle w:val="Hipervnculo"/>
+                <w:noProof/>
+              </w:rPr>
+              <w:t>Cálculo de velocidad</w:t>
+            </w:r>
+            <w:r>
+              <w:rPr>
+                <w:noProof/>
+                <w:webHidden/>
+              </w:rPr>
+              <w:tab/>
+            </w:r>
+            <w:r>
+              <w:rPr>
+                <w:noProof/>
+                <w:webHidden/>
+              </w:rPr>
+              <w:fldChar w:fldCharType="begin"/>
+            </w:r>
+            <w:r>
+              <w:rPr>
+                <w:noProof/>
+                <w:webHidden/>
+              </w:rPr>
+              <w:instrText xml:space="preserve"> PAGEREF _Toc226927161 \h </w:instrText>
+            </w:r>
+            <w:r>
+              <w:rPr>
+                <w:noProof/>
+                <w:webHidden/>
+              </w:rPr>
+            </w:r>
+            <w:r>
+              <w:rPr>
+                <w:noProof/>
+                <w:webHidden/>
+              </w:rPr>
+              <w:fldChar w:fldCharType="separate"/>
+            </w:r>
+            <w:r>
+              <w:rPr>
+                <w:noProof/>
+                <w:webHidden/>
+              </w:rPr>
+              <w:t>15</w:t>
+            </w:r>
+            <w:r>
+              <w:rPr>
+                <w:noProof/>
+                <w:webHidden/>
+              </w:rPr>
+              <w:fldChar w:fldCharType="end"/>
+            </w:r>
+          </w:hyperlink>
+        </w:p>
+        <w:p>
+          <w:pPr>
+            <w:pStyle w:val="TDC3"/>
+            <w:tabs>
+              <w:tab w:val="right" w:leader="dot" w:pos="9350"/>
+            </w:tabs>
+            <w:rPr>
+              <w:rFonts w:asciiTheme="minorHAnsi" w:eastAsiaTheme="minorEastAsia" w:hAnsiTheme="minorHAnsi" w:cstheme="minorBidi"/>
+              <w:noProof/>
+              <w:kern w:val="2"/>
+              <w:szCs w:val="24"/>
+              <w:lang w:val="es-HN"/>
+              <w14:ligatures w14:val="standardContextual"/>
+            </w:rPr>
+          </w:pPr>
+          <w:hyperlink w:anchor="_Toc226927162" w:history="1">
+            <w:r>
+              <w:rPr>
+                <w:rStyle w:val="Hipervnculo"/>
+                <w:noProof/>
+              </w:rPr>
+              <w:t>Retrospectiva (final) de la Dinámica del Equipo</w:t>
+            </w:r>
+            <w:r>
+              <w:rPr>
+                <w:noProof/>
+                <w:webHidden/>
+              </w:rPr>
+              <w:tab/>
+            </w:r>
+            <w:r>
+              <w:rPr>
+                <w:noProof/>
+                <w:webHidden/>
+              </w:rPr>
+              <w:fldChar w:fldCharType="begin"/>
+            </w:r>
+            <w:r>
+              <w:rPr>
+                <w:noProof/>
+                <w:webHidden/>
+              </w:rPr>
+              <w:instrText xml:space="preserve"> PAGEREF _Toc226927162 \h </w:instrText>
+            </w:r>
+            <w:r>
+              <w:rPr>
+                <w:noProof/>
+                <w:webHidden/>
+              </w:rPr>
+            </w:r>
+            <w:r>
+              <w:rPr>
+                <w:noProof/>
+                <w:webHidden/>
+              </w:rPr>
+              <w:fldChar w:fldCharType="separate"/>
+            </w:r>
+            <w:r>
+              <w:rPr>
+                <w:noProof/>
+                <w:webHidden/>
+              </w:rPr>
+              <w:t>16</w:t>
             </w:r>
             <w:r>
               <w:rPr>
@@ -2566,7 +2931,7 @@
       <w:pPr>
         <w:pStyle w:val="Ttulo1"/>
       </w:pPr>
-      <w:bookmarkStart w:id="0" w:name="_Toc226897745"/>
+      <w:bookmarkStart w:id="0" w:name="_Toc226927126"/>
       <w:r>
         <w:lastRenderedPageBreak/>
         <w:t>Sprint 1</w:t>
@@ -2690,7 +3055,7 @@
       <w:pPr>
         <w:pStyle w:val="Ttulo2"/>
       </w:pPr>
-      <w:bookmarkStart w:id="1" w:name="_Toc226897746"/>
+      <w:bookmarkStart w:id="1" w:name="_Toc226927127"/>
       <w:r>
         <w:t xml:space="preserve">Sprint </w:t>
       </w:r>
@@ -2744,7 +3109,7 @@
           <w:sz w:val="24"/>
         </w:rPr>
       </w:pPr>
-      <w:bookmarkStart w:id="2" w:name="_Toc226897747"/>
+      <w:bookmarkStart w:id="2" w:name="_Toc226927128"/>
       <w:r>
         <w:t xml:space="preserve">Historias de </w:t>
       </w:r>
@@ -2891,7 +3256,7 @@
           <w:sz w:val="24"/>
         </w:rPr>
       </w:pPr>
-      <w:bookmarkStart w:id="3" w:name="_Toc226897748"/>
+      <w:bookmarkStart w:id="3" w:name="_Toc226927129"/>
       <w:r>
         <w:t>Incremento del producto</w:t>
       </w:r>
@@ -3021,7 +3386,7 @@
       <w:pPr>
         <w:pStyle w:val="Ttulo3"/>
       </w:pPr>
-      <w:bookmarkStart w:id="4" w:name="_Toc226897749"/>
+      <w:bookmarkStart w:id="4" w:name="_Toc226927130"/>
       <w:proofErr w:type="spellStart"/>
       <w:r>
         <w:t>Feedback</w:t>
@@ -3263,7 +3628,7 @@
       <w:pPr>
         <w:pStyle w:val="Ttulo2"/>
       </w:pPr>
-      <w:bookmarkStart w:id="5" w:name="_Toc226897750"/>
+      <w:bookmarkStart w:id="5" w:name="_Toc226927131"/>
       <w:r>
         <w:t>Sprint Retrospective</w:t>
       </w:r>
@@ -3306,7 +3671,7 @@
       <w:pPr>
         <w:pStyle w:val="Ttulo3"/>
       </w:pPr>
-      <w:bookmarkStart w:id="6" w:name="_Toc226897751"/>
+      <w:bookmarkStart w:id="6" w:name="_Toc226927132"/>
       <w:r>
         <w:t xml:space="preserve">Análisis de </w:t>
       </w:r>
@@ -3976,7 +4341,23 @@
                 <w:color w:val="1F1F1F"/>
                 <w:szCs w:val="24"/>
               </w:rPr>
-              <w:t>Finalizada (Sábado)</w:t>
+              <w:t>Finalizada (</w:t>
+            </w:r>
+            <w:proofErr w:type="gramStart"/>
+            <w:r>
+              <w:rPr>
+                <w:color w:val="1F1F1F"/>
+                <w:szCs w:val="24"/>
+              </w:rPr>
+              <w:t>Sábado</w:t>
+            </w:r>
+            <w:proofErr w:type="gramEnd"/>
+            <w:r>
+              <w:rPr>
+                <w:color w:val="1F1F1F"/>
+                <w:szCs w:val="24"/>
+              </w:rPr>
+              <w:t>)</w:t>
             </w:r>
           </w:p>
         </w:tc>
@@ -4146,7 +4527,7 @@
         <w:pStyle w:val="Ttulo3"/>
       </w:pPr>
       <w:bookmarkStart w:id="7" w:name="_lxded7iqfzj6" w:colFirst="0" w:colLast="0"/>
-      <w:bookmarkStart w:id="8" w:name="_Toc226897752"/>
+      <w:bookmarkStart w:id="8" w:name="_Toc226927133"/>
       <w:bookmarkEnd w:id="7"/>
       <w:r>
         <w:t xml:space="preserve">Cálculo de </w:t>
@@ -4293,7 +4674,7 @@
       <w:pPr>
         <w:pStyle w:val="Ttulo3"/>
       </w:pPr>
-      <w:bookmarkStart w:id="9" w:name="_Toc226897753"/>
+      <w:bookmarkStart w:id="9" w:name="_Toc226927134"/>
       <w:r>
         <w:t>Inspección del Proceso (Dinámica del Equipo)</w:t>
       </w:r>
@@ -4403,7 +4784,7 @@
       <w:pPr>
         <w:pStyle w:val="Ttulo3"/>
       </w:pPr>
-      <w:bookmarkStart w:id="10" w:name="_Toc226897754"/>
+      <w:bookmarkStart w:id="10" w:name="_Toc226927135"/>
       <w:r>
         <w:t>Metas del próximo Sprint</w:t>
       </w:r>
@@ -4454,7 +4835,7 @@
       <w:pPr>
         <w:pStyle w:val="Ttulo1"/>
       </w:pPr>
-      <w:bookmarkStart w:id="11" w:name="_Toc226897755"/>
+      <w:bookmarkStart w:id="11" w:name="_Toc226927136"/>
       <w:r>
         <w:lastRenderedPageBreak/>
         <w:t>Sprint 2</w:t>
@@ -4563,7 +4944,7 @@
       <w:pPr>
         <w:pStyle w:val="Ttulo2"/>
       </w:pPr>
-      <w:bookmarkStart w:id="12" w:name="_Toc226897756"/>
+      <w:bookmarkStart w:id="12" w:name="_Toc226927137"/>
       <w:r>
         <w:t xml:space="preserve">Sprint </w:t>
       </w:r>
@@ -4584,7 +4965,7 @@
           <w:sz w:val="24"/>
         </w:rPr>
       </w:pPr>
-      <w:bookmarkStart w:id="13" w:name="_Toc226897757"/>
+      <w:bookmarkStart w:id="13" w:name="_Toc226927138"/>
       <w:r>
         <w:t xml:space="preserve">Historias de </w:t>
       </w:r>
@@ -4840,7 +5221,7 @@
           <w:sz w:val="24"/>
         </w:rPr>
       </w:pPr>
-      <w:bookmarkStart w:id="14" w:name="_Toc226897758"/>
+      <w:bookmarkStart w:id="14" w:name="_Toc226927139"/>
       <w:r>
         <w:t>Incremento del producto</w:t>
       </w:r>
@@ -5519,7 +5900,7 @@
       <w:pPr>
         <w:pStyle w:val="Ttulo3"/>
       </w:pPr>
-      <w:bookmarkStart w:id="15" w:name="_Toc226897759"/>
+      <w:bookmarkStart w:id="15" w:name="_Toc226927140"/>
       <w:proofErr w:type="spellStart"/>
       <w:r>
         <w:t>Feedback</w:t>
@@ -5614,7 +5995,7 @@
       <w:pPr>
         <w:pStyle w:val="Ttulo2"/>
       </w:pPr>
-      <w:bookmarkStart w:id="16" w:name="_Toc226897760"/>
+      <w:bookmarkStart w:id="16" w:name="_Toc226927141"/>
       <w:r>
         <w:t>Sprint Retrospective</w:t>
       </w:r>
@@ -5624,7 +6005,7 @@
       <w:pPr>
         <w:pStyle w:val="Ttulo3"/>
       </w:pPr>
-      <w:bookmarkStart w:id="17" w:name="_Toc226897761"/>
+      <w:bookmarkStart w:id="17" w:name="_Toc226927142"/>
       <w:r>
         <w:t>Análisis de la velocidad del equipo</w:t>
       </w:r>
@@ -6934,7 +7315,7 @@
         <w:pStyle w:val="Ttulo3"/>
       </w:pPr>
       <w:bookmarkStart w:id="18" w:name="_Toc224125962"/>
-      <w:bookmarkStart w:id="19" w:name="_Toc226897762"/>
+      <w:bookmarkStart w:id="19" w:name="_Toc226927143"/>
       <w:r>
         <w:lastRenderedPageBreak/>
         <w:t>Cálculo de velocidad</w:t>
@@ -6982,7 +7363,7 @@
       <w:pPr>
         <w:pStyle w:val="Ttulo3"/>
       </w:pPr>
-      <w:bookmarkStart w:id="20" w:name="_Toc226897763"/>
+      <w:bookmarkStart w:id="20" w:name="_Toc226927144"/>
       <w:r>
         <w:t>Retrospectiva de la Dinámica del Equipo</w:t>
       </w:r>
@@ -7189,7 +7570,7 @@
       <w:pPr>
         <w:pStyle w:val="Ttulo3"/>
       </w:pPr>
-      <w:bookmarkStart w:id="21" w:name="_Toc226897764"/>
+      <w:bookmarkStart w:id="21" w:name="_Toc226927145"/>
       <w:r>
         <w:t>Metas del próximo Sprint</w:t>
       </w:r>
@@ -7212,7 +7593,7 @@
       <w:pPr>
         <w:pStyle w:val="Ttulo1"/>
       </w:pPr>
-      <w:bookmarkStart w:id="22" w:name="_Toc226897765"/>
+      <w:bookmarkStart w:id="22" w:name="_Toc226927146"/>
       <w:r>
         <w:lastRenderedPageBreak/>
         <w:t>Sprint 3</w:t>
@@ -7321,7 +7702,7 @@
       <w:pPr>
         <w:pStyle w:val="Ttulo2"/>
       </w:pPr>
-      <w:bookmarkStart w:id="23" w:name="_Toc226897766"/>
+      <w:bookmarkStart w:id="23" w:name="_Toc226927147"/>
       <w:r>
         <w:t xml:space="preserve">Sprint </w:t>
       </w:r>
@@ -7339,7 +7720,7 @@
       <w:pPr>
         <w:pStyle w:val="Ttulo3"/>
       </w:pPr>
-      <w:bookmarkStart w:id="24" w:name="_Toc226897767"/>
+      <w:bookmarkStart w:id="24" w:name="_Toc226927148"/>
       <w:r>
         <w:t xml:space="preserve">Historias de </w:t>
       </w:r>
@@ -7559,7 +7940,7 @@
           <w:sz w:val="24"/>
         </w:rPr>
       </w:pPr>
-      <w:bookmarkStart w:id="25" w:name="_Toc226897768"/>
+      <w:bookmarkStart w:id="25" w:name="_Toc226927149"/>
       <w:r>
         <w:t>Incremento del producto</w:t>
       </w:r>
@@ -7596,6 +7977,7 @@
         </w:rPr>
         <w:t xml:space="preserve">El usuario ‘RECEPCIONISTA’ y ‘ADMINISTRADOR’ tienen permiso de editar la información </w:t>
       </w:r>
+      <w:proofErr w:type="gramStart"/>
       <w:r>
         <w:rPr>
           <w:rFonts w:eastAsia="Times New Roman" w:cs="Times New Roman"/>
@@ -7603,6 +7985,7 @@
         </w:rPr>
         <w:t>del paciente asociada</w:t>
       </w:r>
+      <w:proofErr w:type="gramEnd"/>
       <w:r>
         <w:rPr>
           <w:rFonts w:eastAsia="Times New Roman" w:cs="Times New Roman"/>
@@ -8210,7 +8593,7 @@
       <w:pPr>
         <w:pStyle w:val="Ttulo2"/>
       </w:pPr>
-      <w:bookmarkStart w:id="26" w:name="_Toc226897769"/>
+      <w:bookmarkStart w:id="26" w:name="_Toc226927150"/>
       <w:r>
         <w:t>Sprint Retrospective</w:t>
       </w:r>
@@ -8220,7 +8603,7 @@
       <w:pPr>
         <w:pStyle w:val="Ttulo3"/>
       </w:pPr>
-      <w:bookmarkStart w:id="27" w:name="_Toc226897770"/>
+      <w:bookmarkStart w:id="27" w:name="_Toc226927151"/>
       <w:r>
         <w:t>Análisis de la velocidad del equipo</w:t>
       </w:r>
@@ -8556,25 +8939,7 @@
                 <w:bCs/>
                 <w:szCs w:val="24"/>
               </w:rPr>
-              <w:t>11</w:t>
-            </w:r>
-            <w:r>
-              <w:rPr>
-                <w:rFonts w:eastAsia="Times New Roman" w:cs="Times New Roman"/>
-                <w:b/>
-                <w:bCs/>
-                <w:szCs w:val="24"/>
-              </w:rPr>
-              <w:t>:</w:t>
-            </w:r>
-            <w:r>
-              <w:rPr>
-                <w:rFonts w:eastAsia="Times New Roman" w:cs="Times New Roman"/>
-                <w:b/>
-                <w:bCs/>
-                <w:szCs w:val="24"/>
-              </w:rPr>
-              <w:t xml:space="preserve"> </w:t>
+              <w:t xml:space="preserve">11: </w:t>
             </w:r>
             <w:r>
               <w:rPr>
@@ -8700,25 +9065,7 @@
                 <w:bCs/>
                 <w:szCs w:val="24"/>
               </w:rPr>
-              <w:t>HU-12</w:t>
-            </w:r>
-            <w:r>
-              <w:rPr>
-                <w:rFonts w:eastAsia="Times New Roman" w:cs="Times New Roman"/>
-                <w:b/>
-                <w:bCs/>
-                <w:szCs w:val="24"/>
-              </w:rPr>
-              <w:t>:</w:t>
-            </w:r>
-            <w:r>
-              <w:rPr>
-                <w:rFonts w:eastAsia="Times New Roman" w:cs="Times New Roman"/>
-                <w:b/>
-                <w:bCs/>
-                <w:szCs w:val="24"/>
-              </w:rPr>
-              <w:t xml:space="preserve"> </w:t>
+              <w:t xml:space="preserve">HU-12: </w:t>
             </w:r>
             <w:r>
               <w:rPr>
@@ -8837,25 +9184,7 @@
                 <w:bCs/>
                 <w:szCs w:val="24"/>
               </w:rPr>
-              <w:t>HU-13</w:t>
-            </w:r>
-            <w:r>
-              <w:rPr>
-                <w:rFonts w:eastAsia="Times New Roman" w:cs="Times New Roman"/>
-                <w:b/>
-                <w:bCs/>
-                <w:szCs w:val="24"/>
-              </w:rPr>
-              <w:t>:</w:t>
-            </w:r>
-            <w:r>
-              <w:rPr>
-                <w:rFonts w:eastAsia="Times New Roman" w:cs="Times New Roman"/>
-                <w:b/>
-                <w:bCs/>
-                <w:szCs w:val="24"/>
-              </w:rPr>
-              <w:t xml:space="preserve"> </w:t>
+              <w:t xml:space="preserve">HU-13: </w:t>
             </w:r>
             <w:r>
               <w:rPr>
@@ -8974,16 +9303,7 @@
                 <w:bCs/>
                 <w:szCs w:val="24"/>
               </w:rPr>
-              <w:t>HU-15</w:t>
-            </w:r>
-            <w:r>
-              <w:rPr>
-                <w:rFonts w:eastAsia="Times New Roman" w:cs="Times New Roman"/>
-                <w:b/>
-                <w:bCs/>
-                <w:szCs w:val="24"/>
-              </w:rPr>
-              <w:t xml:space="preserve">: </w:t>
+              <w:t xml:space="preserve">HU-15: </w:t>
             </w:r>
             <w:r>
               <w:rPr>
@@ -9102,16 +9422,7 @@
                 <w:bCs/>
                 <w:szCs w:val="24"/>
               </w:rPr>
-              <w:t>TT-09</w:t>
-            </w:r>
-            <w:r>
-              <w:rPr>
-                <w:rFonts w:eastAsia="Times New Roman" w:cs="Times New Roman"/>
-                <w:b/>
-                <w:bCs/>
-                <w:szCs w:val="24"/>
-              </w:rPr>
-              <w:t xml:space="preserve">: </w:t>
+              <w:t xml:space="preserve">TT-09: </w:t>
             </w:r>
             <w:r>
               <w:rPr>
@@ -9389,7 +9700,7 @@
       <w:pPr>
         <w:pStyle w:val="Ttulo3"/>
       </w:pPr>
-      <w:bookmarkStart w:id="28" w:name="_Toc226897771"/>
+      <w:bookmarkStart w:id="28" w:name="_Toc226927152"/>
       <w:r>
         <w:t>Cálculo de velocidad</w:t>
       </w:r>
@@ -9419,7 +9730,7 @@
       <w:pPr>
         <w:pStyle w:val="Ttulo3"/>
       </w:pPr>
-      <w:bookmarkStart w:id="29" w:name="_Toc226897772"/>
+      <w:bookmarkStart w:id="29" w:name="_Toc226927153"/>
       <w:r>
         <w:lastRenderedPageBreak/>
         <w:t>Retrospectiva de la Dinámica del Equipo</w:t>
@@ -9551,33 +9862,9 @@
           <w:ilvl w:val="0"/>
           <w:numId w:val="7"/>
         </w:numPr>
-        <w:rPr>
-          <w:b/>
-          <w:bCs/>
-        </w:rPr>
-      </w:pPr>
-    </w:p>
-    <w:p>
-      <w:pPr>
-        <w:rPr>
-          <w:b/>
-          <w:bCs/>
-        </w:rPr>
-      </w:pPr>
-    </w:p>
-    <w:p>
-      <w:pPr>
-        <w:rPr>
-          <w:b/>
-          <w:bCs/>
-        </w:rPr>
-      </w:pPr>
-      <w:r>
-        <w:rPr>
-          <w:b/>
-          <w:bCs/>
-        </w:rPr>
-        <w:t>¿Qué podemos mejorar?</w:t>
+      </w:pPr>
+      <w:r>
+        <w:t>Algunas tareas tomaron más tiempo del estimado debido a ajustes en los requerimientos</w:t>
       </w:r>
     </w:p>
     <w:p>
@@ -9587,17 +9874,51 @@
           <w:ilvl w:val="0"/>
           <w:numId w:val="7"/>
         </w:numPr>
-        <w:rPr>
-          <w:b/>
-          <w:bCs/>
-        </w:rPr>
-      </w:pPr>
+      </w:pPr>
+      <w:r>
+        <w:t>Faltó mayor claridad en ciertos criterios de aceptación al inicio del sprint</w:t>
+      </w:r>
+    </w:p>
+    <w:p>
+      <w:pPr>
+        <w:rPr>
+          <w:b/>
+          <w:bCs/>
+        </w:rPr>
+      </w:pPr>
+    </w:p>
+    <w:p>
+      <w:pPr>
+        <w:rPr>
+          <w:b/>
+          <w:bCs/>
+        </w:rPr>
+      </w:pPr>
+      <w:r>
+        <w:rPr>
+          <w:b/>
+          <w:bCs/>
+        </w:rPr>
+        <w:t>¿Qué podemos mejorar?</w:t>
+      </w:r>
+    </w:p>
+    <w:p>
+      <w:pPr>
+        <w:pStyle w:val="Prrafodelista"/>
+        <w:numPr>
+          <w:ilvl w:val="0"/>
+          <w:numId w:val="7"/>
+        </w:numPr>
+      </w:pPr>
+      <w:r>
+        <w:t>Realizar pruebas e integraciones parciales más frecuentes para evitar acumulación al final.</w:t>
+      </w:r>
     </w:p>
     <w:p>
       <w:pPr>
         <w:pStyle w:val="Ttulo3"/>
       </w:pPr>
-      <w:bookmarkStart w:id="30" w:name="_Toc226897773"/>
+      <w:bookmarkStart w:id="30" w:name="_Toc226927154"/>
       <w:r>
         <w:t>Metas del próximo Sprint</w:t>
       </w:r>
@@ -9617,13 +9938,10 @@
       <w:pPr>
         <w:pStyle w:val="Ttulo1"/>
       </w:pPr>
-      <w:bookmarkStart w:id="31" w:name="_Toc226897774"/>
+      <w:bookmarkStart w:id="31" w:name="_Toc226927155"/>
       <w:r>
         <w:lastRenderedPageBreak/>
-        <w:t xml:space="preserve">Sprint </w:t>
-      </w:r>
-      <w:r>
-        <w:t>4</w:t>
+        <w:t>Sprint 4</w:t>
       </w:r>
       <w:bookmarkEnd w:id="31"/>
     </w:p>
@@ -9674,14 +9992,7 @@
           <w:rFonts w:eastAsia="Times New Roman" w:cs="Times New Roman"/>
           <w:szCs w:val="24"/>
         </w:rPr>
-        <w:t>11 de abril</w:t>
-      </w:r>
-      <w:r>
-        <w:rPr>
-          <w:rFonts w:eastAsia="Times New Roman" w:cs="Times New Roman"/>
-          <w:szCs w:val="24"/>
-        </w:rPr>
-        <w:t xml:space="preserve"> de 2026</w:t>
+        <w:t>11 de abril de 2026</w:t>
       </w:r>
     </w:p>
     <w:p>
@@ -9733,7 +10044,7 @@
       <w:pPr>
         <w:pStyle w:val="Ttulo2"/>
       </w:pPr>
-      <w:bookmarkStart w:id="32" w:name="_Toc226897775"/>
+      <w:bookmarkStart w:id="32" w:name="_Toc226927156"/>
       <w:r>
         <w:t xml:space="preserve">Sprint </w:t>
       </w:r>
@@ -9751,7 +10062,7 @@
       <w:pPr>
         <w:pStyle w:val="Ttulo3"/>
       </w:pPr>
-      <w:bookmarkStart w:id="33" w:name="_Toc226897776"/>
+      <w:bookmarkStart w:id="33" w:name="_Toc226927157"/>
       <w:r>
         <w:t xml:space="preserve">Historias de </w:t>
       </w:r>
@@ -9836,6 +10147,13 @@
         </w:rPr>
         <w:t xml:space="preserve"> </w:t>
       </w:r>
+      <w:r>
+        <w:rPr>
+          <w:rFonts w:eastAsia="Times New Roman" w:cs="Times New Roman"/>
+          <w:szCs w:val="24"/>
+        </w:rPr>
+        <w:t>6</w:t>
+      </w:r>
     </w:p>
     <w:p>
       <w:pPr>
@@ -9866,6 +10184,1578 @@
         </w:rPr>
         <w:t xml:space="preserve"> </w:t>
       </w:r>
+      <w:r>
+        <w:rPr>
+          <w:rFonts w:eastAsia="Times New Roman" w:cs="Times New Roman"/>
+          <w:szCs w:val="24"/>
+        </w:rPr>
+        <w:t>0</w:t>
+      </w:r>
+    </w:p>
+    <w:p>
+      <w:pPr>
+        <w:pStyle w:val="Ttulo3"/>
+      </w:pPr>
+      <w:bookmarkStart w:id="34" w:name="_Toc226927158"/>
+      <w:r>
+        <w:t>Incremento del producto</w:t>
+      </w:r>
+      <w:bookmarkEnd w:id="34"/>
+    </w:p>
+    <w:p>
+      <w:pPr>
+        <w:numPr>
+          <w:ilvl w:val="0"/>
+          <w:numId w:val="10"/>
+        </w:numPr>
+        <w:spacing w:line="480" w:lineRule="auto"/>
+        <w:jc w:val="both"/>
+        <w:rPr>
+          <w:rFonts w:eastAsia="Times New Roman" w:cs="Times New Roman"/>
+          <w:b/>
+          <w:bCs/>
+          <w:szCs w:val="24"/>
+        </w:rPr>
+      </w:pPr>
+      <w:r>
+        <w:rPr>
+          <w:rFonts w:eastAsia="Times New Roman" w:cs="Times New Roman"/>
+          <w:b/>
+          <w:bCs/>
+          <w:szCs w:val="24"/>
+        </w:rPr>
+        <w:t>HU-9</w:t>
+      </w:r>
+      <w:r>
+        <w:rPr>
+          <w:rFonts w:eastAsia="Times New Roman" w:cs="Times New Roman"/>
+          <w:b/>
+          <w:bCs/>
+          <w:szCs w:val="24"/>
+        </w:rPr>
+        <w:t xml:space="preserve"> Adjuntar documento</w:t>
+      </w:r>
+      <w:r>
+        <w:rPr>
+          <w:rFonts w:eastAsia="Times New Roman" w:cs="Times New Roman"/>
+          <w:b/>
+          <w:bCs/>
+          <w:szCs w:val="24"/>
+        </w:rPr>
+        <w:t xml:space="preserve">: </w:t>
+      </w:r>
+      <w:r>
+        <w:rPr>
+          <w:rFonts w:eastAsia="Times New Roman" w:cs="Times New Roman"/>
+          <w:szCs w:val="24"/>
+        </w:rPr>
+        <w:t>El usuario ‘</w:t>
+      </w:r>
+      <w:r>
+        <w:rPr>
+          <w:rFonts w:eastAsia="Times New Roman" w:cs="Times New Roman"/>
+          <w:szCs w:val="24"/>
+        </w:rPr>
+        <w:t>MEDICO</w:t>
+      </w:r>
+      <w:r>
+        <w:rPr>
+          <w:rFonts w:eastAsia="Times New Roman" w:cs="Times New Roman"/>
+          <w:szCs w:val="24"/>
+        </w:rPr>
+        <w:t xml:space="preserve">’ </w:t>
+      </w:r>
+      <w:r>
+        <w:rPr>
+          <w:rFonts w:eastAsia="Times New Roman" w:cs="Times New Roman"/>
+          <w:szCs w:val="24"/>
+        </w:rPr>
+        <w:t xml:space="preserve">puede adjuntar documentos de exámenes o estudios anteriores que le paciente presente en la consulta para alimentar su expediente e historial clínico. </w:t>
+      </w:r>
+    </w:p>
+    <w:p>
+      <w:pPr>
+        <w:numPr>
+          <w:ilvl w:val="0"/>
+          <w:numId w:val="10"/>
+        </w:numPr>
+        <w:spacing w:line="480" w:lineRule="auto"/>
+        <w:jc w:val="both"/>
+        <w:rPr>
+          <w:rFonts w:eastAsia="Times New Roman" w:cs="Times New Roman"/>
+          <w:b/>
+          <w:bCs/>
+          <w:szCs w:val="24"/>
+        </w:rPr>
+      </w:pPr>
+      <w:r>
+        <w:rPr>
+          <w:rFonts w:eastAsia="Times New Roman" w:cs="Times New Roman"/>
+          <w:b/>
+          <w:bCs/>
+          <w:szCs w:val="24"/>
+        </w:rPr>
+        <w:t xml:space="preserve">HU-10 – Visualizar documentos: </w:t>
+      </w:r>
+      <w:r>
+        <w:rPr>
+          <w:rFonts w:eastAsia="Times New Roman" w:cs="Times New Roman"/>
+          <w:szCs w:val="24"/>
+        </w:rPr>
+        <w:t xml:space="preserve">El </w:t>
+      </w:r>
+      <w:r>
+        <w:rPr>
+          <w:rFonts w:eastAsia="Times New Roman" w:cs="Times New Roman"/>
+          <w:szCs w:val="24"/>
+        </w:rPr>
+        <w:t>usuario ‘MEDICO’</w:t>
+      </w:r>
+      <w:r>
+        <w:rPr>
+          <w:rFonts w:eastAsia="Times New Roman" w:cs="Times New Roman"/>
+          <w:szCs w:val="24"/>
+        </w:rPr>
+        <w:t xml:space="preserve"> puede </w:t>
+      </w:r>
+      <w:r>
+        <w:rPr>
+          <w:rFonts w:eastAsia="Times New Roman" w:cs="Times New Roman"/>
+          <w:szCs w:val="24"/>
+        </w:rPr>
+        <w:t xml:space="preserve">ver </w:t>
+      </w:r>
+      <w:r>
+        <w:rPr>
+          <w:rFonts w:eastAsia="Times New Roman" w:cs="Times New Roman"/>
+          <w:szCs w:val="24"/>
+        </w:rPr>
+        <w:t xml:space="preserve">el historial de consultas del paciente y visualizar, descargar o eliminar los archivos adjuntados. </w:t>
+      </w:r>
+    </w:p>
+    <w:p>
+      <w:pPr>
+        <w:numPr>
+          <w:ilvl w:val="0"/>
+          <w:numId w:val="10"/>
+        </w:numPr>
+        <w:spacing w:line="480" w:lineRule="auto"/>
+        <w:jc w:val="both"/>
+        <w:rPr>
+          <w:rFonts w:eastAsia="Times New Roman" w:cs="Times New Roman"/>
+          <w:b/>
+          <w:bCs/>
+          <w:szCs w:val="24"/>
+        </w:rPr>
+      </w:pPr>
+      <w:r>
+        <w:rPr>
+          <w:rFonts w:eastAsia="Times New Roman" w:cs="Times New Roman"/>
+          <w:b/>
+          <w:bCs/>
+          <w:szCs w:val="24"/>
+        </w:rPr>
+        <w:t xml:space="preserve">HU-19 </w:t>
+      </w:r>
+      <w:proofErr w:type="gramStart"/>
+      <w:r>
+        <w:rPr>
+          <w:rFonts w:eastAsia="Times New Roman" w:cs="Times New Roman"/>
+          <w:b/>
+          <w:bCs/>
+          <w:szCs w:val="24"/>
+        </w:rPr>
+        <w:t>-  Parametrización</w:t>
+      </w:r>
+      <w:proofErr w:type="gramEnd"/>
+      <w:r>
+        <w:rPr>
+          <w:rFonts w:eastAsia="Times New Roman" w:cs="Times New Roman"/>
+          <w:b/>
+          <w:bCs/>
+          <w:szCs w:val="24"/>
+        </w:rPr>
+        <w:t xml:space="preserve"> de medicamentos: </w:t>
+      </w:r>
+      <w:r>
+        <w:rPr>
+          <w:rFonts w:eastAsia="Times New Roman" w:cs="Times New Roman"/>
+          <w:szCs w:val="24"/>
+        </w:rPr>
+        <w:t>El usuario ‘ADMINISTRADOR’ puede agregar, editar y desactivar el catálogo de medicamentos que aparece al ‘</w:t>
+      </w:r>
+      <w:proofErr w:type="spellStart"/>
+      <w:r>
+        <w:rPr>
+          <w:rFonts w:eastAsia="Times New Roman" w:cs="Times New Roman"/>
+          <w:szCs w:val="24"/>
+        </w:rPr>
+        <w:t>MÉDICO’en</w:t>
+      </w:r>
+      <w:proofErr w:type="spellEnd"/>
+      <w:r>
+        <w:rPr>
+          <w:rFonts w:eastAsia="Times New Roman" w:cs="Times New Roman"/>
+          <w:szCs w:val="24"/>
+        </w:rPr>
+        <w:t xml:space="preserve"> el formulario de la consulta. </w:t>
+      </w:r>
+    </w:p>
+    <w:p>
+      <w:pPr>
+        <w:numPr>
+          <w:ilvl w:val="0"/>
+          <w:numId w:val="10"/>
+        </w:numPr>
+        <w:spacing w:line="480" w:lineRule="auto"/>
+        <w:jc w:val="both"/>
+        <w:rPr>
+          <w:rFonts w:eastAsia="Times New Roman" w:cs="Times New Roman"/>
+          <w:b/>
+          <w:bCs/>
+          <w:szCs w:val="24"/>
+        </w:rPr>
+      </w:pPr>
+      <w:r>
+        <w:rPr>
+          <w:rFonts w:eastAsia="Times New Roman" w:cs="Times New Roman"/>
+          <w:b/>
+          <w:bCs/>
+          <w:szCs w:val="24"/>
+        </w:rPr>
+        <w:t>HU-</w:t>
+      </w:r>
+      <w:r>
+        <w:rPr>
+          <w:rFonts w:eastAsia="Times New Roman" w:cs="Times New Roman"/>
+          <w:b/>
+          <w:bCs/>
+          <w:szCs w:val="24"/>
+        </w:rPr>
+        <w:t>20</w:t>
+      </w:r>
+      <w:r>
+        <w:rPr>
+          <w:rFonts w:eastAsia="Times New Roman" w:cs="Times New Roman"/>
+          <w:b/>
+          <w:bCs/>
+          <w:szCs w:val="24"/>
+        </w:rPr>
+        <w:t xml:space="preserve"> -</w:t>
+      </w:r>
+      <w:r>
+        <w:rPr>
+          <w:rFonts w:eastAsia="Times New Roman" w:cs="Times New Roman"/>
+          <w:b/>
+          <w:bCs/>
+          <w:szCs w:val="24"/>
+        </w:rPr>
+        <w:t xml:space="preserve"> </w:t>
+      </w:r>
+      <w:r>
+        <w:rPr>
+          <w:rFonts w:eastAsia="Times New Roman" w:cs="Times New Roman"/>
+          <w:b/>
+          <w:bCs/>
+          <w:szCs w:val="24"/>
+        </w:rPr>
+        <w:t xml:space="preserve">Parametrización </w:t>
+      </w:r>
+      <w:r>
+        <w:rPr>
+          <w:rFonts w:eastAsia="Times New Roman" w:cs="Times New Roman"/>
+          <w:b/>
+          <w:bCs/>
+          <w:szCs w:val="24"/>
+        </w:rPr>
+        <w:t xml:space="preserve">de exámenes médicos: </w:t>
+      </w:r>
+      <w:r>
+        <w:rPr>
+          <w:rFonts w:eastAsia="Times New Roman" w:cs="Times New Roman"/>
+          <w:szCs w:val="24"/>
+        </w:rPr>
+        <w:t>El usuario ‘ADMINISTRADOR’ puede agregar, editar y desactivar el catálogo de</w:t>
+      </w:r>
+      <w:r>
+        <w:rPr>
+          <w:rFonts w:eastAsia="Times New Roman" w:cs="Times New Roman"/>
+          <w:szCs w:val="24"/>
+        </w:rPr>
+        <w:t xml:space="preserve"> exámenes médicos</w:t>
+      </w:r>
+      <w:r>
+        <w:rPr>
+          <w:rFonts w:eastAsia="Times New Roman" w:cs="Times New Roman"/>
+          <w:szCs w:val="24"/>
+        </w:rPr>
+        <w:t xml:space="preserve"> que aparece al </w:t>
+      </w:r>
+      <w:r>
+        <w:rPr>
+          <w:rFonts w:eastAsia="Times New Roman" w:cs="Times New Roman"/>
+          <w:szCs w:val="24"/>
+        </w:rPr>
+        <w:t>‘MÉDICO’</w:t>
+      </w:r>
+      <w:r>
+        <w:rPr>
+          <w:rFonts w:eastAsia="Times New Roman" w:cs="Times New Roman"/>
+          <w:szCs w:val="24"/>
+        </w:rPr>
+        <w:t xml:space="preserve"> en el formulario de la consulta.</w:t>
+      </w:r>
+    </w:p>
+    <w:p>
+      <w:pPr>
+        <w:numPr>
+          <w:ilvl w:val="0"/>
+          <w:numId w:val="10"/>
+        </w:numPr>
+        <w:spacing w:line="480" w:lineRule="auto"/>
+        <w:rPr>
+          <w:rFonts w:eastAsia="Times New Roman"/>
+          <w:lang w:val="es-HN"/>
+        </w:rPr>
+      </w:pPr>
+      <w:r>
+        <w:rPr>
+          <w:rFonts w:eastAsia="Times New Roman" w:cs="Times New Roman"/>
+          <w:b/>
+          <w:bCs/>
+          <w:szCs w:val="24"/>
+        </w:rPr>
+        <w:lastRenderedPageBreak/>
+        <w:t xml:space="preserve">HU-21 – Seguimiento </w:t>
+      </w:r>
+      <w:r>
+        <w:rPr>
+          <w:rFonts w:eastAsia="Times New Roman" w:cs="Times New Roman"/>
+          <w:b/>
+          <w:bCs/>
+          <w:szCs w:val="24"/>
+        </w:rPr>
+        <w:t xml:space="preserve">y trazabilidad de la atención al paciente: </w:t>
+      </w:r>
+      <w:r>
+        <w:rPr>
+          <w:rFonts w:eastAsia="Times New Roman" w:cs="Times New Roman"/>
+          <w:szCs w:val="24"/>
+        </w:rPr>
+        <w:t xml:space="preserve">Cada usuario del sistema puede atender al paciente según las funciones de su rol, mediante la trazabilidad. Siguiendo el flujo propuesto. El </w:t>
+      </w:r>
+      <w:r>
+        <w:rPr>
+          <w:rFonts w:eastAsia="Times New Roman"/>
+          <w:lang w:val="es-HN"/>
+        </w:rPr>
+        <w:t xml:space="preserve">personal </w:t>
+      </w:r>
+      <w:r>
+        <w:rPr>
+          <w:rFonts w:eastAsia="Times New Roman"/>
+          <w:lang w:val="es-HN"/>
+        </w:rPr>
+        <w:t>de recepción</w:t>
+      </w:r>
+      <w:r>
+        <w:rPr>
+          <w:rFonts w:eastAsia="Times New Roman"/>
+          <w:lang w:val="es-HN"/>
+        </w:rPr>
+        <w:t xml:space="preserve"> </w:t>
+      </w:r>
+      <w:r>
+        <w:rPr>
+          <w:rFonts w:eastAsia="Times New Roman"/>
+          <w:lang w:val="es-HN"/>
+        </w:rPr>
+        <w:t>es</w:t>
+      </w:r>
+      <w:r>
+        <w:rPr>
+          <w:rFonts w:eastAsia="Times New Roman"/>
+          <w:lang w:val="es-HN"/>
+        </w:rPr>
+        <w:t xml:space="preserve"> responsable de la creación inicial del expediente del paciente</w:t>
+      </w:r>
+      <w:r>
+        <w:rPr>
+          <w:rFonts w:eastAsia="Times New Roman"/>
+          <w:lang w:val="es-HN"/>
+        </w:rPr>
+        <w:t xml:space="preserve"> o búsqueda del paciente para registrar la atención del día o programar la cita</w:t>
+      </w:r>
+      <w:r>
+        <w:rPr>
+          <w:rFonts w:eastAsia="Times New Roman"/>
+          <w:lang w:val="es-HN"/>
+        </w:rPr>
+        <w:t>. Posteriormente, el personal de enfermería, desde el área de preclínica, podrá acceder al expediente para registrar información preliminar relevante para la consulta. Finalmente, el médico tendrá acceso tanto al expediente como a los datos registrados en preclínica, permitiéndole disponer de información completa y actualizada para la atención del paciente.</w:t>
+      </w:r>
+    </w:p>
+    <w:p>
+      <w:pPr>
+        <w:numPr>
+          <w:ilvl w:val="0"/>
+          <w:numId w:val="10"/>
+        </w:numPr>
+        <w:spacing w:line="480" w:lineRule="auto"/>
+        <w:jc w:val="both"/>
+        <w:rPr>
+          <w:rFonts w:eastAsia="Times New Roman" w:cs="Times New Roman"/>
+          <w:b/>
+          <w:bCs/>
+          <w:szCs w:val="24"/>
+        </w:rPr>
+      </w:pPr>
+      <w:r>
+        <w:rPr>
+          <w:rFonts w:eastAsia="Times New Roman" w:cs="Times New Roman"/>
+          <w:b/>
+          <w:bCs/>
+          <w:szCs w:val="24"/>
+        </w:rPr>
+        <w:t xml:space="preserve">HU-22 – Gestión y visualización del historial clínico: </w:t>
+      </w:r>
+      <w:r>
+        <w:rPr>
+          <w:rFonts w:eastAsia="Times New Roman" w:cs="Times New Roman"/>
+          <w:szCs w:val="24"/>
+        </w:rPr>
+        <w:t xml:space="preserve">Los usuarios pueden acceder a distintas partes del historial según los roles y permisos. </w:t>
+      </w:r>
+    </w:p>
+    <w:p/>
+    <w:p>
+      <w:pPr>
+        <w:pStyle w:val="Ttulo2"/>
+      </w:pPr>
+      <w:bookmarkStart w:id="35" w:name="_Toc226927159"/>
+      <w:r>
+        <w:t>Sprint Retrospective</w:t>
+      </w:r>
+      <w:bookmarkEnd w:id="35"/>
+    </w:p>
+    <w:p>
+      <w:pPr>
+        <w:pStyle w:val="Ttulo3"/>
+      </w:pPr>
+      <w:bookmarkStart w:id="36" w:name="_Toc226927160"/>
+      <w:r>
+        <w:t>Análisis de la velocidad del equipo</w:t>
+      </w:r>
+      <w:bookmarkEnd w:id="36"/>
+      <w:r>
+        <w:t xml:space="preserve"> </w:t>
+      </w:r>
+    </w:p>
+    <w:p>
+      <w:r>
+        <w:t>Durante el sprint, el equipo logró completar la totalidad de las historias de usuario comprometidas, lo cual refleja un buen nivel de cumplimiento y organización. La distribución de las tallas muestra una mayor concentración en historias de tamaño L, lo que indica que el equipo estuvo trabajando principalmente en tareas de complejidad media-alta.</w:t>
+      </w:r>
+    </w:p>
+    <w:p/>
+    <w:p>
+      <w:pPr>
+        <w:pStyle w:val="Ttulo3"/>
+      </w:pPr>
+      <w:bookmarkStart w:id="37" w:name="_Toc226927161"/>
+      <w:r>
+        <w:t>Cálculo de velocidad</w:t>
+      </w:r>
+      <w:bookmarkEnd w:id="37"/>
+    </w:p>
+    <w:p>
+      <w:r>
+        <w:t xml:space="preserve">Continuando con </w:t>
+      </w:r>
+      <w:r>
+        <w:t>el enfoque de tallas de camiseta, considerando como velocidad la moda de las historias de usuario completadas</w:t>
+      </w:r>
+      <w:r>
+        <w:t xml:space="preserve">; la velocidad del equipo en este cuarto y último sprint, fue </w:t>
+      </w:r>
+      <w:r>
+        <w:rPr>
+          <w:b/>
+          <w:bCs/>
+        </w:rPr>
+        <w:t xml:space="preserve">‘L’; </w:t>
+      </w:r>
+      <w:r>
+        <w:t>e</w:t>
+      </w:r>
+      <w:r>
+        <w:t>sto indica que el equipo, en promedio, pu</w:t>
+      </w:r>
+      <w:r>
+        <w:t>do</w:t>
+      </w:r>
+      <w:r>
+        <w:t xml:space="preserve"> comprometer y completar historias de usuario de tamaño </w:t>
+      </w:r>
+      <w:r>
+        <w:t xml:space="preserve">de complejidad media-alta y se realizó un mayor esfuerzo en para entregar el incremento final del producto. </w:t>
+      </w:r>
+    </w:p>
+    <w:p/>
+    <w:p/>
+    <w:p/>
+    <w:p/>
+    <w:p/>
+    <w:p/>
+    <w:tbl>
+      <w:tblPr>
+        <w:tblW w:w="9226" w:type="dxa"/>
+        <w:tblBorders>
+          <w:top w:val="nil"/>
+          <w:left w:val="nil"/>
+          <w:bottom w:val="nil"/>
+          <w:right w:val="nil"/>
+          <w:insideH w:val="nil"/>
+          <w:insideV w:val="nil"/>
+        </w:tblBorders>
+        <w:tblLayout w:type="fixed"/>
+        <w:tblLook w:val="0600" w:firstRow="0" w:lastRow="0" w:firstColumn="0" w:lastColumn="0" w:noHBand="1" w:noVBand="1"/>
+      </w:tblPr>
+      <w:tblGrid>
+        <w:gridCol w:w="5187"/>
+        <w:gridCol w:w="2020"/>
+        <w:gridCol w:w="2019"/>
+      </w:tblGrid>
+      <w:tr>
+        <w:trPr>
+          <w:trHeight w:val="1021"/>
+        </w:trPr>
+        <w:tc>
+          <w:tcPr>
+            <w:tcW w:w="5187" w:type="dxa"/>
+            <w:tcBorders>
+              <w:top w:val="single" w:sz="5" w:space="0" w:color="1F1F1F"/>
+              <w:left w:val="single" w:sz="5" w:space="0" w:color="1F1F1F"/>
+              <w:bottom w:val="single" w:sz="5" w:space="0" w:color="1F1F1F"/>
+              <w:right w:val="single" w:sz="5" w:space="0" w:color="1F1F1F"/>
+            </w:tcBorders>
+            <w:shd w:val="clear" w:color="auto" w:fill="EFEFEF"/>
+            <w:tcMar>
+              <w:top w:w="113" w:type="dxa"/>
+              <w:left w:w="113" w:type="dxa"/>
+              <w:bottom w:w="113" w:type="dxa"/>
+              <w:right w:w="113" w:type="dxa"/>
+            </w:tcMar>
+          </w:tcPr>
+          <w:p>
+            <w:pPr>
+              <w:spacing w:after="480" w:line="240" w:lineRule="auto"/>
+              <w:jc w:val="center"/>
+              <w:rPr>
+                <w:color w:val="1F1F1F"/>
+                <w:szCs w:val="24"/>
+              </w:rPr>
+            </w:pPr>
+            <w:r>
+              <w:rPr>
+                <w:b/>
+                <w:bCs/>
+                <w:color w:val="1F1F1F"/>
+                <w:szCs w:val="24"/>
+              </w:rPr>
+              <w:t>Historia de Usuario (HU)</w:t>
+            </w:r>
+          </w:p>
+        </w:tc>
+        <w:tc>
+          <w:tcPr>
+            <w:tcW w:w="2020" w:type="dxa"/>
+            <w:tcBorders>
+              <w:top w:val="single" w:sz="5" w:space="0" w:color="1F1F1F"/>
+              <w:left w:val="single" w:sz="5" w:space="0" w:color="1F1F1F"/>
+              <w:bottom w:val="single" w:sz="5" w:space="0" w:color="1F1F1F"/>
+              <w:right w:val="single" w:sz="5" w:space="0" w:color="1F1F1F"/>
+            </w:tcBorders>
+            <w:shd w:val="clear" w:color="auto" w:fill="EFEFEF"/>
+            <w:tcMar>
+              <w:top w:w="113" w:type="dxa"/>
+              <w:left w:w="113" w:type="dxa"/>
+              <w:bottom w:w="113" w:type="dxa"/>
+              <w:right w:w="113" w:type="dxa"/>
+            </w:tcMar>
+          </w:tcPr>
+          <w:p>
+            <w:pPr>
+              <w:spacing w:after="480" w:line="240" w:lineRule="auto"/>
+              <w:jc w:val="center"/>
+              <w:rPr>
+                <w:color w:val="1F1F1F"/>
+                <w:szCs w:val="24"/>
+              </w:rPr>
+            </w:pPr>
+            <w:r>
+              <w:rPr>
+                <w:b/>
+                <w:bCs/>
+                <w:color w:val="1F1F1F"/>
+                <w:szCs w:val="24"/>
+              </w:rPr>
+              <w:t>Talla de Camiseta</w:t>
+            </w:r>
+          </w:p>
+        </w:tc>
+        <w:tc>
+          <w:tcPr>
+            <w:tcW w:w="2019" w:type="dxa"/>
+            <w:tcBorders>
+              <w:top w:val="single" w:sz="5" w:space="0" w:color="1F1F1F"/>
+              <w:left w:val="single" w:sz="5" w:space="0" w:color="1F1F1F"/>
+              <w:bottom w:val="single" w:sz="5" w:space="0" w:color="1F1F1F"/>
+              <w:right w:val="single" w:sz="5" w:space="0" w:color="1F1F1F"/>
+            </w:tcBorders>
+            <w:shd w:val="clear" w:color="auto" w:fill="EFEFEF"/>
+            <w:tcMar>
+              <w:top w:w="113" w:type="dxa"/>
+              <w:left w:w="113" w:type="dxa"/>
+              <w:bottom w:w="113" w:type="dxa"/>
+              <w:right w:w="113" w:type="dxa"/>
+            </w:tcMar>
+          </w:tcPr>
+          <w:p>
+            <w:pPr>
+              <w:spacing w:after="480" w:line="240" w:lineRule="auto"/>
+              <w:jc w:val="center"/>
+              <w:rPr>
+                <w:color w:val="1F1F1F"/>
+                <w:szCs w:val="24"/>
+              </w:rPr>
+            </w:pPr>
+            <w:r>
+              <w:rPr>
+                <w:b/>
+                <w:bCs/>
+                <w:color w:val="1F1F1F"/>
+                <w:szCs w:val="24"/>
+              </w:rPr>
+              <w:t>Estado</w:t>
+            </w:r>
+          </w:p>
+        </w:tc>
+      </w:tr>
+      <w:tr>
+        <w:trPr>
+          <w:trHeight w:val="703"/>
+        </w:trPr>
+        <w:tc>
+          <w:tcPr>
+            <w:tcW w:w="5187" w:type="dxa"/>
+            <w:tcBorders>
+              <w:top w:val="single" w:sz="5" w:space="0" w:color="1F1F1F"/>
+              <w:left w:val="single" w:sz="5" w:space="0" w:color="1F1F1F"/>
+              <w:bottom w:val="single" w:sz="5" w:space="0" w:color="1F1F1F"/>
+              <w:right w:val="single" w:sz="5" w:space="0" w:color="1F1F1F"/>
+            </w:tcBorders>
+            <w:tcMar>
+              <w:top w:w="113" w:type="dxa"/>
+              <w:left w:w="113" w:type="dxa"/>
+              <w:bottom w:w="113" w:type="dxa"/>
+              <w:right w:w="113" w:type="dxa"/>
+            </w:tcMar>
+          </w:tcPr>
+          <w:p>
+            <w:pPr>
+              <w:spacing w:after="480" w:line="240" w:lineRule="auto"/>
+              <w:rPr>
+                <w:color w:val="1F1F1F"/>
+                <w:szCs w:val="24"/>
+              </w:rPr>
+            </w:pPr>
+            <w:r>
+              <w:rPr>
+                <w:rFonts w:eastAsia="Times New Roman" w:cs="Times New Roman"/>
+                <w:b/>
+                <w:bCs/>
+                <w:szCs w:val="24"/>
+              </w:rPr>
+              <w:t>HU-9</w:t>
+            </w:r>
+            <w:r>
+              <w:rPr>
+                <w:rFonts w:eastAsia="Times New Roman" w:cs="Times New Roman"/>
+                <w:b/>
+                <w:bCs/>
+                <w:szCs w:val="24"/>
+              </w:rPr>
+              <w:t>:</w:t>
+            </w:r>
+            <w:r>
+              <w:rPr>
+                <w:rFonts w:eastAsia="Times New Roman" w:cs="Times New Roman"/>
+                <w:b/>
+                <w:bCs/>
+                <w:szCs w:val="24"/>
+              </w:rPr>
+              <w:t xml:space="preserve"> </w:t>
+            </w:r>
+            <w:r>
+              <w:rPr>
+                <w:rFonts w:eastAsia="Times New Roman" w:cs="Times New Roman"/>
+                <w:szCs w:val="24"/>
+              </w:rPr>
+              <w:t>Adjuntar documento</w:t>
+            </w:r>
+          </w:p>
+        </w:tc>
+        <w:tc>
+          <w:tcPr>
+            <w:tcW w:w="2020" w:type="dxa"/>
+            <w:tcBorders>
+              <w:top w:val="single" w:sz="5" w:space="0" w:color="1F1F1F"/>
+              <w:left w:val="single" w:sz="5" w:space="0" w:color="1F1F1F"/>
+              <w:bottom w:val="single" w:sz="5" w:space="0" w:color="1F1F1F"/>
+              <w:right w:val="single" w:sz="5" w:space="0" w:color="1F1F1F"/>
+            </w:tcBorders>
+            <w:tcMar>
+              <w:top w:w="113" w:type="dxa"/>
+              <w:left w:w="113" w:type="dxa"/>
+              <w:bottom w:w="113" w:type="dxa"/>
+              <w:right w:w="113" w:type="dxa"/>
+            </w:tcMar>
+          </w:tcPr>
+          <w:p>
+            <w:pPr>
+              <w:spacing w:after="480" w:line="240" w:lineRule="auto"/>
+              <w:jc w:val="center"/>
+              <w:rPr>
+                <w:b/>
+                <w:bCs/>
+                <w:color w:val="1F1F1F"/>
+                <w:szCs w:val="24"/>
+              </w:rPr>
+            </w:pPr>
+            <w:r>
+              <w:rPr>
+                <w:b/>
+                <w:bCs/>
+                <w:color w:val="1F1F1F"/>
+                <w:szCs w:val="24"/>
+              </w:rPr>
+              <w:t>L</w:t>
+            </w:r>
+          </w:p>
+        </w:tc>
+        <w:tc>
+          <w:tcPr>
+            <w:tcW w:w="2019" w:type="dxa"/>
+            <w:tcBorders>
+              <w:top w:val="single" w:sz="5" w:space="0" w:color="1F1F1F"/>
+              <w:left w:val="single" w:sz="5" w:space="0" w:color="1F1F1F"/>
+              <w:bottom w:val="single" w:sz="5" w:space="0" w:color="1F1F1F"/>
+              <w:right w:val="single" w:sz="5" w:space="0" w:color="1F1F1F"/>
+            </w:tcBorders>
+            <w:tcMar>
+              <w:top w:w="113" w:type="dxa"/>
+              <w:left w:w="113" w:type="dxa"/>
+              <w:bottom w:w="113" w:type="dxa"/>
+              <w:right w:w="113" w:type="dxa"/>
+            </w:tcMar>
+          </w:tcPr>
+          <w:p>
+            <w:pPr>
+              <w:spacing w:after="480" w:line="240" w:lineRule="auto"/>
+              <w:jc w:val="center"/>
+              <w:rPr>
+                <w:color w:val="1F1F1F"/>
+                <w:szCs w:val="24"/>
+              </w:rPr>
+            </w:pPr>
+            <w:r>
+              <w:rPr>
+                <w:color w:val="1F1F1F"/>
+                <w:szCs w:val="24"/>
+              </w:rPr>
+              <w:t>Finalizada</w:t>
+            </w:r>
+          </w:p>
+        </w:tc>
+      </w:tr>
+      <w:tr>
+        <w:trPr>
+          <w:trHeight w:val="736"/>
+        </w:trPr>
+        <w:tc>
+          <w:tcPr>
+            <w:tcW w:w="5187" w:type="dxa"/>
+            <w:tcBorders>
+              <w:top w:val="single" w:sz="5" w:space="0" w:color="1F1F1F"/>
+              <w:left w:val="single" w:sz="5" w:space="0" w:color="1F1F1F"/>
+              <w:bottom w:val="single" w:sz="5" w:space="0" w:color="1F1F1F"/>
+              <w:right w:val="single" w:sz="5" w:space="0" w:color="1F1F1F"/>
+            </w:tcBorders>
+            <w:tcMar>
+              <w:top w:w="113" w:type="dxa"/>
+              <w:left w:w="113" w:type="dxa"/>
+              <w:bottom w:w="113" w:type="dxa"/>
+              <w:right w:w="113" w:type="dxa"/>
+            </w:tcMar>
+          </w:tcPr>
+          <w:p>
+            <w:pPr>
+              <w:spacing w:after="480" w:line="240" w:lineRule="auto"/>
+              <w:rPr>
+                <w:color w:val="1F1F1F"/>
+                <w:szCs w:val="24"/>
+              </w:rPr>
+            </w:pPr>
+            <w:r>
+              <w:rPr>
+                <w:rFonts w:eastAsia="Times New Roman" w:cs="Times New Roman"/>
+                <w:b/>
+                <w:bCs/>
+                <w:szCs w:val="24"/>
+              </w:rPr>
+              <w:t>HU-10</w:t>
+            </w:r>
+            <w:r>
+              <w:rPr>
+                <w:rFonts w:eastAsia="Times New Roman" w:cs="Times New Roman"/>
+                <w:b/>
+                <w:bCs/>
+                <w:szCs w:val="24"/>
+              </w:rPr>
+              <w:t xml:space="preserve">: </w:t>
+            </w:r>
+            <w:r>
+              <w:rPr>
+                <w:rFonts w:eastAsia="Times New Roman" w:cs="Times New Roman"/>
+                <w:szCs w:val="24"/>
+              </w:rPr>
+              <w:t>Visualizar documentos</w:t>
+            </w:r>
+          </w:p>
+        </w:tc>
+        <w:tc>
+          <w:tcPr>
+            <w:tcW w:w="2020" w:type="dxa"/>
+            <w:tcBorders>
+              <w:top w:val="single" w:sz="5" w:space="0" w:color="1F1F1F"/>
+              <w:left w:val="single" w:sz="5" w:space="0" w:color="1F1F1F"/>
+              <w:bottom w:val="single" w:sz="5" w:space="0" w:color="1F1F1F"/>
+              <w:right w:val="single" w:sz="5" w:space="0" w:color="1F1F1F"/>
+            </w:tcBorders>
+            <w:tcMar>
+              <w:top w:w="113" w:type="dxa"/>
+              <w:left w:w="113" w:type="dxa"/>
+              <w:bottom w:w="113" w:type="dxa"/>
+              <w:right w:w="113" w:type="dxa"/>
+            </w:tcMar>
+          </w:tcPr>
+          <w:p>
+            <w:pPr>
+              <w:spacing w:after="480" w:line="240" w:lineRule="auto"/>
+              <w:jc w:val="center"/>
+              <w:rPr>
+                <w:b/>
+                <w:bCs/>
+                <w:color w:val="1F1F1F"/>
+                <w:szCs w:val="24"/>
+              </w:rPr>
+            </w:pPr>
+            <w:r>
+              <w:rPr>
+                <w:b/>
+                <w:bCs/>
+                <w:color w:val="1F1F1F"/>
+                <w:szCs w:val="24"/>
+              </w:rPr>
+              <w:t>M</w:t>
+            </w:r>
+          </w:p>
+        </w:tc>
+        <w:tc>
+          <w:tcPr>
+            <w:tcW w:w="2019" w:type="dxa"/>
+            <w:tcBorders>
+              <w:top w:val="single" w:sz="5" w:space="0" w:color="1F1F1F"/>
+              <w:left w:val="single" w:sz="5" w:space="0" w:color="1F1F1F"/>
+              <w:bottom w:val="single" w:sz="5" w:space="0" w:color="1F1F1F"/>
+              <w:right w:val="single" w:sz="5" w:space="0" w:color="1F1F1F"/>
+            </w:tcBorders>
+            <w:tcMar>
+              <w:top w:w="113" w:type="dxa"/>
+              <w:left w:w="113" w:type="dxa"/>
+              <w:bottom w:w="113" w:type="dxa"/>
+              <w:right w:w="113" w:type="dxa"/>
+            </w:tcMar>
+          </w:tcPr>
+          <w:p>
+            <w:pPr>
+              <w:spacing w:after="480" w:line="240" w:lineRule="auto"/>
+              <w:jc w:val="center"/>
+              <w:rPr>
+                <w:color w:val="1F1F1F"/>
+                <w:szCs w:val="24"/>
+              </w:rPr>
+            </w:pPr>
+            <w:r>
+              <w:rPr>
+                <w:color w:val="1F1F1F"/>
+                <w:szCs w:val="24"/>
+              </w:rPr>
+              <w:t>Finalizada</w:t>
+            </w:r>
+          </w:p>
+        </w:tc>
+      </w:tr>
+      <w:tr>
+        <w:trPr>
+          <w:trHeight w:val="726"/>
+        </w:trPr>
+        <w:tc>
+          <w:tcPr>
+            <w:tcW w:w="5187" w:type="dxa"/>
+            <w:tcBorders>
+              <w:top w:val="single" w:sz="5" w:space="0" w:color="1F1F1F"/>
+              <w:left w:val="single" w:sz="5" w:space="0" w:color="1F1F1F"/>
+              <w:bottom w:val="single" w:sz="5" w:space="0" w:color="1F1F1F"/>
+              <w:right w:val="single" w:sz="5" w:space="0" w:color="1F1F1F"/>
+            </w:tcBorders>
+            <w:tcMar>
+              <w:top w:w="113" w:type="dxa"/>
+              <w:left w:w="113" w:type="dxa"/>
+              <w:bottom w:w="113" w:type="dxa"/>
+              <w:right w:w="113" w:type="dxa"/>
+            </w:tcMar>
+          </w:tcPr>
+          <w:p>
+            <w:pPr>
+              <w:spacing w:after="480" w:line="240" w:lineRule="auto"/>
+              <w:rPr>
+                <w:color w:val="1F1F1F"/>
+                <w:szCs w:val="24"/>
+              </w:rPr>
+            </w:pPr>
+            <w:r>
+              <w:rPr>
+                <w:rFonts w:eastAsia="Times New Roman" w:cs="Times New Roman"/>
+                <w:b/>
+                <w:bCs/>
+                <w:szCs w:val="24"/>
+              </w:rPr>
+              <w:t>HU-19</w:t>
+            </w:r>
+            <w:r>
+              <w:rPr>
+                <w:rFonts w:eastAsia="Times New Roman" w:cs="Times New Roman"/>
+                <w:b/>
+                <w:bCs/>
+                <w:szCs w:val="24"/>
+              </w:rPr>
+              <w:t xml:space="preserve">: </w:t>
+            </w:r>
+            <w:r>
+              <w:rPr>
+                <w:rFonts w:eastAsia="Times New Roman" w:cs="Times New Roman"/>
+                <w:szCs w:val="24"/>
+              </w:rPr>
+              <w:t>Parametrización de medicamentos</w:t>
+            </w:r>
+          </w:p>
+        </w:tc>
+        <w:tc>
+          <w:tcPr>
+            <w:tcW w:w="2020" w:type="dxa"/>
+            <w:tcBorders>
+              <w:top w:val="single" w:sz="5" w:space="0" w:color="1F1F1F"/>
+              <w:left w:val="single" w:sz="5" w:space="0" w:color="1F1F1F"/>
+              <w:bottom w:val="single" w:sz="5" w:space="0" w:color="1F1F1F"/>
+              <w:right w:val="single" w:sz="5" w:space="0" w:color="1F1F1F"/>
+            </w:tcBorders>
+            <w:tcMar>
+              <w:top w:w="113" w:type="dxa"/>
+              <w:left w:w="113" w:type="dxa"/>
+              <w:bottom w:w="113" w:type="dxa"/>
+              <w:right w:w="113" w:type="dxa"/>
+            </w:tcMar>
+          </w:tcPr>
+          <w:p>
+            <w:pPr>
+              <w:spacing w:after="480" w:line="240" w:lineRule="auto"/>
+              <w:jc w:val="center"/>
+              <w:rPr>
+                <w:b/>
+                <w:bCs/>
+                <w:color w:val="1F1F1F"/>
+                <w:szCs w:val="24"/>
+              </w:rPr>
+            </w:pPr>
+            <w:r>
+              <w:rPr>
+                <w:b/>
+                <w:bCs/>
+                <w:color w:val="1F1F1F"/>
+                <w:szCs w:val="24"/>
+              </w:rPr>
+              <w:t>L</w:t>
+            </w:r>
+          </w:p>
+        </w:tc>
+        <w:tc>
+          <w:tcPr>
+            <w:tcW w:w="2019" w:type="dxa"/>
+            <w:tcBorders>
+              <w:top w:val="single" w:sz="5" w:space="0" w:color="1F1F1F"/>
+              <w:left w:val="single" w:sz="5" w:space="0" w:color="1F1F1F"/>
+              <w:bottom w:val="single" w:sz="5" w:space="0" w:color="1F1F1F"/>
+              <w:right w:val="single" w:sz="5" w:space="0" w:color="1F1F1F"/>
+            </w:tcBorders>
+            <w:tcMar>
+              <w:top w:w="113" w:type="dxa"/>
+              <w:left w:w="113" w:type="dxa"/>
+              <w:bottom w:w="113" w:type="dxa"/>
+              <w:right w:w="113" w:type="dxa"/>
+            </w:tcMar>
+          </w:tcPr>
+          <w:p>
+            <w:pPr>
+              <w:spacing w:after="480" w:line="240" w:lineRule="auto"/>
+              <w:jc w:val="center"/>
+              <w:rPr>
+                <w:color w:val="1F1F1F"/>
+                <w:szCs w:val="24"/>
+              </w:rPr>
+            </w:pPr>
+            <w:r>
+              <w:rPr>
+                <w:color w:val="1F1F1F"/>
+                <w:szCs w:val="24"/>
+              </w:rPr>
+              <w:t xml:space="preserve">Finalizada </w:t>
+            </w:r>
+          </w:p>
+        </w:tc>
+      </w:tr>
+      <w:tr>
+        <w:trPr>
+          <w:trHeight w:val="726"/>
+        </w:trPr>
+        <w:tc>
+          <w:tcPr>
+            <w:tcW w:w="5187" w:type="dxa"/>
+            <w:tcBorders>
+              <w:top w:val="single" w:sz="5" w:space="0" w:color="1F1F1F"/>
+              <w:left w:val="single" w:sz="5" w:space="0" w:color="1F1F1F"/>
+              <w:bottom w:val="single" w:sz="5" w:space="0" w:color="1F1F1F"/>
+              <w:right w:val="single" w:sz="5" w:space="0" w:color="1F1F1F"/>
+            </w:tcBorders>
+            <w:tcMar>
+              <w:top w:w="113" w:type="dxa"/>
+              <w:left w:w="113" w:type="dxa"/>
+              <w:bottom w:w="113" w:type="dxa"/>
+              <w:right w:w="113" w:type="dxa"/>
+            </w:tcMar>
+          </w:tcPr>
+          <w:p>
+            <w:pPr>
+              <w:spacing w:after="480" w:line="240" w:lineRule="auto"/>
+              <w:rPr>
+                <w:color w:val="1F1F1F"/>
+                <w:szCs w:val="24"/>
+              </w:rPr>
+            </w:pPr>
+            <w:r>
+              <w:rPr>
+                <w:rFonts w:eastAsia="Times New Roman" w:cs="Times New Roman"/>
+                <w:b/>
+                <w:bCs/>
+                <w:szCs w:val="24"/>
+              </w:rPr>
+              <w:t>HU-20</w:t>
+            </w:r>
+            <w:r>
+              <w:rPr>
+                <w:rFonts w:eastAsia="Times New Roman" w:cs="Times New Roman"/>
+                <w:b/>
+                <w:bCs/>
+                <w:szCs w:val="24"/>
+              </w:rPr>
+              <w:t xml:space="preserve">: </w:t>
+            </w:r>
+            <w:r>
+              <w:rPr>
+                <w:rFonts w:eastAsia="Times New Roman" w:cs="Times New Roman"/>
+                <w:szCs w:val="24"/>
+              </w:rPr>
+              <w:t>Parametrización de exámenes médicos</w:t>
+            </w:r>
+          </w:p>
+        </w:tc>
+        <w:tc>
+          <w:tcPr>
+            <w:tcW w:w="2020" w:type="dxa"/>
+            <w:tcBorders>
+              <w:top w:val="single" w:sz="5" w:space="0" w:color="1F1F1F"/>
+              <w:left w:val="single" w:sz="5" w:space="0" w:color="1F1F1F"/>
+              <w:bottom w:val="single" w:sz="5" w:space="0" w:color="1F1F1F"/>
+              <w:right w:val="single" w:sz="5" w:space="0" w:color="1F1F1F"/>
+            </w:tcBorders>
+            <w:tcMar>
+              <w:top w:w="113" w:type="dxa"/>
+              <w:left w:w="113" w:type="dxa"/>
+              <w:bottom w:w="113" w:type="dxa"/>
+              <w:right w:w="113" w:type="dxa"/>
+            </w:tcMar>
+          </w:tcPr>
+          <w:p>
+            <w:pPr>
+              <w:spacing w:after="480" w:line="240" w:lineRule="auto"/>
+              <w:jc w:val="center"/>
+              <w:rPr>
+                <w:b/>
+                <w:bCs/>
+                <w:color w:val="1F1F1F"/>
+                <w:szCs w:val="24"/>
+              </w:rPr>
+            </w:pPr>
+            <w:r>
+              <w:rPr>
+                <w:b/>
+                <w:bCs/>
+                <w:color w:val="1F1F1F"/>
+                <w:szCs w:val="24"/>
+              </w:rPr>
+              <w:t>L</w:t>
+            </w:r>
+          </w:p>
+        </w:tc>
+        <w:tc>
+          <w:tcPr>
+            <w:tcW w:w="2019" w:type="dxa"/>
+            <w:tcBorders>
+              <w:top w:val="single" w:sz="5" w:space="0" w:color="1F1F1F"/>
+              <w:left w:val="single" w:sz="5" w:space="0" w:color="1F1F1F"/>
+              <w:bottom w:val="single" w:sz="5" w:space="0" w:color="1F1F1F"/>
+              <w:right w:val="single" w:sz="5" w:space="0" w:color="1F1F1F"/>
+            </w:tcBorders>
+            <w:tcMar>
+              <w:top w:w="113" w:type="dxa"/>
+              <w:left w:w="113" w:type="dxa"/>
+              <w:bottom w:w="113" w:type="dxa"/>
+              <w:right w:w="113" w:type="dxa"/>
+            </w:tcMar>
+          </w:tcPr>
+          <w:p>
+            <w:pPr>
+              <w:spacing w:after="480" w:line="240" w:lineRule="auto"/>
+              <w:jc w:val="center"/>
+              <w:rPr>
+                <w:color w:val="1F1F1F"/>
+                <w:szCs w:val="24"/>
+              </w:rPr>
+            </w:pPr>
+            <w:r>
+              <w:rPr>
+                <w:color w:val="1F1F1F"/>
+                <w:szCs w:val="24"/>
+              </w:rPr>
+              <w:t>Finalizada</w:t>
+            </w:r>
+          </w:p>
+        </w:tc>
+      </w:tr>
+      <w:tr>
+        <w:trPr>
+          <w:trHeight w:val="726"/>
+        </w:trPr>
+        <w:tc>
+          <w:tcPr>
+            <w:tcW w:w="5187" w:type="dxa"/>
+            <w:tcBorders>
+              <w:top w:val="single" w:sz="5" w:space="0" w:color="1F1F1F"/>
+              <w:left w:val="single" w:sz="5" w:space="0" w:color="1F1F1F"/>
+              <w:bottom w:val="single" w:sz="5" w:space="0" w:color="1F1F1F"/>
+              <w:right w:val="single" w:sz="5" w:space="0" w:color="1F1F1F"/>
+            </w:tcBorders>
+            <w:tcMar>
+              <w:top w:w="113" w:type="dxa"/>
+              <w:left w:w="113" w:type="dxa"/>
+              <w:bottom w:w="113" w:type="dxa"/>
+              <w:right w:w="113" w:type="dxa"/>
+            </w:tcMar>
+          </w:tcPr>
+          <w:p>
+            <w:pPr>
+              <w:spacing w:after="480" w:line="240" w:lineRule="auto"/>
+              <w:rPr>
+                <w:color w:val="1F1F1F"/>
+                <w:szCs w:val="24"/>
+              </w:rPr>
+            </w:pPr>
+            <w:r>
+              <w:rPr>
+                <w:rFonts w:eastAsia="Times New Roman" w:cs="Times New Roman"/>
+                <w:b/>
+                <w:bCs/>
+                <w:szCs w:val="24"/>
+              </w:rPr>
+              <w:t>HU-2</w:t>
+            </w:r>
+            <w:r>
+              <w:rPr>
+                <w:rFonts w:eastAsia="Times New Roman" w:cs="Times New Roman"/>
+                <w:b/>
+                <w:bCs/>
+                <w:szCs w:val="24"/>
+              </w:rPr>
+              <w:t>1:</w:t>
+            </w:r>
+            <w:r>
+              <w:rPr>
+                <w:rFonts w:eastAsia="Times New Roman" w:cs="Times New Roman"/>
+                <w:b/>
+                <w:bCs/>
+                <w:szCs w:val="24"/>
+              </w:rPr>
+              <w:t xml:space="preserve"> </w:t>
+            </w:r>
+            <w:r>
+              <w:rPr>
+                <w:rFonts w:eastAsia="Times New Roman" w:cs="Times New Roman"/>
+                <w:szCs w:val="24"/>
+              </w:rPr>
+              <w:t>Seguimiento y trazabilidad de la atención al paciente</w:t>
+            </w:r>
+          </w:p>
+        </w:tc>
+        <w:tc>
+          <w:tcPr>
+            <w:tcW w:w="2020" w:type="dxa"/>
+            <w:tcBorders>
+              <w:top w:val="single" w:sz="5" w:space="0" w:color="1F1F1F"/>
+              <w:left w:val="single" w:sz="5" w:space="0" w:color="1F1F1F"/>
+              <w:bottom w:val="single" w:sz="5" w:space="0" w:color="1F1F1F"/>
+              <w:right w:val="single" w:sz="5" w:space="0" w:color="1F1F1F"/>
+            </w:tcBorders>
+            <w:tcMar>
+              <w:top w:w="113" w:type="dxa"/>
+              <w:left w:w="113" w:type="dxa"/>
+              <w:bottom w:w="113" w:type="dxa"/>
+              <w:right w:w="113" w:type="dxa"/>
+            </w:tcMar>
+          </w:tcPr>
+          <w:p>
+            <w:pPr>
+              <w:spacing w:after="480" w:line="240" w:lineRule="auto"/>
+              <w:jc w:val="center"/>
+              <w:rPr>
+                <w:b/>
+                <w:bCs/>
+                <w:color w:val="1F1F1F"/>
+                <w:szCs w:val="24"/>
+              </w:rPr>
+            </w:pPr>
+            <w:r>
+              <w:rPr>
+                <w:b/>
+                <w:bCs/>
+                <w:color w:val="1F1F1F"/>
+                <w:szCs w:val="24"/>
+              </w:rPr>
+              <w:t>XL</w:t>
+            </w:r>
+          </w:p>
+        </w:tc>
+        <w:tc>
+          <w:tcPr>
+            <w:tcW w:w="2019" w:type="dxa"/>
+            <w:tcBorders>
+              <w:top w:val="single" w:sz="5" w:space="0" w:color="1F1F1F"/>
+              <w:left w:val="single" w:sz="5" w:space="0" w:color="1F1F1F"/>
+              <w:bottom w:val="single" w:sz="5" w:space="0" w:color="1F1F1F"/>
+              <w:right w:val="single" w:sz="5" w:space="0" w:color="1F1F1F"/>
+            </w:tcBorders>
+            <w:tcMar>
+              <w:top w:w="113" w:type="dxa"/>
+              <w:left w:w="113" w:type="dxa"/>
+              <w:bottom w:w="113" w:type="dxa"/>
+              <w:right w:w="113" w:type="dxa"/>
+            </w:tcMar>
+          </w:tcPr>
+          <w:p>
+            <w:pPr>
+              <w:spacing w:after="480" w:line="240" w:lineRule="auto"/>
+              <w:jc w:val="center"/>
+              <w:rPr>
+                <w:color w:val="1F1F1F"/>
+                <w:szCs w:val="24"/>
+              </w:rPr>
+            </w:pPr>
+            <w:r>
+              <w:rPr>
+                <w:color w:val="1F1F1F"/>
+                <w:szCs w:val="24"/>
+              </w:rPr>
+              <w:t>Finalizada</w:t>
+            </w:r>
+          </w:p>
+        </w:tc>
+      </w:tr>
+      <w:tr>
+        <w:trPr>
+          <w:trHeight w:val="726"/>
+        </w:trPr>
+        <w:tc>
+          <w:tcPr>
+            <w:tcW w:w="5187" w:type="dxa"/>
+            <w:tcBorders>
+              <w:top w:val="single" w:sz="5" w:space="0" w:color="1F1F1F"/>
+              <w:left w:val="single" w:sz="5" w:space="0" w:color="1F1F1F"/>
+              <w:bottom w:val="single" w:sz="5" w:space="0" w:color="1F1F1F"/>
+              <w:right w:val="single" w:sz="5" w:space="0" w:color="1F1F1F"/>
+            </w:tcBorders>
+            <w:tcMar>
+              <w:top w:w="113" w:type="dxa"/>
+              <w:left w:w="113" w:type="dxa"/>
+              <w:bottom w:w="113" w:type="dxa"/>
+              <w:right w:w="113" w:type="dxa"/>
+            </w:tcMar>
+          </w:tcPr>
+          <w:p>
+            <w:pPr>
+              <w:spacing w:after="480" w:line="240" w:lineRule="auto"/>
+              <w:rPr>
+                <w:color w:val="1F1F1F"/>
+                <w:szCs w:val="24"/>
+              </w:rPr>
+            </w:pPr>
+            <w:r>
+              <w:rPr>
+                <w:rFonts w:eastAsia="Times New Roman" w:cs="Times New Roman"/>
+                <w:b/>
+                <w:bCs/>
+                <w:szCs w:val="24"/>
+              </w:rPr>
+              <w:t>HU-22</w:t>
+            </w:r>
+            <w:r>
+              <w:rPr>
+                <w:rFonts w:eastAsia="Times New Roman" w:cs="Times New Roman"/>
+                <w:b/>
+                <w:bCs/>
+                <w:szCs w:val="24"/>
+              </w:rPr>
+              <w:t xml:space="preserve">: </w:t>
+            </w:r>
+            <w:r>
+              <w:rPr>
+                <w:rFonts w:eastAsia="Times New Roman" w:cs="Times New Roman"/>
+                <w:szCs w:val="24"/>
+              </w:rPr>
+              <w:t>Gestión y visualización del historial clínico</w:t>
+            </w:r>
+          </w:p>
+        </w:tc>
+        <w:tc>
+          <w:tcPr>
+            <w:tcW w:w="2020" w:type="dxa"/>
+            <w:tcBorders>
+              <w:top w:val="single" w:sz="5" w:space="0" w:color="1F1F1F"/>
+              <w:left w:val="single" w:sz="5" w:space="0" w:color="1F1F1F"/>
+              <w:bottom w:val="single" w:sz="5" w:space="0" w:color="1F1F1F"/>
+              <w:right w:val="single" w:sz="5" w:space="0" w:color="1F1F1F"/>
+            </w:tcBorders>
+            <w:tcMar>
+              <w:top w:w="113" w:type="dxa"/>
+              <w:left w:w="113" w:type="dxa"/>
+              <w:bottom w:w="113" w:type="dxa"/>
+              <w:right w:w="113" w:type="dxa"/>
+            </w:tcMar>
+          </w:tcPr>
+          <w:p>
+            <w:pPr>
+              <w:spacing w:after="480" w:line="240" w:lineRule="auto"/>
+              <w:jc w:val="center"/>
+              <w:rPr>
+                <w:b/>
+                <w:bCs/>
+                <w:color w:val="1F1F1F"/>
+                <w:szCs w:val="24"/>
+              </w:rPr>
+            </w:pPr>
+            <w:r>
+              <w:rPr>
+                <w:b/>
+                <w:bCs/>
+                <w:color w:val="1F1F1F"/>
+                <w:szCs w:val="24"/>
+              </w:rPr>
+              <w:t>L</w:t>
+            </w:r>
+          </w:p>
+        </w:tc>
+        <w:tc>
+          <w:tcPr>
+            <w:tcW w:w="2019" w:type="dxa"/>
+            <w:tcBorders>
+              <w:top w:val="single" w:sz="5" w:space="0" w:color="1F1F1F"/>
+              <w:left w:val="single" w:sz="5" w:space="0" w:color="1F1F1F"/>
+              <w:bottom w:val="single" w:sz="5" w:space="0" w:color="1F1F1F"/>
+              <w:right w:val="single" w:sz="5" w:space="0" w:color="1F1F1F"/>
+            </w:tcBorders>
+            <w:tcMar>
+              <w:top w:w="113" w:type="dxa"/>
+              <w:left w:w="113" w:type="dxa"/>
+              <w:bottom w:w="113" w:type="dxa"/>
+              <w:right w:w="113" w:type="dxa"/>
+            </w:tcMar>
+          </w:tcPr>
+          <w:p>
+            <w:pPr>
+              <w:spacing w:after="480" w:line="240" w:lineRule="auto"/>
+              <w:jc w:val="center"/>
+              <w:rPr>
+                <w:color w:val="1F1F1F"/>
+                <w:szCs w:val="24"/>
+              </w:rPr>
+            </w:pPr>
+            <w:r>
+              <w:rPr>
+                <w:color w:val="1F1F1F"/>
+                <w:szCs w:val="24"/>
+              </w:rPr>
+              <w:t>Finalizada</w:t>
+            </w:r>
+          </w:p>
+        </w:tc>
+      </w:tr>
+    </w:tbl>
+    <w:p/>
+    <w:p>
+      <w:pPr>
+        <w:pStyle w:val="Ttulo3"/>
+      </w:pPr>
+      <w:bookmarkStart w:id="38" w:name="_Toc226927162"/>
+      <w:r>
+        <w:t>Retrospectiva</w:t>
+      </w:r>
+      <w:r>
+        <w:t xml:space="preserve"> (final)</w:t>
+      </w:r>
+      <w:r>
+        <w:t xml:space="preserve"> de la Dinámica del Equipo</w:t>
+      </w:r>
+      <w:bookmarkEnd w:id="38"/>
+    </w:p>
+    <w:p>
+      <w:pPr>
+        <w:rPr>
+          <w:b/>
+          <w:bCs/>
+        </w:rPr>
+      </w:pPr>
+      <w:r>
+        <w:rPr>
+          <w:b/>
+          <w:bCs/>
+        </w:rPr>
+        <w:t>¿Qué salió bien?</w:t>
+      </w:r>
+    </w:p>
+    <w:p>
+      <w:pPr>
+        <w:pStyle w:val="Prrafodelista"/>
+        <w:numPr>
+          <w:ilvl w:val="0"/>
+          <w:numId w:val="7"/>
+        </w:numPr>
+      </w:pPr>
+      <w:r>
+        <w:t>Se completaron todas las historias de usuario del backlog, cumpliendo con el alcance definido del proyecto.</w:t>
+      </w:r>
+    </w:p>
+    <w:p>
+      <w:pPr>
+        <w:pStyle w:val="Prrafodelista"/>
+        <w:numPr>
+          <w:ilvl w:val="0"/>
+          <w:numId w:val="7"/>
+        </w:numPr>
+      </w:pPr>
+      <w:r>
+        <w:t>El equipo mantuvo un ritmo de trabajo constante, logrando finalizar historias de tamaño L y una de tamaño XL.</w:t>
+      </w:r>
+    </w:p>
+    <w:p>
+      <w:pPr>
+        <w:pStyle w:val="Prrafodelista"/>
+        <w:numPr>
+          <w:ilvl w:val="0"/>
+          <w:numId w:val="7"/>
+        </w:numPr>
+      </w:pPr>
+      <w:r>
+        <w:t>Se consolidaron funcionalidades clave del sistema, incluyendo la gestión de documentos, parametrización y trazabilidad del paciente.</w:t>
+      </w:r>
+    </w:p>
+    <w:p>
+      <w:pPr>
+        <w:pStyle w:val="Prrafodelista"/>
+      </w:pPr>
+    </w:p>
+    <w:p>
+      <w:pPr>
+        <w:pStyle w:val="Prrafodelista"/>
+      </w:pPr>
+    </w:p>
+    <w:p>
+      <w:pPr>
+        <w:rPr>
+          <w:b/>
+          <w:bCs/>
+        </w:rPr>
+      </w:pPr>
+      <w:r>
+        <w:rPr>
+          <w:b/>
+          <w:bCs/>
+        </w:rPr>
+        <w:lastRenderedPageBreak/>
+        <w:t>¿Qué no salió bien?</w:t>
+      </w:r>
+    </w:p>
+    <w:p>
+      <w:pPr>
+        <w:pStyle w:val="Prrafodelista"/>
+        <w:numPr>
+          <w:ilvl w:val="0"/>
+          <w:numId w:val="11"/>
+        </w:numPr>
+      </w:pPr>
+      <w:r>
+        <w:t xml:space="preserve">Las </w:t>
+      </w:r>
+      <w:r>
+        <w:t>historias de mayor tamaño (L y XL) pudieron representar una mayor carga de trabajo hacia el final del sprint.</w:t>
+      </w:r>
+    </w:p>
+    <w:p>
+      <w:pPr>
+        <w:spacing w:line="480" w:lineRule="auto"/>
+        <w:jc w:val="both"/>
+        <w:rPr>
+          <w:rFonts w:eastAsia="Times New Roman" w:cs="Times New Roman"/>
+          <w:szCs w:val="24"/>
+        </w:rPr>
+      </w:pPr>
+    </w:p>
+    <w:p>
+      <w:pPr>
+        <w:spacing w:line="480" w:lineRule="auto"/>
+        <w:ind w:left="720"/>
+        <w:jc w:val="both"/>
+        <w:rPr>
+          <w:rFonts w:eastAsia="Times New Roman" w:cs="Times New Roman"/>
+          <w:szCs w:val="24"/>
+        </w:rPr>
+      </w:pPr>
     </w:p>
     <w:p/>
     <w:sectPr>
@@ -10256,9 +12146,9 @@
     </w:lvl>
   </w:abstractNum>
   <w:abstractNum w:abstractNumId="2" w15:restartNumberingAfterBreak="0">
-    <w:nsid w:val="34196877"/>
+    <w:nsid w:val="20047CFD"/>
     <w:multiLevelType w:val="hybridMultilevel"/>
-    <w:tmpl w:val="D04EC110"/>
+    <w:tmpl w:val="8BE8AA56"/>
     <w:lvl w:ilvl="0" w:tplc="480A0001">
       <w:start w:val="1"/>
       <w:numFmt w:val="bullet"/>
@@ -10369,7 +12259,7 @@
     </w:lvl>
   </w:abstractNum>
   <w:abstractNum w:abstractNumId="3" w15:restartNumberingAfterBreak="0">
-    <w:nsid w:val="44867D29"/>
+    <w:nsid w:val="22914EBC"/>
     <w:multiLevelType w:val="multilevel"/>
     <w:tmpl w:val="638C7918"/>
     <w:lvl w:ilvl="0">
@@ -10482,9 +12372,9 @@
     </w:lvl>
   </w:abstractNum>
   <w:abstractNum w:abstractNumId="4" w15:restartNumberingAfterBreak="0">
-    <w:nsid w:val="4B4F6C6D"/>
+    <w:nsid w:val="34196877"/>
     <w:multiLevelType w:val="hybridMultilevel"/>
-    <w:tmpl w:val="159C86F2"/>
+    <w:tmpl w:val="D04EC110"/>
     <w:lvl w:ilvl="0" w:tplc="480A0001">
       <w:start w:val="1"/>
       <w:numFmt w:val="bullet"/>
@@ -10595,6 +12485,232 @@
     </w:lvl>
   </w:abstractNum>
   <w:abstractNum w:abstractNumId="5" w15:restartNumberingAfterBreak="0">
+    <w:nsid w:val="44867D29"/>
+    <w:multiLevelType w:val="multilevel"/>
+    <w:tmpl w:val="638C7918"/>
+    <w:lvl w:ilvl="0">
+      <w:start w:val="1"/>
+      <w:numFmt w:val="decimal"/>
+      <w:lvlText w:val="%1."/>
+      <w:lvlJc w:val="left"/>
+      <w:pPr>
+        <w:ind w:left="720" w:hanging="360"/>
+      </w:pPr>
+      <w:rPr>
+        <w:u w:val="none"/>
+      </w:rPr>
+    </w:lvl>
+    <w:lvl w:ilvl="1">
+      <w:start w:val="1"/>
+      <w:numFmt w:val="lowerLetter"/>
+      <w:lvlText w:val="%2."/>
+      <w:lvlJc w:val="left"/>
+      <w:pPr>
+        <w:ind w:left="1440" w:hanging="360"/>
+      </w:pPr>
+      <w:rPr>
+        <w:u w:val="none"/>
+      </w:rPr>
+    </w:lvl>
+    <w:lvl w:ilvl="2">
+      <w:start w:val="1"/>
+      <w:numFmt w:val="lowerRoman"/>
+      <w:lvlText w:val="%3."/>
+      <w:lvlJc w:val="right"/>
+      <w:pPr>
+        <w:ind w:left="2160" w:hanging="360"/>
+      </w:pPr>
+      <w:rPr>
+        <w:u w:val="none"/>
+      </w:rPr>
+    </w:lvl>
+    <w:lvl w:ilvl="3">
+      <w:start w:val="1"/>
+      <w:numFmt w:val="decimal"/>
+      <w:lvlText w:val="%4."/>
+      <w:lvlJc w:val="left"/>
+      <w:pPr>
+        <w:ind w:left="2880" w:hanging="360"/>
+      </w:pPr>
+      <w:rPr>
+        <w:u w:val="none"/>
+      </w:rPr>
+    </w:lvl>
+    <w:lvl w:ilvl="4">
+      <w:start w:val="1"/>
+      <w:numFmt w:val="lowerLetter"/>
+      <w:lvlText w:val="%5."/>
+      <w:lvlJc w:val="left"/>
+      <w:pPr>
+        <w:ind w:left="3600" w:hanging="360"/>
+      </w:pPr>
+      <w:rPr>
+        <w:u w:val="none"/>
+      </w:rPr>
+    </w:lvl>
+    <w:lvl w:ilvl="5">
+      <w:start w:val="1"/>
+      <w:numFmt w:val="lowerRoman"/>
+      <w:lvlText w:val="%6."/>
+      <w:lvlJc w:val="right"/>
+      <w:pPr>
+        <w:ind w:left="4320" w:hanging="360"/>
+      </w:pPr>
+      <w:rPr>
+        <w:u w:val="none"/>
+      </w:rPr>
+    </w:lvl>
+    <w:lvl w:ilvl="6">
+      <w:start w:val="1"/>
+      <w:numFmt w:val="decimal"/>
+      <w:lvlText w:val="%7."/>
+      <w:lvlJc w:val="left"/>
+      <w:pPr>
+        <w:ind w:left="5040" w:hanging="360"/>
+      </w:pPr>
+      <w:rPr>
+        <w:u w:val="none"/>
+      </w:rPr>
+    </w:lvl>
+    <w:lvl w:ilvl="7">
+      <w:start w:val="1"/>
+      <w:numFmt w:val="lowerLetter"/>
+      <w:lvlText w:val="%8."/>
+      <w:lvlJc w:val="left"/>
+      <w:pPr>
+        <w:ind w:left="5760" w:hanging="360"/>
+      </w:pPr>
+      <w:rPr>
+        <w:u w:val="none"/>
+      </w:rPr>
+    </w:lvl>
+    <w:lvl w:ilvl="8">
+      <w:start w:val="1"/>
+      <w:numFmt w:val="lowerRoman"/>
+      <w:lvlText w:val="%9."/>
+      <w:lvlJc w:val="right"/>
+      <w:pPr>
+        <w:ind w:left="6480" w:hanging="360"/>
+      </w:pPr>
+      <w:rPr>
+        <w:u w:val="none"/>
+      </w:rPr>
+    </w:lvl>
+  </w:abstractNum>
+  <w:abstractNum w:abstractNumId="6" w15:restartNumberingAfterBreak="0">
+    <w:nsid w:val="4B4F6C6D"/>
+    <w:multiLevelType w:val="hybridMultilevel"/>
+    <w:tmpl w:val="B2EA72B6"/>
+    <w:lvl w:ilvl="0" w:tplc="480A0001">
+      <w:start w:val="1"/>
+      <w:numFmt w:val="bullet"/>
+      <w:lvlText w:val=""/>
+      <w:lvlJc w:val="left"/>
+      <w:pPr>
+        <w:ind w:left="720" w:hanging="360"/>
+      </w:pPr>
+      <w:rPr>
+        <w:rFonts w:ascii="Symbol" w:hAnsi="Symbol" w:hint="default"/>
+      </w:rPr>
+    </w:lvl>
+    <w:lvl w:ilvl="1" w:tplc="480A0003" w:tentative="1">
+      <w:start w:val="1"/>
+      <w:numFmt w:val="bullet"/>
+      <w:lvlText w:val="o"/>
+      <w:lvlJc w:val="left"/>
+      <w:pPr>
+        <w:ind w:left="1440" w:hanging="360"/>
+      </w:pPr>
+      <w:rPr>
+        <w:rFonts w:ascii="Courier New" w:hAnsi="Courier New" w:cs="Courier New" w:hint="default"/>
+      </w:rPr>
+    </w:lvl>
+    <w:lvl w:ilvl="2" w:tplc="480A0005" w:tentative="1">
+      <w:start w:val="1"/>
+      <w:numFmt w:val="bullet"/>
+      <w:lvlText w:val=""/>
+      <w:lvlJc w:val="left"/>
+      <w:pPr>
+        <w:ind w:left="2160" w:hanging="360"/>
+      </w:pPr>
+      <w:rPr>
+        <w:rFonts w:ascii="Wingdings" w:hAnsi="Wingdings" w:hint="default"/>
+      </w:rPr>
+    </w:lvl>
+    <w:lvl w:ilvl="3" w:tplc="480A0001" w:tentative="1">
+      <w:start w:val="1"/>
+      <w:numFmt w:val="bullet"/>
+      <w:lvlText w:val=""/>
+      <w:lvlJc w:val="left"/>
+      <w:pPr>
+        <w:ind w:left="2880" w:hanging="360"/>
+      </w:pPr>
+      <w:rPr>
+        <w:rFonts w:ascii="Symbol" w:hAnsi="Symbol" w:hint="default"/>
+      </w:rPr>
+    </w:lvl>
+    <w:lvl w:ilvl="4" w:tplc="480A0003" w:tentative="1">
+      <w:start w:val="1"/>
+      <w:numFmt w:val="bullet"/>
+      <w:lvlText w:val="o"/>
+      <w:lvlJc w:val="left"/>
+      <w:pPr>
+        <w:ind w:left="3600" w:hanging="360"/>
+      </w:pPr>
+      <w:rPr>
+        <w:rFonts w:ascii="Courier New" w:hAnsi="Courier New" w:cs="Courier New" w:hint="default"/>
+      </w:rPr>
+    </w:lvl>
+    <w:lvl w:ilvl="5" w:tplc="480A0005" w:tentative="1">
+      <w:start w:val="1"/>
+      <w:numFmt w:val="bullet"/>
+      <w:lvlText w:val=""/>
+      <w:lvlJc w:val="left"/>
+      <w:pPr>
+        <w:ind w:left="4320" w:hanging="360"/>
+      </w:pPr>
+      <w:rPr>
+        <w:rFonts w:ascii="Wingdings" w:hAnsi="Wingdings" w:hint="default"/>
+      </w:rPr>
+    </w:lvl>
+    <w:lvl w:ilvl="6" w:tplc="480A0001" w:tentative="1">
+      <w:start w:val="1"/>
+      <w:numFmt w:val="bullet"/>
+      <w:lvlText w:val=""/>
+      <w:lvlJc w:val="left"/>
+      <w:pPr>
+        <w:ind w:left="5040" w:hanging="360"/>
+      </w:pPr>
+      <w:rPr>
+        <w:rFonts w:ascii="Symbol" w:hAnsi="Symbol" w:hint="default"/>
+      </w:rPr>
+    </w:lvl>
+    <w:lvl w:ilvl="7" w:tplc="480A0003" w:tentative="1">
+      <w:start w:val="1"/>
+      <w:numFmt w:val="bullet"/>
+      <w:lvlText w:val="o"/>
+      <w:lvlJc w:val="left"/>
+      <w:pPr>
+        <w:ind w:left="5760" w:hanging="360"/>
+      </w:pPr>
+      <w:rPr>
+        <w:rFonts w:ascii="Courier New" w:hAnsi="Courier New" w:cs="Courier New" w:hint="default"/>
+      </w:rPr>
+    </w:lvl>
+    <w:lvl w:ilvl="8" w:tplc="480A0005" w:tentative="1">
+      <w:start w:val="1"/>
+      <w:numFmt w:val="bullet"/>
+      <w:lvlText w:val=""/>
+      <w:lvlJc w:val="left"/>
+      <w:pPr>
+        <w:ind w:left="6480" w:hanging="360"/>
+      </w:pPr>
+      <w:rPr>
+        <w:rFonts w:ascii="Wingdings" w:hAnsi="Wingdings" w:hint="default"/>
+      </w:rPr>
+    </w:lvl>
+  </w:abstractNum>
+  <w:abstractNum w:abstractNumId="7" w15:restartNumberingAfterBreak="0">
     <w:nsid w:val="56D4541B"/>
     <w:multiLevelType w:val="multilevel"/>
     <w:tmpl w:val="A3547C44"/>
@@ -10707,7 +12823,7 @@
       </w:rPr>
     </w:lvl>
   </w:abstractNum>
-  <w:abstractNum w:abstractNumId="6" w15:restartNumberingAfterBreak="0">
+  <w:abstractNum w:abstractNumId="8" w15:restartNumberingAfterBreak="0">
     <w:nsid w:val="6C0551D0"/>
     <w:multiLevelType w:val="multilevel"/>
     <w:tmpl w:val="638C7918"/>
@@ -10820,7 +12936,7 @@
       </w:rPr>
     </w:lvl>
   </w:abstractNum>
-  <w:abstractNum w:abstractNumId="7" w15:restartNumberingAfterBreak="0">
+  <w:abstractNum w:abstractNumId="9" w15:restartNumberingAfterBreak="0">
     <w:nsid w:val="70234DD8"/>
     <w:multiLevelType w:val="multilevel"/>
     <w:tmpl w:val="638C7918"/>
@@ -10933,7 +13049,7 @@
       </w:rPr>
     </w:lvl>
   </w:abstractNum>
-  <w:abstractNum w:abstractNumId="8" w15:restartNumberingAfterBreak="0">
+  <w:abstractNum w:abstractNumId="10" w15:restartNumberingAfterBreak="0">
     <w:nsid w:val="7CA51E71"/>
     <w:multiLevelType w:val="multilevel"/>
     <w:tmpl w:val="14901C0C"/>
@@ -11047,31 +13163,37 @@
     </w:lvl>
   </w:abstractNum>
   <w:num w:numId="1" w16cid:durableId="1439787843">
-    <w:abstractNumId w:val="7"/>
+    <w:abstractNumId w:val="9"/>
   </w:num>
   <w:num w:numId="2" w16cid:durableId="446241866">
-    <w:abstractNumId w:val="5"/>
+    <w:abstractNumId w:val="7"/>
   </w:num>
   <w:num w:numId="3" w16cid:durableId="307634270">
     <w:abstractNumId w:val="1"/>
   </w:num>
   <w:num w:numId="4" w16cid:durableId="1092318485">
+    <w:abstractNumId w:val="10"/>
+  </w:num>
+  <w:num w:numId="5" w16cid:durableId="1329558205">
     <w:abstractNumId w:val="8"/>
   </w:num>
-  <w:num w:numId="5" w16cid:durableId="1329558205">
-    <w:abstractNumId w:val="6"/>
-  </w:num>
   <w:num w:numId="6" w16cid:durableId="1528325871">
-    <w:abstractNumId w:val="2"/>
+    <w:abstractNumId w:val="4"/>
   </w:num>
   <w:num w:numId="7" w16cid:durableId="310602293">
-    <w:abstractNumId w:val="4"/>
+    <w:abstractNumId w:val="6"/>
   </w:num>
   <w:num w:numId="8" w16cid:durableId="1331836114">
     <w:abstractNumId w:val="0"/>
   </w:num>
   <w:num w:numId="9" w16cid:durableId="1476486446">
+    <w:abstractNumId w:val="5"/>
+  </w:num>
+  <w:num w:numId="10" w16cid:durableId="1231766265">
     <w:abstractNumId w:val="3"/>
+  </w:num>
+  <w:num w:numId="11" w16cid:durableId="1849711242">
+    <w:abstractNumId w:val="2"/>
   </w:num>
 </w:numbering>
 </file>
@@ -11474,7 +13596,7 @@
   <w:style w:type="paragraph" w:default="1" w:styleId="Normal">
     <w:name w:val="Normal"/>
     <w:qFormat/>
-    <w:rsid w:val="00E07146"/>
+    <w:rsid w:val="00F042E3"/>
     <w:rPr>
       <w:rFonts w:ascii="Times New Roman" w:hAnsi="Times New Roman"/>
       <w:sz w:val="24"/>
@@ -11603,7 +13725,6 @@
   <w:style w:type="character" w:default="1" w:styleId="Fuentedeprrafopredeter">
     <w:name w:val="Default Paragraph Font"/>
     <w:uiPriority w:val="1"/>
-    <w:semiHidden/>
     <w:unhideWhenUsed/>
   </w:style>
   <w:style w:type="table" w:default="1" w:styleId="Tablanormal">
@@ -11921,6 +14042,18 @@
       <w:bCs/>
       <w:sz w:val="20"/>
       <w:szCs w:val="20"/>
+    </w:rPr>
+  </w:style>
+  <w:style w:type="paragraph" w:styleId="NormalWeb">
+    <w:name w:val="Normal (Web)"/>
+    <w:basedOn w:val="Normal"/>
+    <w:uiPriority w:val="99"/>
+    <w:semiHidden/>
+    <w:unhideWhenUsed/>
+    <w:rsid w:val="004861A0"/>
+    <w:rPr>
+      <w:rFonts w:cs="Times New Roman"/>
+      <w:szCs w:val="24"/>
     </w:rPr>
   </w:style>
 </w:styles>

</xml_diff>